<commit_message>
Linter fixes and other updates
</commit_message>
<xml_diff>
--- a/link/documentation/Signifyd LINK Integration Documentation 22.1.0.docx
+++ b/link/documentation/Signifyd LINK Integration Documentation 22.1.0.docx
@@ -56,7 +56,7 @@
         <w:rPr>
           <w:rFonts w:asciiTheme="majorHAnsi" w:hAnsiTheme="majorHAnsi"/>
         </w:rPr>
-        <w:t>4</w:t>
+        <w:t>5</w:t>
       </w:r>
       <w:r>
         <w:rPr>
@@ -236,7 +236,7 @@
           <w:r>
             <w:fldChar w:fldCharType="separate"/>
           </w:r>
-          <w:hyperlink w:anchor="_Toc207269090" w:history="1">
+          <w:hyperlink w:anchor="_Toc211501336" w:history="1">
             <w:r>
               <w:rPr>
                 <w:rStyle w:val="Hyperlink"/>
@@ -259,7 +259,7 @@
               <w:rPr>
                 <w:webHidden/>
               </w:rPr>
-              <w:instrText xml:space="preserve"> PAGEREF _Toc207269090 \h </w:instrText>
+              <w:instrText xml:space="preserve"> PAGEREF _Toc211501336 \h </w:instrText>
             </w:r>
             <w:r>
               <w:rPr>
@@ -297,7 +297,7 @@
               <w14:ligatures w14:val="standardContextual"/>
             </w:rPr>
           </w:pPr>
-          <w:hyperlink w:anchor="_Toc207269091" w:history="1">
+          <w:hyperlink w:anchor="_Toc211501337" w:history="1">
             <w:r>
               <w:rPr>
                 <w:rStyle w:val="Hyperlink"/>
@@ -320,7 +320,7 @@
               <w:rPr>
                 <w:webHidden/>
               </w:rPr>
-              <w:instrText xml:space="preserve"> PAGEREF _Toc207269091 \h </w:instrText>
+              <w:instrText xml:space="preserve"> PAGEREF _Toc211501337 \h </w:instrText>
             </w:r>
             <w:r>
               <w:rPr>
@@ -358,7 +358,7 @@
               <w14:ligatures w14:val="standardContextual"/>
             </w:rPr>
           </w:pPr>
-          <w:hyperlink w:anchor="_Toc207269092" w:history="1">
+          <w:hyperlink w:anchor="_Toc211501338" w:history="1">
             <w:r>
               <w:rPr>
                 <w:rStyle w:val="Hyperlink"/>
@@ -381,7 +381,7 @@
               <w:rPr>
                 <w:webHidden/>
               </w:rPr>
-              <w:instrText xml:space="preserve"> PAGEREF _Toc207269092 \h </w:instrText>
+              <w:instrText xml:space="preserve"> PAGEREF _Toc211501338 \h </w:instrText>
             </w:r>
             <w:r>
               <w:rPr>
@@ -419,7 +419,7 @@
               <w14:ligatures w14:val="standardContextual"/>
             </w:rPr>
           </w:pPr>
-          <w:hyperlink w:anchor="_Toc207269093" w:history="1">
+          <w:hyperlink w:anchor="_Toc211501339" w:history="1">
             <w:r>
               <w:rPr>
                 <w:rStyle w:val="Hyperlink"/>
@@ -442,7 +442,7 @@
               <w:rPr>
                 <w:webHidden/>
               </w:rPr>
-              <w:instrText xml:space="preserve"> PAGEREF _Toc207269093 \h </w:instrText>
+              <w:instrText xml:space="preserve"> PAGEREF _Toc211501339 \h </w:instrText>
             </w:r>
             <w:r>
               <w:rPr>
@@ -480,7 +480,7 @@
               <w14:ligatures w14:val="standardContextual"/>
             </w:rPr>
           </w:pPr>
-          <w:hyperlink w:anchor="_Toc207269094" w:history="1">
+          <w:hyperlink w:anchor="_Toc211501340" w:history="1">
             <w:r>
               <w:rPr>
                 <w:rStyle w:val="Hyperlink"/>
@@ -503,7 +503,7 @@
               <w:rPr>
                 <w:webHidden/>
               </w:rPr>
-              <w:instrText xml:space="preserve"> PAGEREF _Toc207269094 \h </w:instrText>
+              <w:instrText xml:space="preserve"> PAGEREF _Toc211501340 \h </w:instrText>
             </w:r>
             <w:r>
               <w:rPr>
@@ -541,7 +541,7 @@
               <w14:ligatures w14:val="standardContextual"/>
             </w:rPr>
           </w:pPr>
-          <w:hyperlink w:anchor="_Toc207269095" w:history="1">
+          <w:hyperlink w:anchor="_Toc211501341" w:history="1">
             <w:r>
               <w:rPr>
                 <w:rStyle w:val="Hyperlink"/>
@@ -564,7 +564,7 @@
               <w:rPr>
                 <w:webHidden/>
               </w:rPr>
-              <w:instrText xml:space="preserve"> PAGEREF _Toc207269095 \h </w:instrText>
+              <w:instrText xml:space="preserve"> PAGEREF _Toc211501341 \h </w:instrText>
             </w:r>
             <w:r>
               <w:rPr>
@@ -602,7 +602,7 @@
               <w14:ligatures w14:val="standardContextual"/>
             </w:rPr>
           </w:pPr>
-          <w:hyperlink w:anchor="_Toc207269096" w:history="1">
+          <w:hyperlink w:anchor="_Toc211501342" w:history="1">
             <w:r>
               <w:rPr>
                 <w:rStyle w:val="Hyperlink"/>
@@ -625,7 +625,7 @@
               <w:rPr>
                 <w:webHidden/>
               </w:rPr>
-              <w:instrText xml:space="preserve"> PAGEREF _Toc207269096 \h </w:instrText>
+              <w:instrText xml:space="preserve"> PAGEREF _Toc211501342 \h </w:instrText>
             </w:r>
             <w:r>
               <w:rPr>
@@ -663,7 +663,7 @@
               <w14:ligatures w14:val="standardContextual"/>
             </w:rPr>
           </w:pPr>
-          <w:hyperlink w:anchor="_Toc207269097" w:history="1">
+          <w:hyperlink w:anchor="_Toc211501343" w:history="1">
             <w:r>
               <w:rPr>
                 <w:rStyle w:val="Hyperlink"/>
@@ -686,7 +686,7 @@
               <w:rPr>
                 <w:webHidden/>
               </w:rPr>
-              <w:instrText xml:space="preserve"> PAGEREF _Toc207269097 \h </w:instrText>
+              <w:instrText xml:space="preserve"> PAGEREF _Toc211501343 \h </w:instrText>
             </w:r>
             <w:r>
               <w:rPr>
@@ -724,7 +724,7 @@
               <w14:ligatures w14:val="standardContextual"/>
             </w:rPr>
           </w:pPr>
-          <w:hyperlink w:anchor="_Toc207269098" w:history="1">
+          <w:hyperlink w:anchor="_Toc211501344" w:history="1">
             <w:r>
               <w:rPr>
                 <w:rStyle w:val="Hyperlink"/>
@@ -747,7 +747,7 @@
               <w:rPr>
                 <w:webHidden/>
               </w:rPr>
-              <w:instrText xml:space="preserve"> PAGEREF _Toc207269098 \h </w:instrText>
+              <w:instrText xml:space="preserve"> PAGEREF _Toc211501344 \h </w:instrText>
             </w:r>
             <w:r>
               <w:rPr>
@@ -785,7 +785,7 @@
               <w14:ligatures w14:val="standardContextual"/>
             </w:rPr>
           </w:pPr>
-          <w:hyperlink w:anchor="_Toc207269099" w:history="1">
+          <w:hyperlink w:anchor="_Toc211501345" w:history="1">
             <w:r>
               <w:rPr>
                 <w:rStyle w:val="Hyperlink"/>
@@ -808,7 +808,7 @@
               <w:rPr>
                 <w:webHidden/>
               </w:rPr>
-              <w:instrText xml:space="preserve"> PAGEREF _Toc207269099 \h </w:instrText>
+              <w:instrText xml:space="preserve"> PAGEREF _Toc211501345 \h </w:instrText>
             </w:r>
             <w:r>
               <w:rPr>
@@ -846,7 +846,7 @@
               <w14:ligatures w14:val="standardContextual"/>
             </w:rPr>
           </w:pPr>
-          <w:hyperlink w:anchor="_Toc207269100" w:history="1">
+          <w:hyperlink w:anchor="_Toc211501346" w:history="1">
             <w:r>
               <w:rPr>
                 <w:rStyle w:val="Hyperlink"/>
@@ -869,7 +869,7 @@
               <w:rPr>
                 <w:webHidden/>
               </w:rPr>
-              <w:instrText xml:space="preserve"> PAGEREF _Toc207269100 \h </w:instrText>
+              <w:instrText xml:space="preserve"> PAGEREF _Toc211501346 \h </w:instrText>
             </w:r>
             <w:r>
               <w:rPr>
@@ -907,7 +907,7 @@
               <w14:ligatures w14:val="standardContextual"/>
             </w:rPr>
           </w:pPr>
-          <w:hyperlink w:anchor="_Toc207269101" w:history="1">
+          <w:hyperlink w:anchor="_Toc211501347" w:history="1">
             <w:r>
               <w:rPr>
                 <w:rStyle w:val="Hyperlink"/>
@@ -930,7 +930,7 @@
               <w:rPr>
                 <w:webHidden/>
               </w:rPr>
-              <w:instrText xml:space="preserve"> PAGEREF _Toc207269101 \h </w:instrText>
+              <w:instrText xml:space="preserve"> PAGEREF _Toc211501347 \h </w:instrText>
             </w:r>
             <w:r>
               <w:rPr>
@@ -968,7 +968,7 @@
               <w14:ligatures w14:val="standardContextual"/>
             </w:rPr>
           </w:pPr>
-          <w:hyperlink w:anchor="_Toc207269102" w:history="1">
+          <w:hyperlink w:anchor="_Toc211501348" w:history="1">
             <w:r>
               <w:rPr>
                 <w:rStyle w:val="Hyperlink"/>
@@ -991,7 +991,7 @@
               <w:rPr>
                 <w:webHidden/>
               </w:rPr>
-              <w:instrText xml:space="preserve"> PAGEREF _Toc207269102 \h </w:instrText>
+              <w:instrText xml:space="preserve"> PAGEREF _Toc211501348 \h </w:instrText>
             </w:r>
             <w:r>
               <w:rPr>
@@ -1029,7 +1029,7 @@
               <w14:ligatures w14:val="standardContextual"/>
             </w:rPr>
           </w:pPr>
-          <w:hyperlink w:anchor="_Toc207269103" w:history="1">
+          <w:hyperlink w:anchor="_Toc211501349" w:history="1">
             <w:r>
               <w:rPr>
                 <w:rStyle w:val="Hyperlink"/>
@@ -1052,7 +1052,7 @@
               <w:rPr>
                 <w:webHidden/>
               </w:rPr>
-              <w:instrText xml:space="preserve"> PAGEREF _Toc207269103 \h </w:instrText>
+              <w:instrText xml:space="preserve"> PAGEREF _Toc211501349 \h </w:instrText>
             </w:r>
             <w:r>
               <w:rPr>
@@ -1090,7 +1090,7 @@
               <w14:ligatures w14:val="standardContextual"/>
             </w:rPr>
           </w:pPr>
-          <w:hyperlink w:anchor="_Toc207269104" w:history="1">
+          <w:hyperlink w:anchor="_Toc211501350" w:history="1">
             <w:r>
               <w:rPr>
                 <w:rStyle w:val="Hyperlink"/>
@@ -1113,7 +1113,7 @@
               <w:rPr>
                 <w:webHidden/>
               </w:rPr>
-              <w:instrText xml:space="preserve"> PAGEREF _Toc207269104 \h </w:instrText>
+              <w:instrText xml:space="preserve"> PAGEREF _Toc211501350 \h </w:instrText>
             </w:r>
             <w:r>
               <w:rPr>
@@ -1151,7 +1151,7 @@
               <w14:ligatures w14:val="standardContextual"/>
             </w:rPr>
           </w:pPr>
-          <w:hyperlink w:anchor="_Toc207269105" w:history="1">
+          <w:hyperlink w:anchor="_Toc211501351" w:history="1">
             <w:r>
               <w:rPr>
                 <w:rStyle w:val="Hyperlink"/>
@@ -1174,7 +1174,7 @@
               <w:rPr>
                 <w:webHidden/>
               </w:rPr>
-              <w:instrText xml:space="preserve"> PAGEREF _Toc207269105 \h </w:instrText>
+              <w:instrText xml:space="preserve"> PAGEREF _Toc211501351 \h </w:instrText>
             </w:r>
             <w:r>
               <w:rPr>
@@ -1212,7 +1212,7 @@
               <w14:ligatures w14:val="standardContextual"/>
             </w:rPr>
           </w:pPr>
-          <w:hyperlink w:anchor="_Toc207269106" w:history="1">
+          <w:hyperlink w:anchor="_Toc211501352" w:history="1">
             <w:r>
               <w:rPr>
                 <w:rStyle w:val="Hyperlink"/>
@@ -1235,7 +1235,7 @@
               <w:rPr>
                 <w:webHidden/>
               </w:rPr>
-              <w:instrText xml:space="preserve"> PAGEREF _Toc207269106 \h </w:instrText>
+              <w:instrText xml:space="preserve"> PAGEREF _Toc211501352 \h </w:instrText>
             </w:r>
             <w:r>
               <w:rPr>
@@ -1273,7 +1273,7 @@
               <w14:ligatures w14:val="standardContextual"/>
             </w:rPr>
           </w:pPr>
-          <w:hyperlink w:anchor="_Toc207269107" w:history="1">
+          <w:hyperlink w:anchor="_Toc211501353" w:history="1">
             <w:r>
               <w:rPr>
                 <w:rStyle w:val="Hyperlink"/>
@@ -1296,7 +1296,7 @@
               <w:rPr>
                 <w:webHidden/>
               </w:rPr>
-              <w:instrText xml:space="preserve"> PAGEREF _Toc207269107 \h </w:instrText>
+              <w:instrText xml:space="preserve"> PAGEREF _Toc211501353 \h </w:instrText>
             </w:r>
             <w:r>
               <w:rPr>
@@ -1334,7 +1334,7 @@
               <w14:ligatures w14:val="standardContextual"/>
             </w:rPr>
           </w:pPr>
-          <w:hyperlink w:anchor="_Toc207269108" w:history="1">
+          <w:hyperlink w:anchor="_Toc211501354" w:history="1">
             <w:r>
               <w:rPr>
                 <w:rStyle w:val="Hyperlink"/>
@@ -1357,7 +1357,7 @@
               <w:rPr>
                 <w:webHidden/>
               </w:rPr>
-              <w:instrText xml:space="preserve"> PAGEREF _Toc207269108 \h </w:instrText>
+              <w:instrText xml:space="preserve"> PAGEREF _Toc211501354 \h </w:instrText>
             </w:r>
             <w:r>
               <w:rPr>
@@ -1395,7 +1395,7 @@
               <w14:ligatures w14:val="standardContextual"/>
             </w:rPr>
           </w:pPr>
-          <w:hyperlink w:anchor="_Toc207269109" w:history="1">
+          <w:hyperlink w:anchor="_Toc211501355" w:history="1">
             <w:r>
               <w:rPr>
                 <w:rStyle w:val="Hyperlink"/>
@@ -1418,7 +1418,7 @@
               <w:rPr>
                 <w:webHidden/>
               </w:rPr>
-              <w:instrText xml:space="preserve"> PAGEREF _Toc207269109 \h </w:instrText>
+              <w:instrText xml:space="preserve"> PAGEREF _Toc211501355 \h </w:instrText>
             </w:r>
             <w:r>
               <w:rPr>
@@ -1456,7 +1456,7 @@
               <w14:ligatures w14:val="standardContextual"/>
             </w:rPr>
           </w:pPr>
-          <w:hyperlink w:anchor="_Toc207269110" w:history="1">
+          <w:hyperlink w:anchor="_Toc211501356" w:history="1">
             <w:r>
               <w:rPr>
                 <w:rStyle w:val="Hyperlink"/>
@@ -1479,7 +1479,7 @@
               <w:rPr>
                 <w:webHidden/>
               </w:rPr>
-              <w:instrText xml:space="preserve"> PAGEREF _Toc207269110 \h </w:instrText>
+              <w:instrText xml:space="preserve"> PAGEREF _Toc211501356 \h </w:instrText>
             </w:r>
             <w:r>
               <w:rPr>
@@ -1497,6 +1497,67 @@
                 <w:webHidden/>
               </w:rPr>
               <w:t>12</w:t>
+            </w:r>
+            <w:r>
+              <w:rPr>
+                <w:webHidden/>
+              </w:rPr>
+              <w:fldChar w:fldCharType="end"/>
+            </w:r>
+          </w:hyperlink>
+        </w:p>
+        <w:p>
+          <w:pPr>
+            <w:pStyle w:val="Sumrio3"/>
+            <w:rPr>
+              <w:kern w:val="2"/>
+              <w:sz w:val="24"/>
+              <w:szCs w:val="24"/>
+              <w:lang w:val="pt-BR" w:eastAsia="pt-BR"/>
+              <w14:ligatures w14:val="standardContextual"/>
+            </w:rPr>
+          </w:pPr>
+          <w:hyperlink w:anchor="_Toc211501357" w:history="1">
+            <w:r>
+              <w:rPr>
+                <w:rStyle w:val="Hyperlink"/>
+              </w:rPr>
+              <w:t>4.1.11 Order notes</w:t>
+            </w:r>
+            <w:r>
+              <w:rPr>
+                <w:webHidden/>
+              </w:rPr>
+              <w:tab/>
+            </w:r>
+            <w:r>
+              <w:rPr>
+                <w:webHidden/>
+              </w:rPr>
+              <w:fldChar w:fldCharType="begin"/>
+            </w:r>
+            <w:r>
+              <w:rPr>
+                <w:webHidden/>
+              </w:rPr>
+              <w:instrText xml:space="preserve"> PAGEREF _Toc211501357 \h </w:instrText>
+            </w:r>
+            <w:r>
+              <w:rPr>
+                <w:webHidden/>
+              </w:rPr>
+            </w:r>
+            <w:r>
+              <w:rPr>
+                <w:webHidden/>
+              </w:rPr>
+              <w:fldChar w:fldCharType="separate"/>
+            </w:r>
+            <w:r>
+              <w:rPr>
+                <w:webHidden/>
+              </w:rPr>
+              <w:t>13</w:t>
             </w:r>
             <w:r>
               <w:rPr>
@@ -1517,7 +1578,7 @@
               <w14:ligatures w14:val="standardContextual"/>
             </w:rPr>
           </w:pPr>
-          <w:hyperlink w:anchor="_Toc207269111" w:history="1">
+          <w:hyperlink w:anchor="_Toc211501358" w:history="1">
             <w:r>
               <w:rPr>
                 <w:rStyle w:val="Hyperlink"/>
@@ -1540,7 +1601,7 @@
               <w:rPr>
                 <w:webHidden/>
               </w:rPr>
-              <w:instrText xml:space="preserve"> PAGEREF _Toc207269111 \h </w:instrText>
+              <w:instrText xml:space="preserve"> PAGEREF _Toc211501358 \h </w:instrText>
             </w:r>
             <w:r>
               <w:rPr>
@@ -1578,7 +1639,7 @@
               <w14:ligatures w14:val="standardContextual"/>
             </w:rPr>
           </w:pPr>
-          <w:hyperlink w:anchor="_Toc207269112" w:history="1">
+          <w:hyperlink w:anchor="_Toc211501359" w:history="1">
             <w:r>
               <w:rPr>
                 <w:rStyle w:val="Hyperlink"/>
@@ -1601,7 +1662,7 @@
               <w:rPr>
                 <w:webHidden/>
               </w:rPr>
-              <w:instrText xml:space="preserve"> PAGEREF _Toc207269112 \h </w:instrText>
+              <w:instrText xml:space="preserve"> PAGEREF _Toc211501359 \h </w:instrText>
             </w:r>
             <w:r>
               <w:rPr>
@@ -1639,7 +1700,7 @@
               <w14:ligatures w14:val="standardContextual"/>
             </w:rPr>
           </w:pPr>
-          <w:hyperlink w:anchor="_Toc207269113" w:history="1">
+          <w:hyperlink w:anchor="_Toc211501360" w:history="1">
             <w:r>
               <w:rPr>
                 <w:rStyle w:val="Hyperlink"/>
@@ -1662,7 +1723,7 @@
               <w:rPr>
                 <w:webHidden/>
               </w:rPr>
-              <w:instrText xml:space="preserve"> PAGEREF _Toc207269113 \h </w:instrText>
+              <w:instrText xml:space="preserve"> PAGEREF _Toc211501360 \h </w:instrText>
             </w:r>
             <w:r>
               <w:rPr>
@@ -1700,7 +1761,7 @@
               <w14:ligatures w14:val="standardContextual"/>
             </w:rPr>
           </w:pPr>
-          <w:hyperlink w:anchor="_Toc207269114" w:history="1">
+          <w:hyperlink w:anchor="_Toc211501361" w:history="1">
             <w:r>
               <w:rPr>
                 <w:rStyle w:val="Hyperlink"/>
@@ -1723,7 +1784,7 @@
               <w:rPr>
                 <w:webHidden/>
               </w:rPr>
-              <w:instrText xml:space="preserve"> PAGEREF _Toc207269114 \h </w:instrText>
+              <w:instrText xml:space="preserve"> PAGEREF _Toc211501361 \h </w:instrText>
             </w:r>
             <w:r>
               <w:rPr>
@@ -1761,7 +1822,7 @@
               <w14:ligatures w14:val="standardContextual"/>
             </w:rPr>
           </w:pPr>
-          <w:hyperlink w:anchor="_Toc207269115" w:history="1">
+          <w:hyperlink w:anchor="_Toc211501362" w:history="1">
             <w:r>
               <w:rPr>
                 <w:rStyle w:val="Hyperlink"/>
@@ -1772,13 +1833,7 @@
               <w:rPr>
                 <w:rStyle w:val="Hyperlink"/>
               </w:rPr>
-              <w:t>………………</w:t>
-            </w:r>
-            <w:r>
-              <w:rPr>
-                <w:webHidden/>
-              </w:rPr>
-              <w:tab/>
+              <w:t>………………………………………………………………………………………………………..</w:t>
             </w:r>
             <w:r>
               <w:rPr>
@@ -1790,7 +1845,7 @@
               <w:rPr>
                 <w:webHidden/>
               </w:rPr>
-              <w:instrText xml:space="preserve"> PAGEREF _Toc207269115 \h </w:instrText>
+              <w:instrText xml:space="preserve"> PAGEREF _Toc211501362 \h </w:instrText>
             </w:r>
             <w:r>
               <w:rPr>
@@ -1828,7 +1883,7 @@
               <w14:ligatures w14:val="standardContextual"/>
             </w:rPr>
           </w:pPr>
-          <w:hyperlink w:anchor="_Toc207269116" w:history="1">
+          <w:hyperlink w:anchor="_Toc211501363" w:history="1">
             <w:r>
               <w:rPr>
                 <w:rStyle w:val="Hyperlink"/>
@@ -1851,7 +1906,7 @@
               <w:rPr>
                 <w:webHidden/>
               </w:rPr>
-              <w:instrText xml:space="preserve"> PAGEREF _Toc207269116 \h </w:instrText>
+              <w:instrText xml:space="preserve"> PAGEREF _Toc211501363 \h </w:instrText>
             </w:r>
             <w:r>
               <w:rPr>
@@ -1889,7 +1944,7 @@
               <w14:ligatures w14:val="standardContextual"/>
             </w:rPr>
           </w:pPr>
-          <w:hyperlink w:anchor="_Toc207269117" w:history="1">
+          <w:hyperlink w:anchor="_Toc211501364" w:history="1">
             <w:r>
               <w:rPr>
                 <w:rStyle w:val="Hyperlink"/>
@@ -1912,7 +1967,7 @@
               <w:rPr>
                 <w:webHidden/>
               </w:rPr>
-              <w:instrText xml:space="preserve"> PAGEREF _Toc207269117 \h </w:instrText>
+              <w:instrText xml:space="preserve"> PAGEREF _Toc211501364 \h </w:instrText>
             </w:r>
             <w:r>
               <w:rPr>
@@ -1950,7 +2005,7 @@
               <w14:ligatures w14:val="standardContextual"/>
             </w:rPr>
           </w:pPr>
-          <w:hyperlink w:anchor="_Toc207269118" w:history="1">
+          <w:hyperlink w:anchor="_Toc211501365" w:history="1">
             <w:r>
               <w:rPr>
                 <w:rStyle w:val="Hyperlink"/>
@@ -1973,7 +2028,7 @@
               <w:rPr>
                 <w:webHidden/>
               </w:rPr>
-              <w:instrText xml:space="preserve"> PAGEREF _Toc207269118 \h </w:instrText>
+              <w:instrText xml:space="preserve"> PAGEREF _Toc211501365 \h </w:instrText>
             </w:r>
             <w:r>
               <w:rPr>
@@ -1990,7 +2045,7 @@
               <w:rPr>
                 <w:webHidden/>
               </w:rPr>
-              <w:t>17</w:t>
+              <w:t>18</w:t>
             </w:r>
             <w:r>
               <w:rPr>
@@ -2011,7 +2066,7 @@
               <w14:ligatures w14:val="standardContextual"/>
             </w:rPr>
           </w:pPr>
-          <w:hyperlink w:anchor="_Toc207269119" w:history="1">
+          <w:hyperlink w:anchor="_Toc211501366" w:history="1">
             <w:r>
               <w:rPr>
                 <w:rStyle w:val="Hyperlink"/>
@@ -2034,7 +2089,7 @@
               <w:rPr>
                 <w:webHidden/>
               </w:rPr>
-              <w:instrText xml:space="preserve"> PAGEREF _Toc207269119 \h </w:instrText>
+              <w:instrText xml:space="preserve"> PAGEREF _Toc211501366 \h </w:instrText>
             </w:r>
             <w:r>
               <w:rPr>
@@ -2072,7 +2127,7 @@
               <w14:ligatures w14:val="standardContextual"/>
             </w:rPr>
           </w:pPr>
-          <w:hyperlink w:anchor="_Toc207269120" w:history="1">
+          <w:hyperlink w:anchor="_Toc211501367" w:history="1">
             <w:r>
               <w:rPr>
                 <w:rStyle w:val="Hyperlink"/>
@@ -2095,7 +2150,7 @@
               <w:rPr>
                 <w:webHidden/>
               </w:rPr>
-              <w:instrText xml:space="preserve"> PAGEREF _Toc207269120 \h </w:instrText>
+              <w:instrText xml:space="preserve"> PAGEREF _Toc211501367 \h </w:instrText>
             </w:r>
             <w:r>
               <w:rPr>
@@ -2133,7 +2188,7 @@
               <w14:ligatures w14:val="standardContextual"/>
             </w:rPr>
           </w:pPr>
-          <w:hyperlink w:anchor="_Toc207269121" w:history="1">
+          <w:hyperlink w:anchor="_Toc211501368" w:history="1">
             <w:r>
               <w:rPr>
                 <w:rStyle w:val="Hyperlink"/>
@@ -2156,7 +2211,7 @@
               <w:rPr>
                 <w:webHidden/>
               </w:rPr>
-              <w:instrText xml:space="preserve"> PAGEREF _Toc207269121 \h </w:instrText>
+              <w:instrText xml:space="preserve"> PAGEREF _Toc211501368 \h </w:instrText>
             </w:r>
             <w:r>
               <w:rPr>
@@ -2194,7 +2249,7 @@
               <w14:ligatures w14:val="standardContextual"/>
             </w:rPr>
           </w:pPr>
-          <w:hyperlink w:anchor="_Toc207269122" w:history="1">
+          <w:hyperlink w:anchor="_Toc211501369" w:history="1">
             <w:r>
               <w:rPr>
                 <w:rStyle w:val="Hyperlink"/>
@@ -2217,7 +2272,7 @@
               <w:rPr>
                 <w:webHidden/>
               </w:rPr>
-              <w:instrText xml:space="preserve"> PAGEREF _Toc207269122 \h </w:instrText>
+              <w:instrText xml:space="preserve"> PAGEREF _Toc211501369 \h </w:instrText>
             </w:r>
             <w:r>
               <w:rPr>
@@ -2255,7 +2310,7 @@
               <w14:ligatures w14:val="standardContextual"/>
             </w:rPr>
           </w:pPr>
-          <w:hyperlink w:anchor="_Toc207269123" w:history="1">
+          <w:hyperlink w:anchor="_Toc211501370" w:history="1">
             <w:r>
               <w:rPr>
                 <w:rStyle w:val="Hyperlink"/>
@@ -2278,7 +2333,7 @@
               <w:rPr>
                 <w:webHidden/>
               </w:rPr>
-              <w:instrText xml:space="preserve"> PAGEREF _Toc207269123 \h </w:instrText>
+              <w:instrText xml:space="preserve"> PAGEREF _Toc211501370 \h </w:instrText>
             </w:r>
             <w:r>
               <w:rPr>
@@ -2295,7 +2350,7 @@
               <w:rPr>
                 <w:webHidden/>
               </w:rPr>
-              <w:t>21</w:t>
+              <w:t>22</w:t>
             </w:r>
             <w:r>
               <w:rPr>
@@ -2316,7 +2371,7 @@
               <w14:ligatures w14:val="standardContextual"/>
             </w:rPr>
           </w:pPr>
-          <w:hyperlink w:anchor="_Toc207269124" w:history="1">
+          <w:hyperlink w:anchor="_Toc211501371" w:history="1">
             <w:r>
               <w:rPr>
                 <w:rStyle w:val="Hyperlink"/>
@@ -2339,7 +2394,7 @@
               <w:rPr>
                 <w:webHidden/>
               </w:rPr>
-              <w:instrText xml:space="preserve"> PAGEREF _Toc207269124 \h </w:instrText>
+              <w:instrText xml:space="preserve"> PAGEREF _Toc211501371 \h </w:instrText>
             </w:r>
             <w:r>
               <w:rPr>
@@ -2356,7 +2411,7 @@
               <w:rPr>
                 <w:webHidden/>
               </w:rPr>
-              <w:t>21</w:t>
+              <w:t>22</w:t>
             </w:r>
             <w:r>
               <w:rPr>
@@ -2377,7 +2432,7 @@
               <w14:ligatures w14:val="standardContextual"/>
             </w:rPr>
           </w:pPr>
-          <w:hyperlink w:anchor="_Toc207269125" w:history="1">
+          <w:hyperlink w:anchor="_Toc211501372" w:history="1">
             <w:r>
               <w:rPr>
                 <w:rStyle w:val="Hyperlink"/>
@@ -2400,7 +2455,7 @@
               <w:rPr>
                 <w:webHidden/>
               </w:rPr>
-              <w:instrText xml:space="preserve"> PAGEREF _Toc207269125 \h </w:instrText>
+              <w:instrText xml:space="preserve"> PAGEREF _Toc211501372 \h </w:instrText>
             </w:r>
             <w:r>
               <w:rPr>
@@ -2417,7 +2472,7 @@
               <w:rPr>
                 <w:webHidden/>
               </w:rPr>
-              <w:t>22</w:t>
+              <w:t>23</w:t>
             </w:r>
             <w:r>
               <w:rPr>
@@ -2438,7 +2493,7 @@
               <w14:ligatures w14:val="standardContextual"/>
             </w:rPr>
           </w:pPr>
-          <w:hyperlink w:anchor="_Toc207269126" w:history="1">
+          <w:hyperlink w:anchor="_Toc211501373" w:history="1">
             <w:r>
               <w:rPr>
                 <w:rStyle w:val="Hyperlink"/>
@@ -2461,7 +2516,7 @@
               <w:rPr>
                 <w:webHidden/>
               </w:rPr>
-              <w:instrText xml:space="preserve"> PAGEREF _Toc207269126 \h </w:instrText>
+              <w:instrText xml:space="preserve"> PAGEREF _Toc211501373 \h </w:instrText>
             </w:r>
             <w:r>
               <w:rPr>
@@ -2478,7 +2533,7 @@
               <w:rPr>
                 <w:webHidden/>
               </w:rPr>
-              <w:t>23</w:t>
+              <w:t>24</w:t>
             </w:r>
             <w:r>
               <w:rPr>
@@ -2499,7 +2554,7 @@
               <w14:ligatures w14:val="standardContextual"/>
             </w:rPr>
           </w:pPr>
-          <w:hyperlink w:anchor="_Toc207269127" w:history="1">
+          <w:hyperlink w:anchor="_Toc211501374" w:history="1">
             <w:r>
               <w:rPr>
                 <w:rStyle w:val="Hyperlink"/>
@@ -2522,7 +2577,7 @@
               <w:rPr>
                 <w:webHidden/>
               </w:rPr>
-              <w:instrText xml:space="preserve"> PAGEREF _Toc207269127 \h </w:instrText>
+              <w:instrText xml:space="preserve"> PAGEREF _Toc211501374 \h </w:instrText>
             </w:r>
             <w:r>
               <w:rPr>
@@ -2539,7 +2594,7 @@
               <w:rPr>
                 <w:webHidden/>
               </w:rPr>
-              <w:t>23</w:t>
+              <w:t>24</w:t>
             </w:r>
             <w:r>
               <w:rPr>
@@ -2560,7 +2615,7 @@
               <w14:ligatures w14:val="standardContextual"/>
             </w:rPr>
           </w:pPr>
-          <w:hyperlink w:anchor="_Toc207269128" w:history="1">
+          <w:hyperlink w:anchor="_Toc211501375" w:history="1">
             <w:r>
               <w:rPr>
                 <w:rStyle w:val="Hyperlink"/>
@@ -2583,7 +2638,7 @@
               <w:rPr>
                 <w:webHidden/>
               </w:rPr>
-              <w:instrText xml:space="preserve"> PAGEREF _Toc207269128 \h </w:instrText>
+              <w:instrText xml:space="preserve"> PAGEREF _Toc211501375 \h </w:instrText>
             </w:r>
             <w:r>
               <w:rPr>
@@ -2600,7 +2655,7 @@
               <w:rPr>
                 <w:webHidden/>
               </w:rPr>
-              <w:t>24</w:t>
+              <w:t>25</w:t>
             </w:r>
             <w:r>
               <w:rPr>
@@ -2621,7 +2676,7 @@
               <w14:ligatures w14:val="standardContextual"/>
             </w:rPr>
           </w:pPr>
-          <w:hyperlink w:anchor="_Toc207269129" w:history="1">
+          <w:hyperlink w:anchor="_Toc211501376" w:history="1">
             <w:r>
               <w:rPr>
                 <w:rStyle w:val="Hyperlink"/>
@@ -2644,7 +2699,7 @@
               <w:rPr>
                 <w:webHidden/>
               </w:rPr>
-              <w:instrText xml:space="preserve"> PAGEREF _Toc207269129 \h </w:instrText>
+              <w:instrText xml:space="preserve"> PAGEREF _Toc211501376 \h </w:instrText>
             </w:r>
             <w:r>
               <w:rPr>
@@ -2661,7 +2716,7 @@
               <w:rPr>
                 <w:webHidden/>
               </w:rPr>
-              <w:t>24</w:t>
+              <w:t>25</w:t>
             </w:r>
             <w:r>
               <w:rPr>
@@ -2682,7 +2737,7 @@
               <w14:ligatures w14:val="standardContextual"/>
             </w:rPr>
           </w:pPr>
-          <w:hyperlink w:anchor="_Toc207269130" w:history="1">
+          <w:hyperlink w:anchor="_Toc211501377" w:history="1">
             <w:r>
               <w:rPr>
                 <w:rStyle w:val="Hyperlink"/>
@@ -2705,7 +2760,7 @@
               <w:rPr>
                 <w:webHidden/>
               </w:rPr>
-              <w:instrText xml:space="preserve"> PAGEREF _Toc207269130 \h </w:instrText>
+              <w:instrText xml:space="preserve"> PAGEREF _Toc211501377 \h </w:instrText>
             </w:r>
             <w:r>
               <w:rPr>
@@ -2722,7 +2777,7 @@
               <w:rPr>
                 <w:webHidden/>
               </w:rPr>
-              <w:t>25</w:t>
+              <w:t>26</w:t>
             </w:r>
             <w:r>
               <w:rPr>
@@ -2743,7 +2798,7 @@
               <w14:ligatures w14:val="standardContextual"/>
             </w:rPr>
           </w:pPr>
-          <w:hyperlink w:anchor="_Toc207269131" w:history="1">
+          <w:hyperlink w:anchor="_Toc211501378" w:history="1">
             <w:r>
               <w:rPr>
                 <w:rStyle w:val="Hyperlink"/>
@@ -2766,7 +2821,7 @@
               <w:rPr>
                 <w:webHidden/>
               </w:rPr>
-              <w:instrText xml:space="preserve"> PAGEREF _Toc207269131 \h </w:instrText>
+              <w:instrText xml:space="preserve"> PAGEREF _Toc211501378 \h </w:instrText>
             </w:r>
             <w:r>
               <w:rPr>
@@ -2783,7 +2838,7 @@
               <w:rPr>
                 <w:webHidden/>
               </w:rPr>
-              <w:t>26</w:t>
+              <w:t>27</w:t>
             </w:r>
             <w:r>
               <w:rPr>
@@ -2804,7 +2859,7 @@
               <w14:ligatures w14:val="standardContextual"/>
             </w:rPr>
           </w:pPr>
-          <w:hyperlink w:anchor="_Toc207269132" w:history="1">
+          <w:hyperlink w:anchor="_Toc211501379" w:history="1">
             <w:r>
               <w:rPr>
                 <w:rStyle w:val="Hyperlink"/>
@@ -2827,7 +2882,7 @@
               <w:rPr>
                 <w:webHidden/>
               </w:rPr>
-              <w:instrText xml:space="preserve"> PAGEREF _Toc207269132 \h </w:instrText>
+              <w:instrText xml:space="preserve"> PAGEREF _Toc211501379 \h </w:instrText>
             </w:r>
             <w:r>
               <w:rPr>
@@ -2844,7 +2899,7 @@
               <w:rPr>
                 <w:webHidden/>
               </w:rPr>
-              <w:t>26</w:t>
+              <w:t>27</w:t>
             </w:r>
             <w:r>
               <w:rPr>
@@ -2865,7 +2920,7 @@
               <w14:ligatures w14:val="standardContextual"/>
             </w:rPr>
           </w:pPr>
-          <w:hyperlink w:anchor="_Toc207269133" w:history="1">
+          <w:hyperlink w:anchor="_Toc211501380" w:history="1">
             <w:r>
               <w:rPr>
                 <w:rStyle w:val="Hyperlink"/>
@@ -2888,7 +2943,7 @@
               <w:rPr>
                 <w:webHidden/>
               </w:rPr>
-              <w:instrText xml:space="preserve"> PAGEREF _Toc207269133 \h </w:instrText>
+              <w:instrText xml:space="preserve"> PAGEREF _Toc211501380 \h </w:instrText>
             </w:r>
             <w:r>
               <w:rPr>
@@ -2905,7 +2960,7 @@
               <w:rPr>
                 <w:webHidden/>
               </w:rPr>
-              <w:t>26</w:t>
+              <w:t>27</w:t>
             </w:r>
             <w:r>
               <w:rPr>
@@ -2926,7 +2981,7 @@
               <w14:ligatures w14:val="standardContextual"/>
             </w:rPr>
           </w:pPr>
-          <w:hyperlink w:anchor="_Toc207269134" w:history="1">
+          <w:hyperlink w:anchor="_Toc211501381" w:history="1">
             <w:r>
               <w:rPr>
                 <w:rStyle w:val="Hyperlink"/>
@@ -2949,7 +3004,7 @@
               <w:rPr>
                 <w:webHidden/>
               </w:rPr>
-              <w:instrText xml:space="preserve"> PAGEREF _Toc207269134 \h </w:instrText>
+              <w:instrText xml:space="preserve"> PAGEREF _Toc211501381 \h </w:instrText>
             </w:r>
             <w:r>
               <w:rPr>
@@ -2966,7 +3021,7 @@
               <w:rPr>
                 <w:webHidden/>
               </w:rPr>
-              <w:t>27</w:t>
+              <w:t>28</w:t>
             </w:r>
             <w:r>
               <w:rPr>
@@ -2987,7 +3042,7 @@
               <w14:ligatures w14:val="standardContextual"/>
             </w:rPr>
           </w:pPr>
-          <w:hyperlink w:anchor="_Toc207269135" w:history="1">
+          <w:hyperlink w:anchor="_Toc211501382" w:history="1">
             <w:r>
               <w:rPr>
                 <w:rStyle w:val="Hyperlink"/>
@@ -3010,7 +3065,7 @@
               <w:rPr>
                 <w:webHidden/>
               </w:rPr>
-              <w:instrText xml:space="preserve"> PAGEREF _Toc207269135 \h </w:instrText>
+              <w:instrText xml:space="preserve"> PAGEREF _Toc211501382 \h </w:instrText>
             </w:r>
             <w:r>
               <w:rPr>
@@ -3027,7 +3082,7 @@
               <w:rPr>
                 <w:webHidden/>
               </w:rPr>
-              <w:t>28</w:t>
+              <w:t>29</w:t>
             </w:r>
             <w:r>
               <w:rPr>
@@ -3048,7 +3103,7 @@
               <w14:ligatures w14:val="standardContextual"/>
             </w:rPr>
           </w:pPr>
-          <w:hyperlink w:anchor="_Toc207269136" w:history="1">
+          <w:hyperlink w:anchor="_Toc211501383" w:history="1">
             <w:r>
               <w:rPr>
                 <w:rStyle w:val="Hyperlink"/>
@@ -3072,7 +3127,7 @@
               <w:rPr>
                 <w:webHidden/>
               </w:rPr>
-              <w:instrText xml:space="preserve"> PAGEREF _Toc207269136 \h </w:instrText>
+              <w:instrText xml:space="preserve"> PAGEREF _Toc211501383 \h </w:instrText>
             </w:r>
             <w:r>
               <w:rPr>
@@ -3089,7 +3144,7 @@
               <w:rPr>
                 <w:webHidden/>
               </w:rPr>
-              <w:t>28</w:t>
+              <w:t>29</w:t>
             </w:r>
             <w:r>
               <w:rPr>
@@ -3110,7 +3165,7 @@
               <w14:ligatures w14:val="standardContextual"/>
             </w:rPr>
           </w:pPr>
-          <w:hyperlink w:anchor="_Toc207269137" w:history="1">
+          <w:hyperlink w:anchor="_Toc211501384" w:history="1">
             <w:r>
               <w:rPr>
                 <w:rStyle w:val="Hyperlink"/>
@@ -3133,7 +3188,7 @@
               <w:rPr>
                 <w:webHidden/>
               </w:rPr>
-              <w:instrText xml:space="preserve"> PAGEREF _Toc207269137 \h </w:instrText>
+              <w:instrText xml:space="preserve"> PAGEREF _Toc211501384 \h </w:instrText>
             </w:r>
             <w:r>
               <w:rPr>
@@ -3150,7 +3205,7 @@
               <w:rPr>
                 <w:webHidden/>
               </w:rPr>
-              <w:t>29</w:t>
+              <w:t>30</w:t>
             </w:r>
             <w:r>
               <w:rPr>
@@ -3171,7 +3226,7 @@
               <w14:ligatures w14:val="standardContextual"/>
             </w:rPr>
           </w:pPr>
-          <w:hyperlink w:anchor="_Toc207269138" w:history="1">
+          <w:hyperlink w:anchor="_Toc211501385" w:history="1">
             <w:r>
               <w:rPr>
                 <w:rStyle w:val="Hyperlink"/>
@@ -3195,7 +3250,7 @@
               <w:rPr>
                 <w:webHidden/>
               </w:rPr>
-              <w:instrText xml:space="preserve"> PAGEREF _Toc207269138 \h </w:instrText>
+              <w:instrText xml:space="preserve"> PAGEREF _Toc211501385 \h </w:instrText>
             </w:r>
             <w:r>
               <w:rPr>
@@ -3212,7 +3267,7 @@
               <w:rPr>
                 <w:webHidden/>
               </w:rPr>
-              <w:t>29</w:t>
+              <w:t>30</w:t>
             </w:r>
             <w:r>
               <w:rPr>
@@ -3233,7 +3288,7 @@
               <w14:ligatures w14:val="standardContextual"/>
             </w:rPr>
           </w:pPr>
-          <w:hyperlink w:anchor="_Toc207269139" w:history="1">
+          <w:hyperlink w:anchor="_Toc211501386" w:history="1">
             <w:r>
               <w:rPr>
                 <w:rStyle w:val="Hyperlink"/>
@@ -3257,7 +3312,7 @@
               <w:rPr>
                 <w:webHidden/>
               </w:rPr>
-              <w:instrText xml:space="preserve"> PAGEREF _Toc207269139 \h </w:instrText>
+              <w:instrText xml:space="preserve"> PAGEREF _Toc211501386 \h </w:instrText>
             </w:r>
             <w:r>
               <w:rPr>
@@ -3274,7 +3329,7 @@
               <w:rPr>
                 <w:webHidden/>
               </w:rPr>
-              <w:t>29</w:t>
+              <w:t>30</w:t>
             </w:r>
             <w:r>
               <w:rPr>
@@ -3295,7 +3350,7 @@
               <w14:ligatures w14:val="standardContextual"/>
             </w:rPr>
           </w:pPr>
-          <w:hyperlink w:anchor="_Toc207269140" w:history="1">
+          <w:hyperlink w:anchor="_Toc211501387" w:history="1">
             <w:r>
               <w:rPr>
                 <w:rStyle w:val="Hyperlink"/>
@@ -3319,7 +3374,7 @@
               <w:rPr>
                 <w:webHidden/>
               </w:rPr>
-              <w:instrText xml:space="preserve"> PAGEREF _Toc207269140 \h </w:instrText>
+              <w:instrText xml:space="preserve"> PAGEREF _Toc211501387 \h </w:instrText>
             </w:r>
             <w:r>
               <w:rPr>
@@ -3336,7 +3391,7 @@
               <w:rPr>
                 <w:webHidden/>
               </w:rPr>
-              <w:t>29</w:t>
+              <w:t>30</w:t>
             </w:r>
             <w:r>
               <w:rPr>
@@ -3357,7 +3412,7 @@
               <w14:ligatures w14:val="standardContextual"/>
             </w:rPr>
           </w:pPr>
-          <w:hyperlink w:anchor="_Toc207269141" w:history="1">
+          <w:hyperlink w:anchor="_Toc211501388" w:history="1">
             <w:r>
               <w:rPr>
                 <w:rStyle w:val="Hyperlink"/>
@@ -3381,7 +3436,7 @@
               <w:rPr>
                 <w:webHidden/>
               </w:rPr>
-              <w:instrText xml:space="preserve"> PAGEREF _Toc207269141 \h </w:instrText>
+              <w:instrText xml:space="preserve"> PAGEREF _Toc211501388 \h </w:instrText>
             </w:r>
             <w:r>
               <w:rPr>
@@ -3398,7 +3453,7 @@
               <w:rPr>
                 <w:webHidden/>
               </w:rPr>
-              <w:t>29</w:t>
+              <w:t>30</w:t>
             </w:r>
             <w:r>
               <w:rPr>
@@ -3419,7 +3474,7 @@
               <w14:ligatures w14:val="standardContextual"/>
             </w:rPr>
           </w:pPr>
-          <w:hyperlink w:anchor="_Toc207269142" w:history="1">
+          <w:hyperlink w:anchor="_Toc211501389" w:history="1">
             <w:r>
               <w:rPr>
                 <w:rStyle w:val="Hyperlink"/>
@@ -3443,7 +3498,7 @@
               <w:rPr>
                 <w:webHidden/>
               </w:rPr>
-              <w:instrText xml:space="preserve"> PAGEREF _Toc207269142 \h </w:instrText>
+              <w:instrText xml:space="preserve"> PAGEREF _Toc211501389 \h </w:instrText>
             </w:r>
             <w:r>
               <w:rPr>
@@ -3460,7 +3515,7 @@
               <w:rPr>
                 <w:webHidden/>
               </w:rPr>
-              <w:t>30</w:t>
+              <w:t>31</w:t>
             </w:r>
             <w:r>
               <w:rPr>
@@ -3481,7 +3536,7 @@
               <w14:ligatures w14:val="standardContextual"/>
             </w:rPr>
           </w:pPr>
-          <w:hyperlink w:anchor="_Toc207269143" w:history="1">
+          <w:hyperlink w:anchor="_Toc211501390" w:history="1">
             <w:r>
               <w:rPr>
                 <w:rStyle w:val="Hyperlink"/>
@@ -3504,7 +3559,7 @@
               <w:rPr>
                 <w:webHidden/>
               </w:rPr>
-              <w:instrText xml:space="preserve"> PAGEREF _Toc207269143 \h </w:instrText>
+              <w:instrText xml:space="preserve"> PAGEREF _Toc211501390 \h </w:instrText>
             </w:r>
             <w:r>
               <w:rPr>
@@ -3521,7 +3576,7 @@
               <w:rPr>
                 <w:webHidden/>
               </w:rPr>
-              <w:t>30</w:t>
+              <w:t>31</w:t>
             </w:r>
             <w:r>
               <w:rPr>
@@ -3542,7 +3597,7 @@
               <w14:ligatures w14:val="standardContextual"/>
             </w:rPr>
           </w:pPr>
-          <w:hyperlink w:anchor="_Toc207269144" w:history="1">
+          <w:hyperlink w:anchor="_Toc211501391" w:history="1">
             <w:r>
               <w:rPr>
                 <w:rStyle w:val="Hyperlink"/>
@@ -3565,7 +3620,7 @@
               <w:rPr>
                 <w:webHidden/>
               </w:rPr>
-              <w:instrText xml:space="preserve"> PAGEREF _Toc207269144 \h </w:instrText>
+              <w:instrText xml:space="preserve"> PAGEREF _Toc211501391 \h </w:instrText>
             </w:r>
             <w:r>
               <w:rPr>
@@ -3582,7 +3637,7 @@
               <w:rPr>
                 <w:webHidden/>
               </w:rPr>
-              <w:t>30</w:t>
+              <w:t>31</w:t>
             </w:r>
             <w:r>
               <w:rPr>
@@ -3603,7 +3658,7 @@
               <w14:ligatures w14:val="standardContextual"/>
             </w:rPr>
           </w:pPr>
-          <w:hyperlink w:anchor="_Toc207269145" w:history="1">
+          <w:hyperlink w:anchor="_Toc211501392" w:history="1">
             <w:r>
               <w:rPr>
                 <w:rStyle w:val="Hyperlink"/>
@@ -3626,7 +3681,7 @@
               <w:rPr>
                 <w:webHidden/>
               </w:rPr>
-              <w:instrText xml:space="preserve"> PAGEREF _Toc207269145 \h </w:instrText>
+              <w:instrText xml:space="preserve"> PAGEREF _Toc211501392 \h </w:instrText>
             </w:r>
             <w:r>
               <w:rPr>
@@ -3643,7 +3698,7 @@
               <w:rPr>
                 <w:webHidden/>
               </w:rPr>
-              <w:t>30</w:t>
+              <w:t>31</w:t>
             </w:r>
             <w:r>
               <w:rPr>
@@ -3664,7 +3719,7 @@
               <w14:ligatures w14:val="standardContextual"/>
             </w:rPr>
           </w:pPr>
-          <w:hyperlink w:anchor="_Toc207269146" w:history="1">
+          <w:hyperlink w:anchor="_Toc211501393" w:history="1">
             <w:r>
               <w:rPr>
                 <w:rStyle w:val="Hyperlink"/>
@@ -3687,7 +3742,7 @@
               <w:rPr>
                 <w:webHidden/>
               </w:rPr>
-              <w:instrText xml:space="preserve"> PAGEREF _Toc207269146 \h </w:instrText>
+              <w:instrText xml:space="preserve"> PAGEREF _Toc211501393 \h </w:instrText>
             </w:r>
             <w:r>
               <w:rPr>
@@ -3704,7 +3759,7 @@
               <w:rPr>
                 <w:webHidden/>
               </w:rPr>
-              <w:t>30</w:t>
+              <w:t>31</w:t>
             </w:r>
             <w:r>
               <w:rPr>
@@ -3725,7 +3780,7 @@
               <w14:ligatures w14:val="standardContextual"/>
             </w:rPr>
           </w:pPr>
-          <w:hyperlink w:anchor="_Toc207269147" w:history="1">
+          <w:hyperlink w:anchor="_Toc211501394" w:history="1">
             <w:r>
               <w:rPr>
                 <w:rStyle w:val="Hyperlink"/>
@@ -3748,7 +3803,7 @@
               <w:rPr>
                 <w:webHidden/>
               </w:rPr>
-              <w:instrText xml:space="preserve"> PAGEREF _Toc207269147 \h </w:instrText>
+              <w:instrText xml:space="preserve"> PAGEREF _Toc211501394 \h </w:instrText>
             </w:r>
             <w:r>
               <w:rPr>
@@ -3765,7 +3820,7 @@
               <w:rPr>
                 <w:webHidden/>
               </w:rPr>
-              <w:t>31</w:t>
+              <w:t>32</w:t>
             </w:r>
             <w:r>
               <w:rPr>
@@ -3786,7 +3841,7 @@
               <w14:ligatures w14:val="standardContextual"/>
             </w:rPr>
           </w:pPr>
-          <w:hyperlink w:anchor="_Toc207269148" w:history="1">
+          <w:hyperlink w:anchor="_Toc211501395" w:history="1">
             <w:r>
               <w:rPr>
                 <w:rStyle w:val="Hyperlink"/>
@@ -3809,7 +3864,7 @@
               <w:rPr>
                 <w:webHidden/>
               </w:rPr>
-              <w:instrText xml:space="preserve"> PAGEREF _Toc207269148 \h </w:instrText>
+              <w:instrText xml:space="preserve"> PAGEREF _Toc211501395 \h </w:instrText>
             </w:r>
             <w:r>
               <w:rPr>
@@ -3826,7 +3881,7 @@
               <w:rPr>
                 <w:webHidden/>
               </w:rPr>
-              <w:t>31</w:t>
+              <w:t>32</w:t>
             </w:r>
             <w:r>
               <w:rPr>
@@ -3853,7 +3908,7 @@
         <w:pStyle w:val="Ttulo1"/>
       </w:pPr>
       <w:bookmarkStart w:id="2" w:name="_Toc191549018"/>
-      <w:bookmarkStart w:id="3" w:name="_Toc207269090"/>
+      <w:bookmarkStart w:id="3" w:name="_Toc211501336"/>
       <w:r>
         <w:t>1</w:t>
       </w:r>
@@ -3884,7 +3939,7 @@
         <w:pStyle w:val="Ttulo1"/>
       </w:pPr>
       <w:bookmarkStart w:id="4" w:name="_Toc191549019"/>
-      <w:bookmarkStart w:id="5" w:name="_Toc207269091"/>
+      <w:bookmarkStart w:id="5" w:name="_Toc211501337"/>
       <w:r>
         <w:t>2</w:t>
       </w:r>
@@ -4037,7 +4092,7 @@
         <w:pStyle w:val="Ttulo1"/>
       </w:pPr>
       <w:bookmarkStart w:id="6" w:name="_Toc191549020"/>
-      <w:bookmarkStart w:id="7" w:name="_Toc207269092"/>
+      <w:bookmarkStart w:id="7" w:name="_Toc211501338"/>
       <w:r>
         <w:t>3</w:t>
       </w:r>
@@ -4062,7 +4117,7 @@
       <w:pPr>
         <w:pStyle w:val="Ttulo2"/>
       </w:pPr>
-      <w:bookmarkStart w:id="8" w:name="_Toc207269093"/>
+      <w:bookmarkStart w:id="8" w:name="_Toc211501339"/>
       <w:r>
         <w:t>3.1</w:t>
       </w:r>
@@ -4161,7 +4216,7 @@
       <w:pPr>
         <w:pStyle w:val="Ttulo2"/>
       </w:pPr>
-      <w:bookmarkStart w:id="9" w:name="_Toc207269094"/>
+      <w:bookmarkStart w:id="9" w:name="_Toc211501340"/>
       <w:r>
         <w:t>3.2 int_signifyd_sfra</w:t>
       </w:r>
@@ -4258,7 +4313,7 @@
       <w:pPr>
         <w:pStyle w:val="Ttulo2"/>
       </w:pPr>
-      <w:bookmarkStart w:id="10" w:name="_Toc207269095"/>
+      <w:bookmarkStart w:id="10" w:name="_Toc211501341"/>
       <w:r>
         <w:t>3.3 signifyd_sfra_changes</w:t>
       </w:r>
@@ -4356,7 +4411,7 @@
       <w:pPr>
         <w:pStyle w:val="Ttulo2"/>
       </w:pPr>
-      <w:bookmarkStart w:id="11" w:name="_Toc207269096"/>
+      <w:bookmarkStart w:id="11" w:name="_Toc211501342"/>
       <w:r>
         <w:t>3.4 Metadata</w:t>
       </w:r>
@@ -4427,7 +4482,7 @@
       <w:pPr>
         <w:pStyle w:val="Ttulo3"/>
       </w:pPr>
-      <w:bookmarkStart w:id="12" w:name="_Toc207269097"/>
+      <w:bookmarkStart w:id="12" w:name="_Toc211501343"/>
       <w:r>
         <w:t xml:space="preserve">3.4.1 </w:t>
       </w:r>
@@ -4636,7 +4691,7 @@
       <w:pPr>
         <w:pStyle w:val="Ttulo1"/>
       </w:pPr>
-      <w:bookmarkStart w:id="13" w:name="_Toc207269098"/>
+      <w:bookmarkStart w:id="13" w:name="_Toc211501344"/>
       <w:r>
         <w:lastRenderedPageBreak/>
         <w:t>4. F</w:t>
@@ -4651,7 +4706,7 @@
       <w:pPr>
         <w:pStyle w:val="Ttulo2"/>
       </w:pPr>
-      <w:bookmarkStart w:id="14" w:name="_Toc207269099"/>
+      <w:bookmarkStart w:id="14" w:name="_Toc211501345"/>
       <w:r>
         <w:t>4</w:t>
       </w:r>
@@ -4674,7 +4729,7 @@
       <w:pPr>
         <w:pStyle w:val="Ttulo3"/>
       </w:pPr>
-      <w:bookmarkStart w:id="15" w:name="_Toc207269100"/>
+      <w:bookmarkStart w:id="15" w:name="_Toc211501346"/>
       <w:r>
         <w:t xml:space="preserve">4.1.1 </w:t>
       </w:r>
@@ -5037,7 +5092,7 @@
         <w:pStyle w:val="Ttulo3"/>
       </w:pPr>
       <w:bookmarkStart w:id="16" w:name="_Hlk83804264"/>
-      <w:bookmarkStart w:id="17" w:name="_Toc207269101"/>
+      <w:bookmarkStart w:id="17" w:name="_Toc211501347"/>
       <w:r>
         <w:t>4.1.</w:t>
       </w:r>
@@ -5358,7 +5413,7 @@
       <w:pPr>
         <w:pStyle w:val="Ttulo3"/>
       </w:pPr>
-      <w:bookmarkStart w:id="18" w:name="_Toc207269102"/>
+      <w:bookmarkStart w:id="18" w:name="_Toc211501348"/>
       <w:r>
         <w:t>4.1.3 Passive Mode</w:t>
       </w:r>
@@ -5459,7 +5514,7 @@
       <w:pPr>
         <w:pStyle w:val="Ttulo3"/>
       </w:pPr>
-      <w:bookmarkStart w:id="20" w:name="_Toc207269103"/>
+      <w:bookmarkStart w:id="20" w:name="_Toc211501349"/>
       <w:r>
         <w:t>4.1.4 Post-Auth Fallback</w:t>
       </w:r>
@@ -5532,7 +5587,7 @@
       <w:pPr>
         <w:pStyle w:val="Ttulo3"/>
       </w:pPr>
-      <w:bookmarkStart w:id="21" w:name="_Toc207269104"/>
+      <w:bookmarkStart w:id="21" w:name="_Toc211501350"/>
       <w:r>
         <w:t>4.1.</w:t>
       </w:r>
@@ -5678,7 +5733,7 @@
       <w:pPr>
         <w:pStyle w:val="Ttulo3"/>
       </w:pPr>
-      <w:bookmarkStart w:id="22" w:name="_Toc207269105"/>
+      <w:bookmarkStart w:id="22" w:name="_Toc211501351"/>
       <w:r>
         <w:lastRenderedPageBreak/>
         <w:t>4.1.6 Re</w:t>
@@ -5809,7 +5864,7 @@
       <w:pPr>
         <w:pStyle w:val="Ttulo3"/>
       </w:pPr>
-      <w:bookmarkStart w:id="23" w:name="_Toc207269106"/>
+      <w:bookmarkStart w:id="23" w:name="_Toc211501352"/>
       <w:r>
         <w:t xml:space="preserve">4.1.6 </w:t>
       </w:r>
@@ -5953,7 +6008,7 @@
       <w:pPr>
         <w:pStyle w:val="Ttulo3"/>
       </w:pPr>
-      <w:bookmarkStart w:id="24" w:name="_Toc207269107"/>
+      <w:bookmarkStart w:id="24" w:name="_Toc211501353"/>
       <w:r>
         <w:t>4.1.</w:t>
       </w:r>
@@ -7085,7 +7140,7 @@
       <w:pPr>
         <w:pStyle w:val="Ttulo3"/>
       </w:pPr>
-      <w:bookmarkStart w:id="25" w:name="_Toc207269108"/>
+      <w:bookmarkStart w:id="25" w:name="_Toc211501354"/>
       <w:r>
         <w:t>4.1.</w:t>
       </w:r>
@@ -7223,7 +7278,7 @@
       <w:pPr>
         <w:pStyle w:val="Ttulo3"/>
       </w:pPr>
-      <w:bookmarkStart w:id="26" w:name="_Toc207269109"/>
+      <w:bookmarkStart w:id="26" w:name="_Toc211501355"/>
       <w:r>
         <w:t>4.1.</w:t>
       </w:r>
@@ -7383,7 +7438,7 @@
       <w:pPr>
         <w:pStyle w:val="Ttulo3"/>
       </w:pPr>
-      <w:bookmarkStart w:id="27" w:name="_Toc207269110"/>
+      <w:bookmarkStart w:id="27" w:name="_Toc211501356"/>
       <w:r>
         <w:t>4.1.</w:t>
       </w:r>
@@ -7480,24 +7535,142 @@
     </w:p>
     <w:p>
       <w:pPr>
+        <w:pStyle w:val="Ttulo3"/>
+      </w:pPr>
+      <w:bookmarkStart w:id="28" w:name="_Toc211501357"/>
+      <w:r>
+        <w:lastRenderedPageBreak/>
+        <w:t>4.1.1</w:t>
+      </w:r>
+      <w:r>
+        <w:t>1</w:t>
+      </w:r>
+      <w:r>
+        <w:t xml:space="preserve"> </w:t>
+      </w:r>
+      <w:r>
+        <w:t>Order notes</w:t>
+      </w:r>
+      <w:bookmarkEnd w:id="28"/>
+    </w:p>
+    <w:p/>
+    <w:p>
+      <w:r>
+        <w:t xml:space="preserve">Merchants can enable the custom site preference </w:t>
+      </w:r>
+      <w:proofErr w:type="spellStart"/>
+      <w:r>
+        <w:rPr>
+          <w:b/>
+          <w:bCs/>
+        </w:rPr>
+        <w:t>SignifydEnableOrderNotes</w:t>
+      </w:r>
+      <w:proofErr w:type="spellEnd"/>
+      <w:r>
+        <w:rPr>
+          <w:b/>
+          <w:bCs/>
+        </w:rPr>
+        <w:t xml:space="preserve"> </w:t>
+      </w:r>
+      <w:r>
+        <w:t xml:space="preserve">to add order notes related to Signifyd errors and information messages, in addition to the normal logging. When this functionality is enabled, the preference </w:t>
+      </w:r>
+      <w:proofErr w:type="spellStart"/>
+      <w:r>
+        <w:rPr>
+          <w:b/>
+          <w:bCs/>
+        </w:rPr>
+        <w:t>SignifydOrderNotesLogLevel</w:t>
+      </w:r>
+      <w:proofErr w:type="spellEnd"/>
+      <w:r>
+        <w:rPr>
+          <w:b/>
+          <w:bCs/>
+        </w:rPr>
+        <w:t xml:space="preserve"> </w:t>
+      </w:r>
+      <w:r>
+        <w:t>can be used to control if the order notes will be added only for errors or for general information.</w:t>
+      </w:r>
+    </w:p>
+    <w:p>
+      <w:r>
+        <w:rPr>
+          <w:noProof/>
+        </w:rPr>
+        <w:drawing>
+          <wp:inline distT="0" distB="0" distL="0" distR="0" wp14:anchorId="6AD6A403" wp14:editId="011DB284">
+            <wp:extent cx="6181725" cy="1219200"/>
+            <wp:effectExtent l="0" t="0" r="9525" b="0"/>
+            <wp:docPr id="218296133" name="Imagem 1"/>
+            <wp:cNvGraphicFramePr>
+              <a:graphicFrameLocks xmlns:a="http://schemas.openxmlformats.org/drawingml/2006/main" noChangeAspect="1"/>
+            </wp:cNvGraphicFramePr>
+            <a:graphic xmlns:a="http://schemas.openxmlformats.org/drawingml/2006/main">
+              <a:graphicData uri="http://schemas.openxmlformats.org/drawingml/2006/picture">
+                <pic:pic xmlns:pic="http://schemas.openxmlformats.org/drawingml/2006/picture">
+                  <pic:nvPicPr>
+                    <pic:cNvPr id="0" name="Picture 1"/>
+                    <pic:cNvPicPr>
+                      <a:picLocks noChangeAspect="1" noChangeArrowheads="1"/>
+                    </pic:cNvPicPr>
+                  </pic:nvPicPr>
+                  <pic:blipFill>
+                    <a:blip r:embed="rId28">
+                      <a:extLst>
+                        <a:ext uri="{28A0092B-C50C-407E-A947-70E740481C1C}">
+                          <a14:useLocalDpi xmlns:a14="http://schemas.microsoft.com/office/drawing/2010/main" val="0"/>
+                        </a:ext>
+                      </a:extLst>
+                    </a:blip>
+                    <a:srcRect/>
+                    <a:stretch>
+                      <a:fillRect/>
+                    </a:stretch>
+                  </pic:blipFill>
+                  <pic:spPr bwMode="auto">
+                    <a:xfrm>
+                      <a:off x="0" y="0"/>
+                      <a:ext cx="6181725" cy="1219200"/>
+                    </a:xfrm>
+                    <a:prstGeom prst="rect">
+                      <a:avLst/>
+                    </a:prstGeom>
+                    <a:noFill/>
+                    <a:ln>
+                      <a:noFill/>
+                    </a:ln>
+                  </pic:spPr>
+                </pic:pic>
+              </a:graphicData>
+            </a:graphic>
+          </wp:inline>
+        </w:drawing>
+      </w:r>
+    </w:p>
+    <w:p>
+      <w:pPr>
         <w:pStyle w:val="Ttulo1"/>
       </w:pPr>
-      <w:bookmarkStart w:id="28" w:name="_Toc207269111"/>
-      <w:r>
-        <w:lastRenderedPageBreak/>
+      <w:bookmarkStart w:id="29" w:name="_Toc211501358"/>
+      <w:r>
         <w:t xml:space="preserve">5. </w:t>
       </w:r>
       <w:r>
         <w:t>Integration</w:t>
       </w:r>
-      <w:bookmarkEnd w:id="28"/>
+      <w:bookmarkEnd w:id="29"/>
     </w:p>
     <w:p/>
     <w:p>
       <w:pPr>
         <w:pStyle w:val="Ttulo2"/>
       </w:pPr>
-      <w:bookmarkStart w:id="29" w:name="_Toc207269112"/>
+      <w:bookmarkStart w:id="30" w:name="_Toc211501359"/>
       <w:r>
         <w:t>5</w:t>
       </w:r>
@@ -7507,18 +7680,18 @@
       <w:r>
         <w:t>Metadata Import</w:t>
       </w:r>
-      <w:bookmarkEnd w:id="29"/>
+      <w:bookmarkEnd w:id="30"/>
     </w:p>
     <w:p/>
     <w:p>
       <w:pPr>
         <w:pStyle w:val="Ttulo3"/>
       </w:pPr>
-      <w:bookmarkStart w:id="30" w:name="_Toc207269113"/>
+      <w:bookmarkStart w:id="31" w:name="_Toc211501360"/>
       <w:r>
         <w:t>5.1.1 System Object Type Extensions</w:t>
       </w:r>
-      <w:bookmarkEnd w:id="30"/>
+      <w:bookmarkEnd w:id="31"/>
     </w:p>
     <w:p/>
     <w:p>
@@ -7732,7 +7905,7 @@
                     </pic:cNvPicPr>
                   </pic:nvPicPr>
                   <pic:blipFill>
-                    <a:blip r:embed="rId28">
+                    <a:blip r:embed="rId29">
                       <a:extLst>
                         <a:ext uri="{28A0092B-C50C-407E-A947-70E740481C1C}">
                           <a14:useLocalDpi xmlns:a14="http://schemas.microsoft.com/office/drawing/2010/main" val="0"/>
@@ -7814,6 +7987,7 @@
           <w:sz w:val="24"/>
           <w:szCs w:val="24"/>
         </w:rPr>
+        <w:lastRenderedPageBreak/>
         <w:drawing>
           <wp:inline distT="0" distB="0" distL="0" distR="0" wp14:anchorId="463D53B3" wp14:editId="39C0C6C1">
             <wp:extent cx="4135522" cy="1067231"/>
@@ -7830,7 +8004,7 @@
                     <pic:cNvPicPr/>
                   </pic:nvPicPr>
                   <pic:blipFill>
-                    <a:blip r:embed="rId29"/>
+                    <a:blip r:embed="rId30"/>
                     <a:stretch>
                       <a:fillRect/>
                     </a:stretch>
@@ -7931,7 +8105,6 @@
           <w:sz w:val="24"/>
           <w:szCs w:val="24"/>
         </w:rPr>
-        <w:lastRenderedPageBreak/>
         <w:drawing>
           <wp:inline distT="0" distB="0" distL="0" distR="0" wp14:anchorId="3066CDDD" wp14:editId="5FC78735">
             <wp:extent cx="5991225" cy="2781300"/>
@@ -7950,7 +8123,7 @@
                     </pic:cNvPicPr>
                   </pic:nvPicPr>
                   <pic:blipFill>
-                    <a:blip r:embed="rId28">
+                    <a:blip r:embed="rId29">
                       <a:extLst>
                         <a:ext uri="{28A0092B-C50C-407E-A947-70E740481C1C}">
                           <a14:useLocalDpi xmlns:a14="http://schemas.microsoft.com/office/drawing/2010/main" val="0"/>
@@ -8052,7 +8225,7 @@
                     <pic:cNvPicPr/>
                   </pic:nvPicPr>
                   <pic:blipFill>
-                    <a:blip r:embed="rId30"/>
+                    <a:blip r:embed="rId31"/>
                     <a:stretch>
                       <a:fillRect/>
                     </a:stretch>
@@ -8127,6 +8300,7 @@
           <w:sz w:val="24"/>
           <w:szCs w:val="24"/>
         </w:rPr>
+        <w:lastRenderedPageBreak/>
         <w:drawing>
           <wp:inline distT="0" distB="0" distL="0" distR="0" wp14:anchorId="6A804093" wp14:editId="0B1B1492">
             <wp:extent cx="6188710" cy="1637030"/>
@@ -8143,7 +8317,7 @@
                     <pic:cNvPicPr/>
                   </pic:nvPicPr>
                   <pic:blipFill>
-                    <a:blip r:embed="rId31"/>
+                    <a:blip r:embed="rId32"/>
                     <a:stretch>
                       <a:fillRect/>
                     </a:stretch>
@@ -8204,7 +8378,6 @@
           <w:sz w:val="24"/>
           <w:szCs w:val="24"/>
         </w:rPr>
-        <w:lastRenderedPageBreak/>
         <w:drawing>
           <wp:inline distT="0" distB="0" distL="0" distR="0" wp14:anchorId="329346C1" wp14:editId="6EE3DBF7">
             <wp:extent cx="6181725" cy="3324225"/>
@@ -8223,7 +8396,7 @@
                     </pic:cNvPicPr>
                   </pic:nvPicPr>
                   <pic:blipFill>
-                    <a:blip r:embed="rId32">
+                    <a:blip r:embed="rId33">
                       <a:extLst>
                         <a:ext uri="{28A0092B-C50C-407E-A947-70E740481C1C}">
                           <a14:useLocalDpi xmlns:a14="http://schemas.microsoft.com/office/drawing/2010/main" val="0"/>
@@ -8297,11 +8470,11 @@
       <w:pPr>
         <w:pStyle w:val="Ttulo3"/>
       </w:pPr>
-      <w:bookmarkStart w:id="31" w:name="_Toc207269114"/>
+      <w:bookmarkStart w:id="32" w:name="_Toc211501361"/>
       <w:r>
         <w:t>5.1.2 Services</w:t>
       </w:r>
-      <w:bookmarkEnd w:id="31"/>
+      <w:bookmarkEnd w:id="32"/>
     </w:p>
     <w:p/>
     <w:p>
@@ -8365,6 +8538,7 @@
           <w:sz w:val="24"/>
           <w:szCs w:val="24"/>
         </w:rPr>
+        <w:lastRenderedPageBreak/>
         <w:drawing>
           <wp:inline distT="0" distB="0" distL="0" distR="0" wp14:anchorId="6613D0E5" wp14:editId="09F633E3">
             <wp:extent cx="3886200" cy="3495675"/>
@@ -8383,7 +8557,7 @@
                     </pic:cNvPicPr>
                   </pic:nvPicPr>
                   <pic:blipFill>
-                    <a:blip r:embed="rId33">
+                    <a:blip r:embed="rId34">
                       <a:extLst>
                         <a:ext uri="{28A0092B-C50C-407E-A947-70E740481C1C}">
                           <a14:useLocalDpi xmlns:a14="http://schemas.microsoft.com/office/drawing/2010/main" val="0"/>
@@ -8431,7 +8605,6 @@
         <w:rPr>
           <w:rFonts w:cstheme="minorHAnsi"/>
         </w:rPr>
-        <w:lastRenderedPageBreak/>
         <w:t xml:space="preserve">Once the services file is uploaded click Import and </w:t>
       </w:r>
       <w:r>
@@ -8516,7 +8689,7 @@
                     </pic:cNvPicPr>
                   </pic:nvPicPr>
                   <pic:blipFill>
-                    <a:blip r:embed="rId34">
+                    <a:blip r:embed="rId35">
                       <a:extLst>
                         <a:ext uri="{28A0092B-C50C-407E-A947-70E740481C1C}">
                           <a14:useLocalDpi xmlns:a14="http://schemas.microsoft.com/office/drawing/2010/main" val="0"/>
@@ -8562,14 +8735,14 @@
       <w:pPr>
         <w:pStyle w:val="Ttulo3"/>
       </w:pPr>
-      <w:bookmarkStart w:id="32" w:name="_Toc207269115"/>
+      <w:bookmarkStart w:id="33" w:name="_Toc211501362"/>
       <w:r>
         <w:t>5.1.3</w:t>
       </w:r>
       <w:r>
         <w:t xml:space="preserve"> Jobs</w:t>
       </w:r>
-      <w:bookmarkEnd w:id="32"/>
+      <w:bookmarkEnd w:id="33"/>
     </w:p>
     <w:p/>
     <w:p>
@@ -8636,6 +8809,7 @@
           <w:sz w:val="24"/>
           <w:szCs w:val="24"/>
         </w:rPr>
+        <w:lastRenderedPageBreak/>
         <w:drawing>
           <wp:inline distT="0" distB="0" distL="0" distR="0" wp14:anchorId="6D6F8005" wp14:editId="22A519FB">
             <wp:extent cx="3886200" cy="3495675"/>
@@ -8654,7 +8828,7 @@
                     </pic:cNvPicPr>
                   </pic:nvPicPr>
                   <pic:blipFill>
-                    <a:blip r:embed="rId33">
+                    <a:blip r:embed="rId34">
                       <a:extLst>
                         <a:ext uri="{28A0092B-C50C-407E-A947-70E740481C1C}">
                           <a14:useLocalDpi xmlns:a14="http://schemas.microsoft.com/office/drawing/2010/main" val="0"/>
@@ -8696,7 +8870,6 @@
         <w:rPr>
           <w:rFonts w:cstheme="minorHAnsi"/>
         </w:rPr>
-        <w:lastRenderedPageBreak/>
         <w:t>Once the jobs file is uploaded</w:t>
       </w:r>
       <w:r>
@@ -8795,7 +8968,7 @@
                     </pic:cNvPicPr>
                   </pic:nvPicPr>
                   <pic:blipFill>
-                    <a:blip r:embed="rId35">
+                    <a:blip r:embed="rId36">
                       <a:extLst>
                         <a:ext uri="{28A0092B-C50C-407E-A947-70E740481C1C}">
                           <a14:useLocalDpi xmlns:a14="http://schemas.microsoft.com/office/drawing/2010/main" val="0"/>
@@ -8881,7 +9054,7 @@
                     </pic:cNvPicPr>
                   </pic:nvPicPr>
                   <pic:blipFill>
-                    <a:blip r:embed="rId36">
+                    <a:blip r:embed="rId37">
                       <a:extLst>
                         <a:ext uri="{28A0092B-C50C-407E-A947-70E740481C1C}">
                           <a14:useLocalDpi xmlns:a14="http://schemas.microsoft.com/office/drawing/2010/main" val="0"/>
@@ -8924,25 +9097,25 @@
       <w:pPr>
         <w:pStyle w:val="Ttulo2"/>
       </w:pPr>
-      <w:bookmarkStart w:id="33" w:name="_Toc207269116"/>
+      <w:bookmarkStart w:id="34" w:name="_Toc211501363"/>
       <w:r>
         <w:t>5.2 SFRA Integration</w:t>
       </w:r>
-      <w:bookmarkEnd w:id="33"/>
+      <w:bookmarkEnd w:id="34"/>
     </w:p>
     <w:p/>
     <w:p>
       <w:pPr>
         <w:pStyle w:val="Ttulo3"/>
       </w:pPr>
-      <w:bookmarkStart w:id="34" w:name="_Toc207269117"/>
+      <w:bookmarkStart w:id="35" w:name="_Toc211501364"/>
       <w:r>
         <w:t xml:space="preserve">5.2.1 </w:t>
       </w:r>
       <w:r>
         <w:t>Script changes</w:t>
       </w:r>
-      <w:bookmarkEnd w:id="34"/>
+      <w:bookmarkEnd w:id="35"/>
     </w:p>
     <w:p>
       <w:pPr>
@@ -8979,6 +9152,7 @@
           <w:bCs/>
           <w:color w:val="00000A"/>
         </w:rPr>
+        <w:lastRenderedPageBreak/>
         <w:t xml:space="preserve">Script: </w:t>
       </w:r>
       <w:r>
@@ -9355,14 +9529,14 @@
       <w:pPr>
         <w:pStyle w:val="Ttulo3"/>
       </w:pPr>
-      <w:bookmarkStart w:id="35" w:name="_Toc207269118"/>
+      <w:bookmarkStart w:id="36" w:name="_Toc211501365"/>
       <w:r>
         <w:t xml:space="preserve">5.2.2 </w:t>
       </w:r>
       <w:r>
         <w:t>Adding the necessary changes</w:t>
       </w:r>
-      <w:bookmarkEnd w:id="35"/>
+      <w:bookmarkEnd w:id="36"/>
     </w:p>
     <w:p>
       <w:pPr>
@@ -9717,7 +9891,7 @@
                     <pic:cNvPicPr/>
                   </pic:nvPicPr>
                   <pic:blipFill>
-                    <a:blip r:embed="rId37"/>
+                    <a:blip r:embed="rId38"/>
                     <a:stretch>
                       <a:fillRect/>
                     </a:stretch>
@@ -9744,22 +9918,22 @@
       <w:pPr>
         <w:pStyle w:val="Ttulo2"/>
       </w:pPr>
-      <w:bookmarkStart w:id="36" w:name="_Toc207269119"/>
+      <w:bookmarkStart w:id="37" w:name="_Toc211501366"/>
       <w:r>
         <w:t>5.3 SiteGenesis Integration – Controllers</w:t>
       </w:r>
-      <w:bookmarkEnd w:id="36"/>
+      <w:bookmarkEnd w:id="37"/>
     </w:p>
     <w:p/>
     <w:p>
       <w:pPr>
         <w:pStyle w:val="Ttulo3"/>
       </w:pPr>
-      <w:bookmarkStart w:id="37" w:name="_Toc207269120"/>
+      <w:bookmarkStart w:id="38" w:name="_Toc211501367"/>
       <w:r>
         <w:t>5.3.1 Modifications in System Controller</w:t>
       </w:r>
-      <w:bookmarkEnd w:id="37"/>
+      <w:bookmarkEnd w:id="38"/>
     </w:p>
     <w:p/>
     <w:p>
@@ -9935,6 +10109,7 @@
         <w:rPr>
           <w:rFonts w:cstheme="minorHAnsi"/>
         </w:rPr>
+        <w:lastRenderedPageBreak/>
         <w:t>Add those two rows near the end of the same function method:</w:t>
       </w:r>
     </w:p>
@@ -10252,7 +10427,6 @@
           <w:noProof/>
           <w:color w:val="0000FF"/>
         </w:rPr>
-        <w:lastRenderedPageBreak/>
         <w:drawing>
           <wp:inline distT="0" distB="0" distL="0" distR="0" wp14:anchorId="5FC5D161" wp14:editId="5F9DCE30">
             <wp:extent cx="4733925" cy="3657600"/>
@@ -10271,7 +10445,7 @@
                     </pic:cNvPicPr>
                   </pic:nvPicPr>
                   <pic:blipFill>
-                    <a:blip r:embed="rId38">
+                    <a:blip r:embed="rId39">
                       <a:extLst>
                         <a:ext uri="{28A0092B-C50C-407E-A947-70E740481C1C}">
                           <a14:useLocalDpi xmlns:a14="http://schemas.microsoft.com/office/drawing/2010/main" val="0"/>
@@ -10321,7 +10495,7 @@
       <w:pPr>
         <w:pStyle w:val="Ttulo3"/>
       </w:pPr>
-      <w:bookmarkStart w:id="38" w:name="_Toc207269121"/>
+      <w:bookmarkStart w:id="39" w:name="_Toc211501368"/>
       <w:r>
         <w:t xml:space="preserve">5.3.2 </w:t>
       </w:r>
@@ -10331,7 +10505,7 @@
       <w:r>
         <w:t xml:space="preserve"> – Device Fingerprinting</w:t>
       </w:r>
-      <w:bookmarkEnd w:id="38"/>
+      <w:bookmarkEnd w:id="39"/>
     </w:p>
     <w:p>
       <w:pPr>
@@ -10589,6 +10763,7 @@
           <w:rFonts w:cstheme="minorHAnsi"/>
           <w:noProof/>
         </w:rPr>
+        <w:lastRenderedPageBreak/>
         <w:drawing>
           <wp:inline distT="0" distB="0" distL="0" distR="0" wp14:anchorId="34456EF4" wp14:editId="43FBEBC4">
             <wp:extent cx="6181725" cy="1457325"/>
@@ -10607,7 +10782,7 @@
                     </pic:cNvPicPr>
                   </pic:nvPicPr>
                   <pic:blipFill>
-                    <a:blip r:embed="rId39">
+                    <a:blip r:embed="rId40">
                       <a:extLst>
                         <a:ext uri="{28A0092B-C50C-407E-A947-70E740481C1C}">
                           <a14:useLocalDpi xmlns:a14="http://schemas.microsoft.com/office/drawing/2010/main" val="0"/>
@@ -10646,12 +10821,11 @@
       <w:pPr>
         <w:pStyle w:val="Ttulo2"/>
       </w:pPr>
-      <w:bookmarkStart w:id="39" w:name="_Toc207269122"/>
-      <w:r>
-        <w:lastRenderedPageBreak/>
+      <w:bookmarkStart w:id="40" w:name="_Toc211501369"/>
+      <w:r>
         <w:t>5.4 SiteGenesis Integration – Pipelines</w:t>
       </w:r>
-      <w:bookmarkEnd w:id="39"/>
+      <w:bookmarkEnd w:id="40"/>
     </w:p>
     <w:p/>
     <w:p>
@@ -10877,6 +11051,7 @@
           <w:rFonts w:ascii="Times" w:hAnsi="Times" w:cs="Times"/>
           <w:noProof/>
         </w:rPr>
+        <w:lastRenderedPageBreak/>
         <w:drawing>
           <wp:inline distT="0" distB="0" distL="0" distR="0" wp14:anchorId="50D555ED" wp14:editId="690361BC">
             <wp:extent cx="4836160" cy="6518479"/>
@@ -10895,7 +11070,7 @@
                     </pic:cNvPicPr>
                   </pic:nvPicPr>
                   <pic:blipFill>
-                    <a:blip r:embed="rId40">
+                    <a:blip r:embed="rId41">
                       <a:extLst>
                         <a:ext uri="{28A0092B-C50C-407E-A947-70E740481C1C}">
                           <a14:useLocalDpi xmlns:a14="http://schemas.microsoft.com/office/drawing/2010/main" val="0"/>
@@ -11002,7 +11177,7 @@
                     </pic:cNvPicPr>
                   </pic:nvPicPr>
                   <pic:blipFill>
-                    <a:blip r:embed="rId41">
+                    <a:blip r:embed="rId42">
                       <a:extLst>
                         <a:ext uri="{28A0092B-C50C-407E-A947-70E740481C1C}">
                           <a14:useLocalDpi xmlns:a14="http://schemas.microsoft.com/office/drawing/2010/main" val="0"/>
@@ -11052,25 +11227,25 @@
       <w:pPr>
         <w:pStyle w:val="Ttulo2"/>
       </w:pPr>
-      <w:bookmarkStart w:id="40" w:name="_Toc207269123"/>
+      <w:bookmarkStart w:id="41" w:name="_Toc211501370"/>
       <w:r>
         <w:t xml:space="preserve">5.5 </w:t>
       </w:r>
       <w:r>
         <w:t>Limitations and Constraints</w:t>
       </w:r>
-      <w:bookmarkEnd w:id="40"/>
+      <w:bookmarkEnd w:id="41"/>
     </w:p>
     <w:p/>
     <w:p>
       <w:pPr>
         <w:pStyle w:val="Ttulo3"/>
       </w:pPr>
-      <w:bookmarkStart w:id="41" w:name="_Toc207269124"/>
+      <w:bookmarkStart w:id="42" w:name="_Toc211501371"/>
       <w:r>
         <w:t>5.5.1 AVS and CVV Response Codes</w:t>
       </w:r>
-      <w:bookmarkEnd w:id="41"/>
+      <w:bookmarkEnd w:id="42"/>
     </w:p>
     <w:p>
       <w:pPr>
@@ -11153,7 +11328,7 @@
         </w:rPr>
         <w:t xml:space="preserve">The values for AVS and CVV Response Code fields MUST map to standard response codes. See </w:t>
       </w:r>
-      <w:hyperlink r:id="rId42" w:history="1">
+      <w:hyperlink r:id="rId43" w:history="1">
         <w:r>
           <w:rPr>
             <w:rStyle w:val="Hyperlink"/>
@@ -11349,7 +11524,7 @@
                     <pic:cNvPicPr/>
                   </pic:nvPicPr>
                   <pic:blipFill>
-                    <a:blip r:embed="rId43"/>
+                    <a:blip r:embed="rId44"/>
                     <a:stretch>
                       <a:fillRect/>
                     </a:stretch>
@@ -11464,7 +11639,7 @@
                     <pic:cNvPicPr/>
                   </pic:nvPicPr>
                   <pic:blipFill>
-                    <a:blip r:embed="rId44"/>
+                    <a:blip r:embed="rId45"/>
                     <a:stretch>
                       <a:fillRect/>
                     </a:stretch>
@@ -11503,7 +11678,7 @@
       <w:pPr>
         <w:pStyle w:val="Ttulo3"/>
       </w:pPr>
-      <w:bookmarkStart w:id="42" w:name="_Toc207269125"/>
+      <w:bookmarkStart w:id="43" w:name="_Toc211501372"/>
       <w:r>
         <w:t>5.5.</w:t>
       </w:r>
@@ -11513,7 +11688,7 @@
       <w:r>
         <w:t xml:space="preserve"> Order Channel</w:t>
       </w:r>
-      <w:bookmarkEnd w:id="42"/>
+      <w:bookmarkEnd w:id="43"/>
     </w:p>
     <w:p>
       <w:pPr>
@@ -11655,7 +11830,7 @@
                     <pic:cNvPicPr/>
                   </pic:nvPicPr>
                   <pic:blipFill>
-                    <a:blip r:embed="rId45"/>
+                    <a:blip r:embed="rId46"/>
                     <a:stretch>
                       <a:fillRect/>
                     </a:stretch>
@@ -11748,7 +11923,7 @@
       <w:pPr>
         <w:pStyle w:val="Ttulo3"/>
       </w:pPr>
-      <w:bookmarkStart w:id="43" w:name="_Toc207269126"/>
+      <w:bookmarkStart w:id="44" w:name="_Toc211501373"/>
       <w:r>
         <w:lastRenderedPageBreak/>
         <w:t xml:space="preserve">5.5.3 </w:t>
@@ -11756,7 +11931,7 @@
       <w:r>
         <w:t>Fulfillment API</w:t>
       </w:r>
-      <w:bookmarkEnd w:id="43"/>
+      <w:bookmarkEnd w:id="44"/>
     </w:p>
     <w:p>
       <w:pPr>
@@ -11820,7 +11995,7 @@
         </w:rPr>
         <w:t xml:space="preserve">, according to the merchant’s shipping carrier and following the format specified on the </w:t>
       </w:r>
-      <w:hyperlink r:id="rId46" w:anchor="operation/Fulfillments" w:history="1">
+      <w:hyperlink r:id="rId47" w:anchor="operation/Fulfillments" w:history="1">
         <w:r>
           <w:rPr>
             <w:rStyle w:val="Hyperlink"/>
@@ -11884,7 +12059,7 @@
                     <pic:cNvPicPr/>
                   </pic:nvPicPr>
                   <pic:blipFill>
-                    <a:blip r:embed="rId47"/>
+                    <a:blip r:embed="rId48"/>
                     <a:stretch>
                       <a:fillRect/>
                     </a:stretch>
@@ -11927,14 +12102,14 @@
       <w:pPr>
         <w:pStyle w:val="Ttulo3"/>
       </w:pPr>
-      <w:bookmarkStart w:id="44" w:name="_Toc207269127"/>
+      <w:bookmarkStart w:id="45" w:name="_Toc211501374"/>
       <w:r>
         <w:t xml:space="preserve">5.5.4 </w:t>
       </w:r>
       <w:r>
         <w:t>Pre-auth default error message</w:t>
       </w:r>
-      <w:bookmarkEnd w:id="44"/>
+      <w:bookmarkEnd w:id="45"/>
     </w:p>
     <w:p>
       <w:pPr>
@@ -12023,7 +12198,7 @@
                     <pic:cNvPicPr/>
                   </pic:nvPicPr>
                   <pic:blipFill>
-                    <a:blip r:embed="rId48"/>
+                    <a:blip r:embed="rId49"/>
                     <a:stretch>
                       <a:fillRect/>
                     </a:stretch>
@@ -12049,11 +12224,11 @@
       <w:pPr>
         <w:pStyle w:val="Ttulo3"/>
       </w:pPr>
-      <w:bookmarkStart w:id="45" w:name="_Toc207269128"/>
+      <w:bookmarkStart w:id="46" w:name="_Toc211501375"/>
       <w:r>
         <w:t>5.5.6 Digital items</w:t>
       </w:r>
-      <w:bookmarkEnd w:id="45"/>
+      <w:bookmarkEnd w:id="46"/>
     </w:p>
     <w:p/>
     <w:p>
@@ -12117,7 +12292,7 @@
                     <pic:cNvPicPr/>
                   </pic:nvPicPr>
                   <pic:blipFill>
-                    <a:blip r:embed="rId49"/>
+                    <a:blip r:embed="rId50"/>
                     <a:stretch>
                       <a:fillRect/>
                     </a:stretch>
@@ -12142,7 +12317,7 @@
       <w:pPr>
         <w:pStyle w:val="Ttulo3"/>
       </w:pPr>
-      <w:bookmarkStart w:id="46" w:name="_Toc207269129"/>
+      <w:bookmarkStart w:id="47" w:name="_Toc211501376"/>
       <w:r>
         <w:t>5.5.</w:t>
       </w:r>
@@ -12152,7 +12327,7 @@
       <w:r>
         <w:t xml:space="preserve"> Vanity hostnames</w:t>
       </w:r>
-      <w:bookmarkEnd w:id="46"/>
+      <w:bookmarkEnd w:id="47"/>
     </w:p>
     <w:p/>
     <w:p>
@@ -12303,7 +12478,7 @@
                     </pic:cNvPicPr>
                   </pic:nvPicPr>
                   <pic:blipFill>
-                    <a:blip r:embed="rId50">
+                    <a:blip r:embed="rId51">
                       <a:extLst>
                         <a:ext uri="{28A0092B-C50C-407E-A947-70E740481C1C}">
                           <a14:useLocalDpi xmlns:a14="http://schemas.microsoft.com/office/drawing/2010/main" val="0"/>
@@ -12396,7 +12571,7 @@
         </w:rPr>
         <w:t xml:space="preserve"> in </w:t>
       </w:r>
-      <w:hyperlink r:id="rId51" w:history="1">
+      <w:hyperlink r:id="rId52" w:history="1">
         <w:r>
           <w:rPr>
             <w:rStyle w:val="Hyperlink"/>
@@ -12511,11 +12686,11 @@
       <w:pPr>
         <w:pStyle w:val="Ttulo2"/>
       </w:pPr>
-      <w:bookmarkStart w:id="47" w:name="_Toc207269130"/>
+      <w:bookmarkStart w:id="48" w:name="_Toc211501377"/>
       <w:r>
         <w:t>5.6 Updating from V2 to V3</w:t>
       </w:r>
-      <w:bookmarkEnd w:id="47"/>
+      <w:bookmarkEnd w:id="48"/>
     </w:p>
     <w:p/>
     <w:p>
@@ -12674,7 +12849,7 @@
                     <pic:cNvPicPr/>
                   </pic:nvPicPr>
                   <pic:blipFill>
-                    <a:blip r:embed="rId52"/>
+                    <a:blip r:embed="rId53"/>
                     <a:stretch>
                       <a:fillRect/>
                     </a:stretch>
@@ -12911,14 +13086,14 @@
       <w:pPr>
         <w:pStyle w:val="Ttulo2"/>
       </w:pPr>
-      <w:bookmarkStart w:id="48" w:name="_Toc207269131"/>
+      <w:bookmarkStart w:id="49" w:name="_Toc211501378"/>
       <w:r>
         <w:t xml:space="preserve">5.7 </w:t>
       </w:r>
       <w:r>
         <w:t>Logging</w:t>
       </w:r>
-      <w:bookmarkEnd w:id="48"/>
+      <w:bookmarkEnd w:id="49"/>
     </w:p>
     <w:p/>
     <w:p>
@@ -13133,7 +13308,7 @@
                     </pic:cNvPicPr>
                   </pic:nvPicPr>
                   <pic:blipFill>
-                    <a:blip r:embed="rId53">
+                    <a:blip r:embed="rId54">
                       <a:extLst>
                         <a:ext uri="{28A0092B-C50C-407E-A947-70E740481C1C}">
                           <a14:useLocalDpi xmlns:a14="http://schemas.microsoft.com/office/drawing/2010/main" val="0"/>
@@ -13202,7 +13377,7 @@
       <w:pPr>
         <w:pStyle w:val="Ttulo2"/>
       </w:pPr>
-      <w:bookmarkStart w:id="49" w:name="_Toc207269132"/>
+      <w:bookmarkStart w:id="50" w:name="_Toc211501379"/>
       <w:r>
         <w:t>5.</w:t>
       </w:r>
@@ -13212,7 +13387,7 @@
       <w:r>
         <w:t xml:space="preserve"> Configurations on Signifyd Console</w:t>
       </w:r>
-      <w:bookmarkEnd w:id="49"/>
+      <w:bookmarkEnd w:id="50"/>
     </w:p>
     <w:p/>
     <w:p>
@@ -13255,7 +13430,7 @@
         </w:rPr>
         <w:t xml:space="preserve">order creation can be viewed here: </w:t>
       </w:r>
-      <w:hyperlink r:id="rId54" w:history="1">
+      <w:hyperlink r:id="rId55" w:history="1">
         <w:r>
           <w:rPr>
             <w:rStyle w:val="Hyperlink"/>
@@ -13305,7 +13480,7 @@
         </w:rPr>
         <w:t xml:space="preserve"> </w:t>
       </w:r>
-      <w:hyperlink r:id="rId55" w:history="1">
+      <w:hyperlink r:id="rId56" w:history="1">
         <w:r>
           <w:rPr>
             <w:rStyle w:val="Hyperlink"/>
@@ -13353,7 +13528,7 @@
         </w:rPr>
         <w:t xml:space="preserve">webhook should be setup following the instructions on </w:t>
       </w:r>
-      <w:hyperlink r:id="rId56" w:history="1">
+      <w:hyperlink r:id="rId57" w:history="1">
         <w:r>
           <w:rPr>
             <w:rStyle w:val="Hyperlink"/>
@@ -13383,7 +13558,7 @@
         </w:rPr>
         <w:t xml:space="preserve">Webhooks can be set up directly in the console by going to </w:t>
       </w:r>
-      <w:hyperlink r:id="rId57" w:history="1">
+      <w:hyperlink r:id="rId58" w:history="1">
         <w:r>
           <w:rPr>
             <w:rStyle w:val="Hyperlink"/>
@@ -13427,18 +13602,18 @@
       <w:pPr>
         <w:pStyle w:val="Ttulo2"/>
       </w:pPr>
-      <w:bookmarkStart w:id="50" w:name="_Toc207269133"/>
+      <w:bookmarkStart w:id="51" w:name="_Toc211501380"/>
       <w:r>
         <w:t>5.9 Testing</w:t>
       </w:r>
-      <w:bookmarkEnd w:id="50"/>
+      <w:bookmarkEnd w:id="51"/>
     </w:p>
     <w:p/>
     <w:p>
       <w:pPr>
         <w:pStyle w:val="Ttulo3"/>
       </w:pPr>
-      <w:bookmarkStart w:id="51" w:name="_Toc207269134"/>
+      <w:bookmarkStart w:id="52" w:name="_Toc211501381"/>
       <w:r>
         <w:lastRenderedPageBreak/>
         <w:t xml:space="preserve">5.9.1 </w:t>
@@ -13446,7 +13621,7 @@
       <w:r>
         <w:t>Pre-auth flow</w:t>
       </w:r>
-      <w:bookmarkEnd w:id="51"/>
+      <w:bookmarkEnd w:id="52"/>
     </w:p>
     <w:p>
       <w:pPr>
@@ -14395,14 +14570,14 @@
       <w:pPr>
         <w:pStyle w:val="Ttulo3"/>
       </w:pPr>
-      <w:bookmarkStart w:id="52" w:name="_Toc207269135"/>
+      <w:bookmarkStart w:id="53" w:name="_Toc211501382"/>
       <w:r>
         <w:t xml:space="preserve">5.9.2 </w:t>
       </w:r>
       <w:r>
         <w:t>Post-auth flow</w:t>
       </w:r>
-      <w:bookmarkEnd w:id="52"/>
+      <w:bookmarkEnd w:id="53"/>
     </w:p>
     <w:p>
       <w:pPr>
@@ -14822,8 +14997,8 @@
           <w:rFonts w:asciiTheme="minorHAnsi" w:hAnsiTheme="minorHAnsi" w:cstheme="minorHAnsi"/>
         </w:rPr>
       </w:pPr>
-      <w:bookmarkStart w:id="53" w:name="_Toc104994176"/>
-      <w:bookmarkStart w:id="54" w:name="_Toc207269136"/>
+      <w:bookmarkStart w:id="54" w:name="_Toc104994176"/>
+      <w:bookmarkStart w:id="55" w:name="_Toc211501383"/>
       <w:r>
         <w:rPr>
           <w:rFonts w:asciiTheme="minorHAnsi" w:hAnsiTheme="minorHAnsi" w:cstheme="minorHAnsi"/>
@@ -14836,8 +15011,8 @@
         </w:rPr>
         <w:t>Automated Testing</w:t>
       </w:r>
-      <w:bookmarkEnd w:id="53"/>
       <w:bookmarkEnd w:id="54"/>
+      <w:bookmarkEnd w:id="55"/>
     </w:p>
     <w:p/>
     <w:p>
@@ -14858,7 +15033,7 @@
         </w:rPr>
         <w:t>.</w:t>
       </w:r>
-      <w:bookmarkStart w:id="55" w:name="_Toc104994177"/>
+      <w:bookmarkStart w:id="56" w:name="_Toc104994177"/>
     </w:p>
     <w:p>
       <w:pPr>
@@ -14877,7 +15052,7 @@
       <w:r>
         <w:t>Unit testing</w:t>
       </w:r>
-      <w:bookmarkEnd w:id="55"/>
+      <w:bookmarkEnd w:id="56"/>
     </w:p>
     <w:p/>
     <w:p>
@@ -14916,7 +15091,7 @@
         </w:rPr>
         <w:t xml:space="preserve"> run test”, this will test the functionalities within the cartridge source code</w:t>
       </w:r>
-      <w:bookmarkStart w:id="56" w:name="_Toc104994178"/>
+      <w:bookmarkStart w:id="57" w:name="_Toc104994178"/>
       <w:r>
         <w:rPr>
           <w:rFonts w:cstheme="minorHAnsi"/>
@@ -14934,7 +15109,7 @@
       <w:r>
         <w:t>Integration testing</w:t>
       </w:r>
-      <w:bookmarkEnd w:id="56"/>
+      <w:bookmarkEnd w:id="57"/>
     </w:p>
     <w:p>
       <w:pPr>
@@ -15294,7 +15469,7 @@
       <w:pPr>
         <w:pStyle w:val="Ttulo2"/>
       </w:pPr>
-      <w:bookmarkStart w:id="57" w:name="_Toc207269137"/>
+      <w:bookmarkStart w:id="58" w:name="_Toc211501384"/>
       <w:r>
         <w:lastRenderedPageBreak/>
         <w:t>5.10</w:t>
@@ -15302,7 +15477,7 @@
       <w:r>
         <w:t xml:space="preserve"> Troubleshoot</w:t>
       </w:r>
-      <w:bookmarkEnd w:id="57"/>
+      <w:bookmarkEnd w:id="58"/>
     </w:p>
     <w:p/>
     <w:p>
@@ -15312,8 +15487,8 @@
           <w:rFonts w:asciiTheme="minorHAnsi" w:hAnsiTheme="minorHAnsi" w:cstheme="minorHAnsi"/>
         </w:rPr>
       </w:pPr>
-      <w:bookmarkStart w:id="58" w:name="_Toc104994180"/>
-      <w:bookmarkStart w:id="59" w:name="_Toc207269138"/>
+      <w:bookmarkStart w:id="59" w:name="_Toc104994180"/>
+      <w:bookmarkStart w:id="60" w:name="_Toc211501385"/>
       <w:r>
         <w:rPr>
           <w:rFonts w:asciiTheme="minorHAnsi" w:hAnsiTheme="minorHAnsi" w:cstheme="minorHAnsi"/>
@@ -15332,8 +15507,8 @@
         </w:rPr>
         <w:t>Missing API Key</w:t>
       </w:r>
-      <w:bookmarkEnd w:id="58"/>
       <w:bookmarkEnd w:id="59"/>
+      <w:bookmarkEnd w:id="60"/>
     </w:p>
     <w:p>
       <w:pPr>
@@ -15430,8 +15605,8 @@
           <w:rFonts w:asciiTheme="minorHAnsi" w:hAnsiTheme="minorHAnsi" w:cstheme="minorHAnsi"/>
         </w:rPr>
       </w:pPr>
-      <w:bookmarkStart w:id="60" w:name="_Toc104994181"/>
-      <w:bookmarkStart w:id="61" w:name="_Toc207269139"/>
+      <w:bookmarkStart w:id="61" w:name="_Toc104994181"/>
+      <w:bookmarkStart w:id="62" w:name="_Toc211501386"/>
       <w:r>
         <w:rPr>
           <w:rFonts w:asciiTheme="minorHAnsi" w:hAnsiTheme="minorHAnsi" w:cstheme="minorHAnsi"/>
@@ -15444,8 +15619,8 @@
         </w:rPr>
         <w:t>Wrong API Key</w:t>
       </w:r>
-      <w:bookmarkEnd w:id="60"/>
       <w:bookmarkEnd w:id="61"/>
+      <w:bookmarkEnd w:id="62"/>
     </w:p>
     <w:p>
       <w:pPr>
@@ -15536,7 +15711,7 @@
           <w:rFonts w:asciiTheme="minorHAnsi" w:hAnsiTheme="minorHAnsi" w:cstheme="minorHAnsi"/>
         </w:rPr>
       </w:pPr>
-      <w:bookmarkStart w:id="62" w:name="_Toc104994182"/>
+      <w:bookmarkStart w:id="63" w:name="_Toc104994182"/>
     </w:p>
     <w:p>
       <w:pPr>
@@ -15545,7 +15720,7 @@
           <w:rFonts w:asciiTheme="minorHAnsi" w:hAnsiTheme="minorHAnsi" w:cstheme="minorHAnsi"/>
         </w:rPr>
       </w:pPr>
-      <w:bookmarkStart w:id="63" w:name="_Toc207269140"/>
+      <w:bookmarkStart w:id="64" w:name="_Toc211501387"/>
       <w:r>
         <w:rPr>
           <w:rFonts w:asciiTheme="minorHAnsi" w:hAnsiTheme="minorHAnsi" w:cstheme="minorHAnsi"/>
@@ -15558,8 +15733,8 @@
         </w:rPr>
         <w:t>Service not enabled</w:t>
       </w:r>
-      <w:bookmarkEnd w:id="62"/>
       <w:bookmarkEnd w:id="63"/>
+      <w:bookmarkEnd w:id="64"/>
     </w:p>
     <w:p>
       <w:pPr>
@@ -15674,8 +15849,8 @@
           <w:rFonts w:asciiTheme="minorHAnsi" w:hAnsiTheme="minorHAnsi" w:cstheme="minorHAnsi"/>
         </w:rPr>
       </w:pPr>
-      <w:bookmarkStart w:id="64" w:name="_Toc104994183"/>
-      <w:bookmarkStart w:id="65" w:name="_Toc207269141"/>
+      <w:bookmarkStart w:id="65" w:name="_Toc104994183"/>
+      <w:bookmarkStart w:id="66" w:name="_Toc211501388"/>
       <w:r>
         <w:rPr>
           <w:rFonts w:asciiTheme="minorHAnsi" w:hAnsiTheme="minorHAnsi" w:cstheme="minorHAnsi"/>
@@ -15688,8 +15863,8 @@
         </w:rPr>
         <w:t>Order fields not being updated</w:t>
       </w:r>
-      <w:bookmarkEnd w:id="64"/>
       <w:bookmarkEnd w:id="65"/>
+      <w:bookmarkEnd w:id="66"/>
     </w:p>
     <w:p>
       <w:pPr>
@@ -15873,7 +16048,7 @@
           <w:rFonts w:asciiTheme="minorHAnsi" w:hAnsiTheme="minorHAnsi" w:cstheme="minorHAnsi"/>
         </w:rPr>
       </w:pPr>
-      <w:bookmarkStart w:id="66" w:name="_Toc207269142"/>
+      <w:bookmarkStart w:id="67" w:name="_Toc211501389"/>
       <w:r>
         <w:rPr>
           <w:rFonts w:asciiTheme="minorHAnsi" w:hAnsiTheme="minorHAnsi" w:cstheme="minorHAnsi"/>
@@ -15887,7 +16062,7 @@
         </w:rPr>
         <w:t>Webhook Callbacks Are Blocked by SFCC</w:t>
       </w:r>
-      <w:bookmarkEnd w:id="66"/>
+      <w:bookmarkEnd w:id="67"/>
     </w:p>
     <w:p/>
     <w:p>
@@ -16001,17 +16176,17 @@
       <w:pPr>
         <w:pStyle w:val="Ttulo1"/>
       </w:pPr>
-      <w:bookmarkStart w:id="67" w:name="_Toc104994184"/>
-      <w:bookmarkStart w:id="68" w:name="_Toc245264376"/>
-      <w:bookmarkStart w:id="69" w:name="_Toc207269143"/>
+      <w:bookmarkStart w:id="68" w:name="_Toc104994184"/>
+      <w:bookmarkStart w:id="69" w:name="_Toc245264376"/>
+      <w:bookmarkStart w:id="70" w:name="_Toc211501390"/>
       <w:r>
         <w:t xml:space="preserve">6 </w:t>
       </w:r>
       <w:r>
         <w:t>Operations, Maintenance</w:t>
       </w:r>
-      <w:bookmarkEnd w:id="67"/>
-      <w:bookmarkEnd w:id="69"/>
+      <w:bookmarkEnd w:id="68"/>
+      <w:bookmarkEnd w:id="70"/>
     </w:p>
     <w:p>
       <w:pPr>
@@ -16023,16 +16198,16 @@
       <w:pPr>
         <w:pStyle w:val="Ttulo2"/>
       </w:pPr>
-      <w:bookmarkStart w:id="70" w:name="_Toc104994185"/>
-      <w:bookmarkStart w:id="71" w:name="_Toc207269144"/>
+      <w:bookmarkStart w:id="71" w:name="_Toc104994185"/>
+      <w:bookmarkStart w:id="72" w:name="_Toc211501391"/>
       <w:r>
         <w:t xml:space="preserve">6.1 </w:t>
       </w:r>
       <w:r>
         <w:t>Availability</w:t>
       </w:r>
-      <w:bookmarkEnd w:id="70"/>
       <w:bookmarkEnd w:id="71"/>
+      <w:bookmarkEnd w:id="72"/>
     </w:p>
     <w:p>
       <w:pPr>
@@ -16086,16 +16261,16 @@
       <w:pPr>
         <w:pStyle w:val="Ttulo2"/>
       </w:pPr>
-      <w:bookmarkStart w:id="72" w:name="_Toc104994186"/>
-      <w:bookmarkStart w:id="73" w:name="_Toc207269145"/>
+      <w:bookmarkStart w:id="73" w:name="_Toc104994186"/>
+      <w:bookmarkStart w:id="74" w:name="_Toc211501392"/>
       <w:r>
         <w:t xml:space="preserve">6.2 </w:t>
       </w:r>
       <w:r>
         <w:t>Support</w:t>
       </w:r>
-      <w:bookmarkEnd w:id="72"/>
       <w:bookmarkEnd w:id="73"/>
+      <w:bookmarkEnd w:id="74"/>
     </w:p>
     <w:p>
       <w:pPr>
@@ -16124,7 +16299,7 @@
         </w:rPr>
         <w:t xml:space="preserve">For implementation questions or issues please contact your assigned Customer Success Manager. For general support questions or issues </w:t>
       </w:r>
-      <w:hyperlink r:id="rId58" w:history="1">
+      <w:hyperlink r:id="rId59" w:history="1">
         <w:r>
           <w:rPr>
             <w:rStyle w:val="Hyperlink"/>
@@ -16145,22 +16320,22 @@
         </w:rPr>
         <w:t xml:space="preserve">. </w:t>
       </w:r>
-      <w:bookmarkEnd w:id="68"/>
+      <w:bookmarkEnd w:id="69"/>
     </w:p>
     <w:p>
       <w:pPr>
         <w:pStyle w:val="Ttulo2"/>
       </w:pPr>
-      <w:bookmarkStart w:id="74" w:name="_Toc104994187"/>
-      <w:bookmarkStart w:id="75" w:name="_Toc207269146"/>
+      <w:bookmarkStart w:id="75" w:name="_Toc104994187"/>
+      <w:bookmarkStart w:id="76" w:name="_Toc211501393"/>
       <w:r>
         <w:t xml:space="preserve">6.3 </w:t>
       </w:r>
       <w:r>
         <w:t>Intended Locales</w:t>
       </w:r>
-      <w:bookmarkEnd w:id="74"/>
       <w:bookmarkEnd w:id="75"/>
+      <w:bookmarkEnd w:id="76"/>
     </w:p>
     <w:p>
       <w:pPr>
@@ -16347,15 +16522,15 @@
           <w:right w:val="dotted" w:sz="4" w:space="0" w:color="auto"/>
         </w:pBdr>
       </w:pPr>
-      <w:bookmarkStart w:id="76" w:name="_Toc104994188"/>
-      <w:bookmarkStart w:id="77" w:name="_Hlk75794236"/>
-      <w:bookmarkStart w:id="78" w:name="_Toc207269147"/>
+      <w:bookmarkStart w:id="77" w:name="_Toc104994188"/>
+      <w:bookmarkStart w:id="78" w:name="_Hlk75794236"/>
+      <w:bookmarkStart w:id="79" w:name="_Toc211501394"/>
       <w:r>
         <w:lastRenderedPageBreak/>
         <w:t>7 Release History</w:t>
       </w:r>
-      <w:bookmarkEnd w:id="76"/>
-      <w:bookmarkEnd w:id="78"/>
+      <w:bookmarkEnd w:id="77"/>
+      <w:bookmarkEnd w:id="79"/>
     </w:p>
     <w:p>
       <w:pPr>
@@ -16371,9 +16546,9 @@
           <w:szCs w:val="18"/>
         </w:rPr>
       </w:pPr>
-      <w:bookmarkStart w:id="79" w:name="_Toc279703501"/>
-      <w:bookmarkStart w:id="80" w:name="_Toc279703594"/>
-      <w:bookmarkEnd w:id="77"/>
+      <w:bookmarkStart w:id="80" w:name="_Toc279703501"/>
+      <w:bookmarkStart w:id="81" w:name="_Toc279703594"/>
+      <w:bookmarkEnd w:id="78"/>
     </w:p>
     <w:tbl>
       <w:tblPr>
@@ -16961,8 +17136,8 @@
           </w:p>
         </w:tc>
       </w:tr>
-      <w:bookmarkEnd w:id="79"/>
       <w:bookmarkEnd w:id="80"/>
+      <w:bookmarkEnd w:id="81"/>
     </w:tbl>
     <w:p>
       <w:pPr>
@@ -16977,11 +17152,11 @@
       <w:pPr>
         <w:pStyle w:val="Ttulo1"/>
       </w:pPr>
-      <w:bookmarkStart w:id="81" w:name="_Toc207269148"/>
+      <w:bookmarkStart w:id="82" w:name="_Toc211501395"/>
       <w:r>
         <w:t>8 Process Flow Diagrams</w:t>
       </w:r>
-      <w:bookmarkEnd w:id="81"/>
+      <w:bookmarkEnd w:id="82"/>
     </w:p>
     <w:p>
       <w:pPr>
@@ -17014,7 +17189,7 @@
                     </pic:cNvPicPr>
                   </pic:nvPicPr>
                   <pic:blipFill>
-                    <a:blip r:embed="rId59">
+                    <a:blip r:embed="rId60">
                       <a:extLst>
                         <a:ext uri="{28A0092B-C50C-407E-A947-70E740481C1C}">
                           <a14:useLocalDpi xmlns:a14="http://schemas.microsoft.com/office/drawing/2010/main" val="0"/>
@@ -17071,7 +17246,7 @@
                     </pic:cNvPicPr>
                   </pic:nvPicPr>
                   <pic:blipFill>
-                    <a:blip r:embed="rId60">
+                    <a:blip r:embed="rId61">
                       <a:extLst>
                         <a:ext uri="{28A0092B-C50C-407E-A947-70E740481C1C}">
                           <a14:useLocalDpi xmlns:a14="http://schemas.microsoft.com/office/drawing/2010/main" val="0"/>
@@ -17104,11 +17279,11 @@
       </w:r>
     </w:p>
     <w:sectPr>
-      <w:headerReference w:type="even" r:id="rId61"/>
-      <w:headerReference w:type="default" r:id="rId62"/>
-      <w:footerReference w:type="default" r:id="rId63"/>
-      <w:headerReference w:type="first" r:id="rId64"/>
-      <w:footerReference w:type="first" r:id="rId65"/>
+      <w:headerReference w:type="even" r:id="rId62"/>
+      <w:headerReference w:type="default" r:id="rId63"/>
+      <w:footerReference w:type="default" r:id="rId64"/>
+      <w:headerReference w:type="first" r:id="rId65"/>
+      <w:footerReference w:type="first" r:id="rId66"/>
       <w:type w:val="continuous"/>
       <w:pgSz w:w="11906" w:h="16838" w:code="9"/>
       <w:pgMar w:top="1440" w:right="1080" w:bottom="1440" w:left="1080" w:header="720" w:footer="215" w:gutter="0"/>
@@ -21926,7 +22101,6 @@
   <w:style w:type="character" w:default="1" w:styleId="Fontepargpadro">
     <w:name w:val="Default Paragraph Font"/>
     <w:uiPriority w:val="1"/>
-    <w:semiHidden/>
     <w:unhideWhenUsed/>
   </w:style>
   <w:style w:type="table" w:default="1" w:styleId="Tabelanormal">
@@ -24806,14 +24980,6 @@
 </file>
 
 <file path=customXml/item3.xml><?xml version="1.0" encoding="utf-8"?>
-<b:Sources xmlns:b="http://schemas.openxmlformats.org/officeDocument/2006/bibliography" xmlns="http://schemas.openxmlformats.org/officeDocument/2006/bibliography" SelectedStyle="\CHICAGO.XSL" StyleName="Chicago"/>
-</file>
-
-<file path=customXml/item4.xml><?xml version="1.0" encoding="utf-8"?>
-<b:Sources xmlns:b="http://schemas.openxmlformats.org/officeDocument/2006/bibliography" xmlns="http://schemas.openxmlformats.org/officeDocument/2006/bibliography" SelectedStyle="\CHICAGO.XSL" StyleName="Chicago"/>
-</file>
-
-<file path=customXml/item5.xml><?xml version="1.0" encoding="utf-8"?>
 <ct:contentTypeSchema xmlns:ct="http://schemas.microsoft.com/office/2006/metadata/contentType" xmlns:ma="http://schemas.microsoft.com/office/2006/metadata/properties/metaAttributes" ct:_="" ma:_="" ma:contentTypeName="Document" ma:contentTypeID="0x010100BAC6AAE9A7AC6F448B8E6AD308F25C33" ma:contentTypeVersion="9" ma:contentTypeDescription="Create a new document." ma:contentTypeScope="" ma:versionID="9947e9a47e1bfbe6ee25356abc8c556f">
   <xsd:schema xmlns:xsd="http://www.w3.org/2001/XMLSchema" xmlns:xs="http://www.w3.org/2001/XMLSchema" xmlns:p="http://schemas.microsoft.com/office/2006/metadata/properties" xmlns:ns2="41dbd0cf-c47a-4cea-8dfa-c6db00955148" xmlns:ns3="2680ebc2-70e2-42cc-af17-343d078fef82" xmlns:ns4="3ab059b2-6124-4199-bb85-3249ccb31308" targetNamespace="http://schemas.microsoft.com/office/2006/metadata/properties" ma:root="true" ma:fieldsID="784c332b4ff724ef588fa3376e0daf40" ns2:_="" ns3:_="" ns4:_="">
     <xsd:import namespace="41dbd0cf-c47a-4cea-8dfa-c6db00955148"/>
@@ -25011,6 +25177,14 @@
 </ct:contentTypeSchema>
 </file>
 
+<file path=customXml/item4.xml><?xml version="1.0" encoding="utf-8"?>
+<b:Sources xmlns:b="http://schemas.openxmlformats.org/officeDocument/2006/bibliography" xmlns="http://schemas.openxmlformats.org/officeDocument/2006/bibliography" SelectedStyle="\CHICAGO.XSL" StyleName="Chicago"/>
+</file>
+
+<file path=customXml/item5.xml><?xml version="1.0" encoding="utf-8"?>
+<b:Sources xmlns:b="http://schemas.openxmlformats.org/officeDocument/2006/bibliography" xmlns="http://schemas.openxmlformats.org/officeDocument/2006/bibliography" SelectedStyle="\CHICAGO.XSL" StyleName="Chicago"/>
+</file>
+
 <file path=customXml/item6.xml><?xml version="1.0" encoding="utf-8"?>
 <p:properties xmlns:p="http://schemas.microsoft.com/office/2006/metadata/properties" xmlns:xsi="http://www.w3.org/2001/XMLSchema-instance" xmlns:pc="http://schemas.microsoft.com/office/infopath/2007/PartnerControls">
   <documentManagement>
@@ -25030,7 +25204,7 @@
 </file>
 
 <file path=customXml/itemProps1.xml><?xml version="1.0" encoding="utf-8"?>
-<ds:datastoreItem xmlns:ds="http://schemas.openxmlformats.org/officeDocument/2006/customXml" ds:itemID="{0ACC11CF-7E2F-4A39-A1CC-435974F0A74C}">
+<ds:datastoreItem xmlns:ds="http://schemas.openxmlformats.org/officeDocument/2006/customXml" ds:itemID="{DFFD90AB-A9CA-48E9-A772-13C69588A728}">
   <ds:schemaRefs>
     <ds:schemaRef ds:uri="http://schemas.openxmlformats.org/officeDocument/2006/bibliography"/>
   </ds:schemaRefs>
@@ -25046,22 +25220,6 @@
 </file>
 
 <file path=customXml/itemProps3.xml><?xml version="1.0" encoding="utf-8"?>
-<ds:datastoreItem xmlns:ds="http://schemas.openxmlformats.org/officeDocument/2006/customXml" ds:itemID="{74EDC720-C843-4BCC-ACEC-72DB380D8DF2}">
-  <ds:schemaRefs>
-    <ds:schemaRef ds:uri="http://schemas.openxmlformats.org/officeDocument/2006/bibliography"/>
-  </ds:schemaRefs>
-</ds:datastoreItem>
-</file>
-
-<file path=customXml/itemProps4.xml><?xml version="1.0" encoding="utf-8"?>
-<ds:datastoreItem xmlns:ds="http://schemas.openxmlformats.org/officeDocument/2006/customXml" ds:itemID="{05CD6A24-F136-463B-BF16-F15886741A5F}">
-  <ds:schemaRefs>
-    <ds:schemaRef ds:uri="http://schemas.openxmlformats.org/officeDocument/2006/bibliography"/>
-  </ds:schemaRefs>
-</ds:datastoreItem>
-</file>
-
-<file path=customXml/itemProps5.xml><?xml version="1.0" encoding="utf-8"?>
 <ds:datastoreItem xmlns:ds="http://schemas.openxmlformats.org/officeDocument/2006/customXml" ds:itemID="{AB403CD4-F922-4E1D-B3EA-72C1A6D547E2}">
   <ds:schemaRefs>
     <ds:schemaRef ds:uri="http://schemas.microsoft.com/office/2006/metadata/contentType"/>
@@ -25081,6 +25239,22 @@
 </ds:datastoreItem>
 </file>
 
+<file path=customXml/itemProps4.xml><?xml version="1.0" encoding="utf-8"?>
+<ds:datastoreItem xmlns:ds="http://schemas.openxmlformats.org/officeDocument/2006/customXml" ds:itemID="{74EDC720-C843-4BCC-ACEC-72DB380D8DF2}">
+  <ds:schemaRefs>
+    <ds:schemaRef ds:uri="http://schemas.openxmlformats.org/officeDocument/2006/bibliography"/>
+  </ds:schemaRefs>
+</ds:datastoreItem>
+</file>
+
+<file path=customXml/itemProps5.xml><?xml version="1.0" encoding="utf-8"?>
+<ds:datastoreItem xmlns:ds="http://schemas.openxmlformats.org/officeDocument/2006/customXml" ds:itemID="{0ACC11CF-7E2F-4A39-A1CC-435974F0A74C}">
+  <ds:schemaRefs>
+    <ds:schemaRef ds:uri="http://schemas.openxmlformats.org/officeDocument/2006/bibliography"/>
+  </ds:schemaRefs>
+</ds:datastoreItem>
+</file>
+
 <file path=customXml/itemProps6.xml><?xml version="1.0" encoding="utf-8"?>
 <ds:datastoreItem xmlns:ds="http://schemas.openxmlformats.org/officeDocument/2006/customXml" ds:itemID="{D5C50300-BF55-4478-8C35-4D5C35D3EDD0}">
   <ds:schemaRefs>
@@ -25093,7 +25267,7 @@
 </file>
 
 <file path=customXml/itemProps7.xml><?xml version="1.0" encoding="utf-8"?>
-<ds:datastoreItem xmlns:ds="http://schemas.openxmlformats.org/officeDocument/2006/customXml" ds:itemID="{DFFD90AB-A9CA-48E9-A772-13C69588A728}">
+<ds:datastoreItem xmlns:ds="http://schemas.openxmlformats.org/officeDocument/2006/customXml" ds:itemID="{05CD6A24-F136-463B-BF16-F15886741A5F}">
   <ds:schemaRefs>
     <ds:schemaRef ds:uri="http://schemas.openxmlformats.org/officeDocument/2006/bibliography"/>
   </ds:schemaRefs>

</xml_diff>

<commit_message>
SIG-50 - Updated documentation
</commit_message>
<xml_diff>
--- a/link/documentation/Signifyd LINK Integration Documentation 22.1.0.docx
+++ b/link/documentation/Signifyd LINK Integration Documentation 22.1.0.docx
@@ -4620,15 +4620,7 @@
         <w:t xml:space="preserve">references </w:t>
       </w:r>
       <w:r>
-        <w:t xml:space="preserve">are inside the group Signifyd Settings. The preferences are used to control </w:t>
-      </w:r>
-      <w:proofErr w:type="gramStart"/>
-      <w:r>
-        <w:t>the cartridge</w:t>
-      </w:r>
-      <w:proofErr w:type="gramEnd"/>
-      <w:r>
-        <w:t xml:space="preserve"> behavior.</w:t>
+        <w:t>are inside the group Signifyd Settings. The preferences are used to control the cartridge behavior.</w:t>
       </w:r>
     </w:p>
     <w:p>
@@ -5066,6 +5058,15 @@
       <w:r>
         <w:t xml:space="preserve"> This triggers an update to the order in SFCC and could also indicate that the order is ready to export (depending on settings).</w:t>
       </w:r>
+      <w:r>
+        <w:t xml:space="preserve"> In case of failure during the callback function execution that prevents the SFCC order object to be updated (for example an ‘o</w:t>
+      </w:r>
+      <w:r>
+        <w:t>ptimistic locking failure</w:t>
+      </w:r>
+      <w:r>
+        <w:t>’), the cartridge will retry 3 times.</w:t>
+      </w:r>
     </w:p>
     <w:p>
       <w:r>
@@ -5077,13 +5078,8 @@
       <w:r>
         <w:t xml:space="preserve">, </w:t>
       </w:r>
-      <w:proofErr w:type="gramStart"/>
-      <w:r>
-        <w:t>the communication</w:t>
-      </w:r>
-      <w:proofErr w:type="gramEnd"/>
-      <w:r>
-        <w:t xml:space="preserve"> to the client should also be done by the merchant, since the checkout experience on the storefront itself is complete at this stage.</w:t>
+      <w:r>
+        <w:t>the communication to the client should also be done by the merchant, since the checkout experience on the storefront itself is complete at this stage.</w:t>
       </w:r>
     </w:p>
     <w:p/>
@@ -5091,8 +5087,8 @@
       <w:pPr>
         <w:pStyle w:val="Ttulo3"/>
       </w:pPr>
-      <w:bookmarkStart w:id="16" w:name="_Hlk83804264"/>
-      <w:bookmarkStart w:id="17" w:name="_Toc211501347"/>
+      <w:bookmarkStart w:id="16" w:name="_Toc211501347"/>
+      <w:bookmarkStart w:id="17" w:name="_Hlk83804264"/>
       <w:r>
         <w:t>4.1.</w:t>
       </w:r>
@@ -5108,7 +5104,7 @@
       <w:r>
         <w:t>authorization</w:t>
       </w:r>
-      <w:bookmarkEnd w:id="17"/>
+      <w:bookmarkEnd w:id="16"/>
     </w:p>
     <w:p/>
     <w:p>
@@ -5147,7 +5143,7 @@
       <w:r>
         <w:t xml:space="preserve">Signifyd decisions are returned synchronously </w:t>
       </w:r>
-      <w:bookmarkEnd w:id="16"/>
+      <w:bookmarkEnd w:id="17"/>
       <w:r>
         <w:t xml:space="preserve">after the </w:t>
       </w:r>
@@ -5233,6 +5229,7 @@
           <w:b/>
           <w:bCs/>
         </w:rPr>
+        <w:lastRenderedPageBreak/>
         <w:t>Action 1.</w:t>
       </w:r>
       <w:r>
@@ -5279,7 +5276,7 @@
           <w:iCs/>
           <w:color w:val="00000A"/>
         </w:rPr>
-        <w:t xml:space="preserve">If Signifyd returns a declined/rejected response, the </w:t>
+        <w:t>If Signifyd returns a declined/rejected response, the authorization call will not happen, and the order will be failed.</w:t>
       </w:r>
       <w:r>
         <w:rPr>
@@ -5288,8 +5285,7 @@
           <w:iCs/>
           <w:color w:val="00000A"/>
         </w:rPr>
-        <w:lastRenderedPageBreak/>
-        <w:t>authorization call will not happen, and the order will be failed.</w:t>
+        <w:t xml:space="preserve"> The failed order will be in “failed” status in Business Manager, where the merchant can also check the Signifyd order attributes, like the score received and the reason it failed.</w:t>
       </w:r>
       <w:r>
         <w:rPr>
@@ -5298,7 +5294,7 @@
           <w:iCs/>
           <w:color w:val="00000A"/>
         </w:rPr>
-        <w:t xml:space="preserve"> The failed order will be in “failed” status in Business Manager, where the merchant can also check the Signifyd order attributes, like the score received and the reason it failed.</w:t>
+        <w:t xml:space="preserve"> The storefront will display a default error message </w:t>
       </w:r>
       <w:r>
         <w:rPr>
@@ -5307,7 +5303,7 @@
           <w:iCs/>
           <w:color w:val="00000A"/>
         </w:rPr>
-        <w:t xml:space="preserve"> The storefront will display a default error message </w:t>
+        <w:t>to</w:t>
       </w:r>
       <w:r>
         <w:rPr>
@@ -5316,7 +5312,7 @@
           <w:iCs/>
           <w:color w:val="00000A"/>
         </w:rPr>
-        <w:t>to</w:t>
+        <w:t xml:space="preserve"> the customer. If the merchant wants to customize this message, it can be changed directly in the code.</w:t>
       </w:r>
       <w:r>
         <w:rPr>
@@ -5325,7 +5321,7 @@
           <w:iCs/>
           <w:color w:val="00000A"/>
         </w:rPr>
-        <w:t xml:space="preserve"> the customer. If the merchant wants to customize this message, it can be changed directly in the code.</w:t>
+        <w:t xml:space="preserve"> If Signifyd returns an accept/approved response, Salesforce Commerce Cloud proceeds with the </w:t>
       </w:r>
       <w:r>
         <w:rPr>
@@ -5334,7 +5330,7 @@
           <w:iCs/>
           <w:color w:val="00000A"/>
         </w:rPr>
-        <w:t xml:space="preserve"> If Signifyd returns an accept/approved response, Salesforce Commerce Cloud proceeds with the </w:t>
+        <w:t>authorization</w:t>
       </w:r>
       <w:r>
         <w:rPr>
@@ -5343,15 +5339,6 @@
           <w:iCs/>
           <w:color w:val="00000A"/>
         </w:rPr>
-        <w:t>authorization</w:t>
-      </w:r>
-      <w:r>
-        <w:rPr>
-          <w:rFonts w:cs="Trebuchet MS"/>
-          <w:bCs/>
-          <w:iCs/>
-          <w:color w:val="00000A"/>
-        </w:rPr>
         <w:t xml:space="preserve"> process against the payment provider.</w:t>
       </w:r>
     </w:p>
@@ -5498,15 +5485,7 @@
         <w:t xml:space="preserve">When the passive mode is switched off, Signifyd decision will be updated </w:t>
       </w:r>
       <w:r>
-        <w:t xml:space="preserve">on the </w:t>
-      </w:r>
-      <w:proofErr w:type="gramStart"/>
-      <w:r>
-        <w:t>order</w:t>
-      </w:r>
-      <w:proofErr w:type="gramEnd"/>
-      <w:r>
-        <w:t xml:space="preserve"> and the order status will be impacted according to the accept/reject decisions.</w:t>
+        <w:t>on the order and the order status will be impacted according to the accept/reject decisions.</w:t>
       </w:r>
     </w:p>
     <w:p/>
@@ -5679,6 +5658,7 @@
         <w:rPr>
           <w:noProof/>
         </w:rPr>
+        <w:lastRenderedPageBreak/>
         <w:drawing>
           <wp:inline distT="0" distB="0" distL="0" distR="0" wp14:anchorId="7A1BE199" wp14:editId="3AE8E5FB">
             <wp:extent cx="2790525" cy="1936750"/>
@@ -5735,7 +5715,6 @@
       </w:pPr>
       <w:bookmarkStart w:id="22" w:name="_Toc211501351"/>
       <w:r>
-        <w:lastRenderedPageBreak/>
         <w:t>4.1.6 Re</w:t>
       </w:r>
       <w:r>
@@ -5896,7 +5875,11 @@
       </w:r>
       <w:proofErr w:type="spellEnd"/>
       <w:r>
-        <w:t xml:space="preserve"> and if set to true this indicates that the Salesforce Commerce Cloud order is held until the webhook listener is called and indicates that the order is approved. This is accomplished by marking </w:t>
+        <w:t xml:space="preserve"> and if set to true this indicates that the Salesforce Commerce Cloud order is held until the webhook listener is called and indicates that the order </w:t>
+      </w:r>
+      <w:r>
+        <w:lastRenderedPageBreak/>
+        <w:t xml:space="preserve">is approved. This is accomplished by marking </w:t>
       </w:r>
       <w:r>
         <w:t>the order</w:t>
@@ -6026,7 +6009,6 @@
     <w:p/>
     <w:p>
       <w:r>
-        <w:lastRenderedPageBreak/>
         <w:t xml:space="preserve">To use </w:t>
       </w:r>
       <w:proofErr w:type="spellStart"/>
@@ -6825,6 +6807,7 @@
                 <w:sz w:val="20"/>
                 <w:szCs w:val="20"/>
               </w:rPr>
+              <w:lastRenderedPageBreak/>
               <w:t xml:space="preserve">- In case the payment was captured prior to receiving </w:t>
             </w:r>
             <w:proofErr w:type="spellStart"/>
@@ -6868,6 +6851,7 @@
                 <w:sz w:val="20"/>
                 <w:szCs w:val="20"/>
               </w:rPr>
+              <w:lastRenderedPageBreak/>
               <w:t>N/A</w:t>
             </w:r>
           </w:p>
@@ -7005,19 +6989,19 @@
                 <w:sz w:val="20"/>
                 <w:szCs w:val="20"/>
               </w:rPr>
-              <w:t xml:space="preserve"> would need to resubmit </w:t>
-            </w:r>
-            <w:proofErr w:type="gramStart"/>
-            <w:r>
+              <w:t xml:space="preserve"> would need to resubmit order from the console and add additional details related to why this declined order is being resubmitted.</w:t>
+            </w:r>
+          </w:p>
+          <w:p>
+            <w:pPr>
+              <w:cnfStyle w:val="000000000000" w:firstRow="0" w:lastRow="0" w:firstColumn="0" w:lastColumn="0" w:oddVBand="0" w:evenVBand="0" w:oddHBand="0" w:evenHBand="0" w:firstRowFirstColumn="0" w:firstRowLastColumn="0" w:lastRowFirstColumn="0" w:lastRowLastColumn="0"/>
               <w:rPr>
                 <w:rFonts w:cstheme="minorHAnsi"/>
                 <w:color w:val="000000" w:themeColor="text1"/>
                 <w:sz w:val="20"/>
                 <w:szCs w:val="20"/>
               </w:rPr>
-              <w:t>order</w:t>
-            </w:r>
-            <w:proofErr w:type="gramEnd"/>
+            </w:pPr>
             <w:r>
               <w:rPr>
                 <w:rFonts w:cstheme="minorHAnsi"/>
@@ -7025,57 +7009,7 @@
                 <w:sz w:val="20"/>
                 <w:szCs w:val="20"/>
               </w:rPr>
-              <w:t xml:space="preserve"> from the console and add additional details related to why this </w:t>
-            </w:r>
-            <w:proofErr w:type="gramStart"/>
-            <w:r>
-              <w:rPr>
-                <w:rFonts w:cstheme="minorHAnsi"/>
-                <w:color w:val="000000" w:themeColor="text1"/>
-                <w:sz w:val="20"/>
-                <w:szCs w:val="20"/>
-              </w:rPr>
-              <w:t>declined</w:t>
-            </w:r>
-            <w:proofErr w:type="gramEnd"/>
-            <w:r>
-              <w:rPr>
-                <w:rFonts w:cstheme="minorHAnsi"/>
-                <w:color w:val="000000" w:themeColor="text1"/>
-                <w:sz w:val="20"/>
-                <w:szCs w:val="20"/>
-              </w:rPr>
-              <w:t xml:space="preserve"> order is being resubmitted.</w:t>
-            </w:r>
-          </w:p>
-          <w:p>
-            <w:pPr>
-              <w:cnfStyle w:val="000000000000" w:firstRow="0" w:lastRow="0" w:firstColumn="0" w:lastColumn="0" w:oddVBand="0" w:evenVBand="0" w:oddHBand="0" w:evenHBand="0" w:firstRowFirstColumn="0" w:firstRowLastColumn="0" w:lastRowFirstColumn="0" w:lastRowLastColumn="0"/>
-              <w:rPr>
-                <w:rFonts w:cstheme="minorHAnsi"/>
-                <w:color w:val="000000" w:themeColor="text1"/>
-                <w:sz w:val="20"/>
-                <w:szCs w:val="20"/>
-              </w:rPr>
-            </w:pPr>
-            <w:r>
-              <w:rPr>
-                <w:rFonts w:cstheme="minorHAnsi"/>
-                <w:color w:val="000000" w:themeColor="text1"/>
-                <w:sz w:val="20"/>
-                <w:szCs w:val="20"/>
-              </w:rPr>
-              <w:t xml:space="preserve">-  If Signifyd subsequently approves this order post resubmit, then order should be progressed to the OMS for </w:t>
-            </w:r>
-            <w:r>
-              <w:rPr>
-                <w:rFonts w:cstheme="minorHAnsi"/>
-                <w:color w:val="000000" w:themeColor="text1"/>
-                <w:sz w:val="20"/>
-                <w:szCs w:val="20"/>
-              </w:rPr>
-              <w:lastRenderedPageBreak/>
-              <w:t>fulfillment (this would happen automatically via webhooks)</w:t>
+              <w:t>-  If Signifyd subsequently approves this order post resubmit, then order should be progressed to the OMS for fulfillment (this would happen automatically via webhooks)</w:t>
             </w:r>
           </w:p>
           <w:p>
@@ -7208,7 +7142,6 @@
         <w:t>“</w:t>
       </w:r>
       <w:proofErr w:type="spellStart"/>
-      <w:proofErr w:type="gramStart"/>
       <w:r>
         <w:t>caseId</w:t>
       </w:r>
@@ -7217,11 +7150,7 @@
         <w:t>”</w:t>
       </w:r>
       <w:r>
-        <w:t>=</w:t>
-      </w:r>
-      <w:proofErr w:type="gramEnd"/>
-      <w:r>
-        <w:t xml:space="preserve"> </w:t>
+        <w:t xml:space="preserve">= </w:t>
       </w:r>
       <w:r>
         <w:t>“</w:t>
@@ -7322,39 +7251,7 @@
           <w:b/>
           <w:bCs/>
         </w:rPr>
-        <w:t xml:space="preserve">Merchant Tools </w:t>
-      </w:r>
-      <w:proofErr w:type="gramStart"/>
-      <w:r>
-        <w:rPr>
-          <w:b/>
-          <w:bCs/>
-        </w:rPr>
-        <w:t>&gt;  Ordering</w:t>
-      </w:r>
-      <w:proofErr w:type="gramEnd"/>
-      <w:r>
-        <w:rPr>
-          <w:b/>
-          <w:bCs/>
-        </w:rPr>
-        <w:t xml:space="preserve"> </w:t>
-      </w:r>
-      <w:proofErr w:type="gramStart"/>
-      <w:r>
-        <w:rPr>
-          <w:b/>
-          <w:bCs/>
-        </w:rPr>
-        <w:t>&gt;  Payment</w:t>
-      </w:r>
-      <w:proofErr w:type="gramEnd"/>
-      <w:r>
-        <w:rPr>
-          <w:b/>
-          <w:bCs/>
-        </w:rPr>
-        <w:t xml:space="preserve"> Methods</w:t>
+        <w:t>Merchant Tools &gt;  Ordering &gt;  Payment Methods</w:t>
       </w:r>
       <w:r>
         <w:t>.</w:t>
@@ -7539,17 +7436,7 @@
       </w:pPr>
       <w:bookmarkStart w:id="28" w:name="_Toc211501357"/>
       <w:r>
-        <w:lastRenderedPageBreak/>
-        <w:t>4.1.1</w:t>
-      </w:r>
-      <w:r>
-        <w:t>1</w:t>
-      </w:r>
-      <w:r>
-        <w:t xml:space="preserve"> </w:t>
-      </w:r>
-      <w:r>
-        <w:t>Order notes</w:t>
+        <w:t>4.1.11 Order notes</w:t>
       </w:r>
       <w:bookmarkEnd w:id="28"/>
     </w:p>
@@ -7773,21 +7660,7 @@
         <w:rPr>
           <w:rFonts w:cstheme="minorHAnsi"/>
         </w:rPr>
-        <w:t xml:space="preserve">anager </w:t>
-      </w:r>
-      <w:proofErr w:type="gramStart"/>
-      <w:r>
-        <w:rPr>
-          <w:rFonts w:cstheme="minorHAnsi"/>
-        </w:rPr>
-        <w:t>into</w:t>
-      </w:r>
-      <w:proofErr w:type="gramEnd"/>
-      <w:r>
-        <w:rPr>
-          <w:rFonts w:cstheme="minorHAnsi"/>
-        </w:rPr>
-        <w:t xml:space="preserve"> your site:</w:t>
+        <w:t>anager into your site:</w:t>
       </w:r>
       <w:r>
         <w:rPr>
@@ -7887,6 +7760,7 @@
           <w:sz w:val="24"/>
           <w:szCs w:val="24"/>
         </w:rPr>
+        <w:lastRenderedPageBreak/>
         <w:drawing>
           <wp:inline distT="0" distB="0" distL="0" distR="0" wp14:anchorId="66F81BE5" wp14:editId="3391D529">
             <wp:extent cx="5991225" cy="2781300"/>
@@ -7987,7 +7861,6 @@
           <w:sz w:val="24"/>
           <w:szCs w:val="24"/>
         </w:rPr>
-        <w:lastRenderedPageBreak/>
         <w:drawing>
           <wp:inline distT="0" distB="0" distL="0" distR="0" wp14:anchorId="463D53B3" wp14:editId="39C0C6C1">
             <wp:extent cx="4135522" cy="1067231"/>
@@ -8209,6 +8082,7 @@
           <w:sz w:val="24"/>
           <w:szCs w:val="24"/>
         </w:rPr>
+        <w:lastRenderedPageBreak/>
         <w:drawing>
           <wp:inline distT="0" distB="0" distL="0" distR="0" wp14:anchorId="6345FB73" wp14:editId="0ECC5F5E">
             <wp:extent cx="6188710" cy="1596390"/>
@@ -8300,7 +8174,6 @@
           <w:sz w:val="24"/>
           <w:szCs w:val="24"/>
         </w:rPr>
-        <w:lastRenderedPageBreak/>
         <w:drawing>
           <wp:inline distT="0" distB="0" distL="0" distR="0" wp14:anchorId="6A804093" wp14:editId="0B1B1492">
             <wp:extent cx="6188710" cy="1637030"/>
@@ -8493,6 +8366,7 @@
         <w:rPr>
           <w:rFonts w:cstheme="minorHAnsi"/>
         </w:rPr>
+        <w:lastRenderedPageBreak/>
         <w:t xml:space="preserve">In Business Manager go to Administration-&gt;Operations-&gt;Import Export and select ‘upload’ then browse to the </w:t>
       </w:r>
       <w:r>
@@ -8538,7 +8412,6 @@
           <w:sz w:val="24"/>
           <w:szCs w:val="24"/>
         </w:rPr>
-        <w:lastRenderedPageBreak/>
         <w:drawing>
           <wp:inline distT="0" distB="0" distL="0" distR="0" wp14:anchorId="6613D0E5" wp14:editId="09F633E3">
             <wp:extent cx="3886200" cy="3495675"/>
@@ -8761,6 +8634,7 @@
         <w:rPr>
           <w:rFonts w:cstheme="minorHAnsi"/>
         </w:rPr>
+        <w:lastRenderedPageBreak/>
         <w:t>In Business Manager</w:t>
       </w:r>
       <w:r>
@@ -8809,7 +8683,6 @@
           <w:sz w:val="24"/>
           <w:szCs w:val="24"/>
         </w:rPr>
-        <w:lastRenderedPageBreak/>
         <w:drawing>
           <wp:inline distT="0" distB="0" distL="0" distR="0" wp14:anchorId="6D6F8005" wp14:editId="22A519FB">
             <wp:extent cx="3886200" cy="3495675"/>
@@ -9110,6 +8983,7 @@
       </w:pPr>
       <w:bookmarkStart w:id="35" w:name="_Toc211501364"/>
       <w:r>
+        <w:lastRenderedPageBreak/>
         <w:t xml:space="preserve">5.2.1 </w:t>
       </w:r>
       <w:r>
@@ -9152,7 +9026,6 @@
           <w:bCs/>
           <w:color w:val="00000A"/>
         </w:rPr>
-        <w:lastRenderedPageBreak/>
         <w:t xml:space="preserve">Script: </w:t>
       </w:r>
       <w:r>
@@ -9225,7 +9098,6 @@
         <w:t xml:space="preserve">Function </w:t>
       </w:r>
       <w:proofErr w:type="spellStart"/>
-      <w:proofErr w:type="gramStart"/>
       <w:r>
         <w:rPr>
           <w:rFonts w:cstheme="minorHAnsi"/>
@@ -9243,17 +9115,7 @@
           <w:bCs/>
           <w:color w:val="00000A"/>
         </w:rPr>
-        <w:t>(</w:t>
-      </w:r>
-      <w:proofErr w:type="gramEnd"/>
-      <w:r>
-        <w:rPr>
-          <w:rFonts w:cstheme="minorHAnsi"/>
-          <w:b/>
-          <w:bCs/>
-          <w:color w:val="00000A"/>
-        </w:rPr>
-        <w:t>)</w:t>
+        <w:t>()</w:t>
       </w:r>
       <w:r>
         <w:rPr>
@@ -9453,7 +9315,6 @@
         <w:t xml:space="preserve">, then the order export status will be set to Ready For Export as in the default </w:t>
       </w:r>
       <w:proofErr w:type="spellStart"/>
-      <w:proofErr w:type="gramStart"/>
       <w:r>
         <w:rPr>
           <w:rFonts w:cstheme="minorHAnsi"/>
@@ -9471,17 +9332,7 @@
           <w:bCs/>
           <w:color w:val="00000A"/>
         </w:rPr>
-        <w:t>(</w:t>
-      </w:r>
-      <w:proofErr w:type="gramEnd"/>
-      <w:r>
-        <w:rPr>
-          <w:rFonts w:cstheme="minorHAnsi"/>
-          <w:b/>
-          <w:bCs/>
-          <w:color w:val="00000A"/>
-        </w:rPr>
-        <w:t xml:space="preserve">) </w:t>
+        <w:t xml:space="preserve">() </w:t>
       </w:r>
       <w:r>
         <w:rPr>
@@ -9630,7 +9481,6 @@
         <w:t xml:space="preserve">contains code to override the SFRA default function </w:t>
       </w:r>
       <w:proofErr w:type="spellStart"/>
-      <w:proofErr w:type="gramStart"/>
       <w:r>
         <w:rPr>
           <w:rFonts w:cstheme="minorHAnsi"/>
@@ -9648,17 +9498,7 @@
           <w:bCs/>
           <w:color w:val="00000A"/>
         </w:rPr>
-        <w:t>(</w:t>
-      </w:r>
-      <w:proofErr w:type="gramEnd"/>
-      <w:r>
-        <w:rPr>
-          <w:rFonts w:cstheme="minorHAnsi"/>
-          <w:b/>
-          <w:bCs/>
-          <w:color w:val="00000A"/>
-        </w:rPr>
-        <w:t>)</w:t>
+        <w:t>()</w:t>
       </w:r>
       <w:r>
         <w:rPr>
@@ -9740,19 +9580,8 @@
           <w:bCs/>
           <w:color w:val="00000A"/>
         </w:rPr>
-        <w:t>{merchant_customized_</w:t>
-      </w:r>
-      <w:proofErr w:type="gramStart"/>
-      <w:r>
-        <w:rPr>
-          <w:rFonts w:cstheme="minorHAnsi"/>
-          <w:b/>
-          <w:bCs/>
-          <w:color w:val="00000A"/>
-        </w:rPr>
-        <w:t>cartridge}/cartridge/scripts/checkout/checkoutHelpers.js</w:t>
-      </w:r>
-      <w:proofErr w:type="gramEnd"/>
+        <w:t>{merchant_customized_cartridge}/cartridge/scripts/checkout/checkoutHelpers.js</w:t>
+      </w:r>
     </w:p>
     <w:p>
       <w:pPr>
@@ -10020,6 +9849,7 @@
           <w:rFonts w:eastAsia="Times New Roman" w:cstheme="minorHAnsi"/>
           <w:color w:val="4F81BD" w:themeColor="accent1"/>
         </w:rPr>
+        <w:lastRenderedPageBreak/>
         <w:t>var Signifyd = require('int_signifyd/cartridge/scripts/service/</w:t>
       </w:r>
       <w:proofErr w:type="spellStart"/>
@@ -10082,17 +9912,8 @@
           <w:rFonts w:eastAsia="Times New Roman" w:cstheme="minorHAnsi"/>
           <w:color w:val="4F81BD" w:themeColor="accent1"/>
         </w:rPr>
-        <w:t>(</w:t>
-      </w:r>
-      <w:proofErr w:type="gramStart"/>
-      <w:r>
-        <w:rPr>
-          <w:rFonts w:eastAsia="Times New Roman" w:cstheme="minorHAnsi"/>
-          <w:color w:val="4F81BD" w:themeColor="accent1"/>
-        </w:rPr>
-        <w:t>);</w:t>
-      </w:r>
-      <w:proofErr w:type="gramEnd"/>
+        <w:t>();</w:t>
+      </w:r>
     </w:p>
     <w:p>
       <w:pPr>
@@ -10109,7 +9930,6 @@
         <w:rPr>
           <w:rFonts w:cstheme="minorHAnsi"/>
         </w:rPr>
-        <w:lastRenderedPageBreak/>
         <w:t>Add those two rows near the end of the same function method:</w:t>
       </w:r>
     </w:p>
@@ -10163,7 +9983,6 @@
         <w:t>orderSessionID</w:t>
       </w:r>
       <w:proofErr w:type="spellEnd"/>
-      <w:proofErr w:type="gramStart"/>
       <w:r>
         <w:rPr>
           <w:rFonts w:eastAsia="Times New Roman" w:cstheme="minorHAnsi"/>
@@ -10171,7 +9990,6 @@
         </w:rPr>
         <w:t>);</w:t>
       </w:r>
-      <w:proofErr w:type="gramEnd"/>
     </w:p>
     <w:p>
       <w:pPr>
@@ -10207,7 +10025,6 @@
         <w:t>placeOrderResult.Order</w:t>
       </w:r>
       <w:proofErr w:type="spellEnd"/>
-      <w:proofErr w:type="gramStart"/>
       <w:r>
         <w:rPr>
           <w:rFonts w:eastAsia="Times New Roman" w:cstheme="minorHAnsi"/>
@@ -10215,7 +10032,6 @@
         </w:rPr>
         <w:t>);</w:t>
       </w:r>
-      <w:proofErr w:type="gramEnd"/>
     </w:p>
     <w:p>
       <w:pPr>
@@ -10335,34 +10151,14 @@
         </w:rPr>
         <w:br/>
       </w:r>
-      <w:proofErr w:type="gramStart"/>
       <w:r>
         <w:rPr>
           <w:rFonts w:cstheme="minorHAnsi"/>
           <w:b/>
           <w:color w:val="4F81BD" w:themeColor="accent1"/>
         </w:rPr>
-        <w:t>….&lt;</w:t>
-      </w:r>
-      <w:proofErr w:type="gramEnd"/>
-      <w:r>
-        <w:rPr>
-          <w:rFonts w:cstheme="minorHAnsi"/>
-          <w:b/>
-          <w:color w:val="4F81BD" w:themeColor="accent1"/>
-        </w:rPr>
-        <w:t>Insert code here&gt;</w:t>
-      </w:r>
-      <w:proofErr w:type="gramStart"/>
-      <w:r>
-        <w:rPr>
-          <w:rFonts w:cstheme="minorHAnsi"/>
-          <w:b/>
-          <w:color w:val="4F81BD" w:themeColor="accent1"/>
-        </w:rPr>
-        <w:t>…..</w:t>
-      </w:r>
-      <w:proofErr w:type="gramEnd"/>
+        <w:t>….&lt;Insert code here&gt;…..</w:t>
+      </w:r>
       <w:r>
         <w:rPr>
           <w:rFonts w:cstheme="minorHAnsi"/>
@@ -10640,39 +10436,7 @@
           <w:rFonts w:cstheme="minorHAnsi"/>
           <w:color w:val="4F81BD" w:themeColor="accent1"/>
         </w:rPr>
-        <w:t xml:space="preserve"> condition="${</w:t>
-      </w:r>
-      <w:proofErr w:type="gramStart"/>
-      <w:r>
-        <w:rPr>
-          <w:rFonts w:cstheme="minorHAnsi"/>
-          <w:color w:val="4F81BD" w:themeColor="accent1"/>
-        </w:rPr>
-        <w:t>dw.system</w:t>
-      </w:r>
-      <w:proofErr w:type="gramEnd"/>
-      <w:r>
-        <w:rPr>
-          <w:rFonts w:cstheme="minorHAnsi"/>
-          <w:color w:val="4F81BD" w:themeColor="accent1"/>
-        </w:rPr>
-        <w:t>.Site.getCurrent(</w:t>
-      </w:r>
-      <w:proofErr w:type="gramStart"/>
-      <w:r>
-        <w:rPr>
-          <w:rFonts w:cstheme="minorHAnsi"/>
-          <w:color w:val="4F81BD" w:themeColor="accent1"/>
-        </w:rPr>
-        <w:t>).getCustomPreferenceValue</w:t>
-      </w:r>
-      <w:proofErr w:type="gramEnd"/>
-      <w:r>
-        <w:rPr>
-          <w:rFonts w:cstheme="minorHAnsi"/>
-          <w:color w:val="4F81BD" w:themeColor="accent1"/>
-        </w:rPr>
-        <w:t>('SignifydEnableCartridge')}"&gt;</w:t>
+        <w:t xml:space="preserve"> condition="${dw.system.Site.getCurrent().getCustomPreferenceValue('SignifydEnableCartridge')}"&gt;</w:t>
       </w:r>
       <w:r>
         <w:rPr>
@@ -10749,6 +10513,7 @@
         <w:rPr>
           <w:rFonts w:cstheme="minorHAnsi"/>
         </w:rPr>
+        <w:lastRenderedPageBreak/>
         <w:t>The result should look like the following:</w:t>
       </w:r>
     </w:p>
@@ -10763,7 +10528,6 @@
           <w:rFonts w:cstheme="minorHAnsi"/>
           <w:noProof/>
         </w:rPr>
-        <w:lastRenderedPageBreak/>
         <w:drawing>
           <wp:inline distT="0" distB="0" distL="0" distR="0" wp14:anchorId="34456EF4" wp14:editId="43FBEBC4">
             <wp:extent cx="6181725" cy="1457325"/>
@@ -11345,7 +11109,6 @@
         <w:t xml:space="preserve"> for valid response codes. AVS and CVV values should be updated by the merchant for </w:t>
       </w:r>
       <w:proofErr w:type="spellStart"/>
-      <w:proofErr w:type="gramStart"/>
       <w:r>
         <w:rPr>
           <w:rFonts w:cstheme="minorHAnsi"/>
@@ -11359,56 +11122,23 @@
           <w:rFonts w:cstheme="minorHAnsi"/>
           <w:color w:val="00000A"/>
         </w:rPr>
-        <w:t>(</w:t>
-      </w:r>
-      <w:proofErr w:type="gramEnd"/>
+        <w:t xml:space="preserve">() (in case of Pre-auth enabled) and </w:t>
+      </w:r>
+      <w:proofErr w:type="spellStart"/>
       <w:r>
         <w:rPr>
           <w:rFonts w:cstheme="minorHAnsi"/>
           <w:color w:val="00000A"/>
         </w:rPr>
-        <w:t xml:space="preserve">) (in </w:t>
-      </w:r>
-      <w:proofErr w:type="gramStart"/>
+        <w:t>getParams</w:t>
+      </w:r>
+      <w:proofErr w:type="spellEnd"/>
       <w:r>
         <w:rPr>
           <w:rFonts w:cstheme="minorHAnsi"/>
           <w:color w:val="00000A"/>
         </w:rPr>
-        <w:t>case of</w:t>
-      </w:r>
-      <w:proofErr w:type="gramEnd"/>
-      <w:r>
-        <w:rPr>
-          <w:rFonts w:cstheme="minorHAnsi"/>
-          <w:color w:val="00000A"/>
-        </w:rPr>
-        <w:t xml:space="preserve"> Pre-auth enabled) and </w:t>
-      </w:r>
-      <w:proofErr w:type="spellStart"/>
-      <w:proofErr w:type="gramStart"/>
-      <w:r>
-        <w:rPr>
-          <w:rFonts w:cstheme="minorHAnsi"/>
-          <w:color w:val="00000A"/>
-        </w:rPr>
-        <w:t>getParams</w:t>
-      </w:r>
-      <w:proofErr w:type="spellEnd"/>
-      <w:r>
-        <w:rPr>
-          <w:rFonts w:cstheme="minorHAnsi"/>
-          <w:color w:val="00000A"/>
-        </w:rPr>
-        <w:t>(</w:t>
-      </w:r>
-      <w:proofErr w:type="gramEnd"/>
-      <w:r>
-        <w:rPr>
-          <w:rFonts w:cstheme="minorHAnsi"/>
-          <w:color w:val="00000A"/>
-        </w:rPr>
-        <w:t>) (in case Post-auth enabled) functions on signifyd.js file.</w:t>
+        <w:t>() (in case Post-auth enabled) functions on signifyd.js file.</w:t>
       </w:r>
     </w:p>
     <w:p>
@@ -11440,7 +11170,6 @@
         </w:rPr>
       </w:pPr>
       <w:proofErr w:type="spellStart"/>
-      <w:proofErr w:type="gramStart"/>
       <w:r>
         <w:rPr>
           <w:rFonts w:cstheme="minorHAnsi"/>
@@ -11458,17 +11187,7 @@
           <w:bCs/>
           <w:color w:val="00000A"/>
         </w:rPr>
-        <w:t>(</w:t>
-      </w:r>
-      <w:proofErr w:type="gramEnd"/>
-      <w:r>
-        <w:rPr>
-          <w:rFonts w:cstheme="minorHAnsi"/>
-          <w:b/>
-          <w:bCs/>
-          <w:color w:val="00000A"/>
-        </w:rPr>
-        <w:t>)</w:t>
+        <w:t>()</w:t>
       </w:r>
     </w:p>
     <w:p>
@@ -11560,7 +11279,6 @@
         </w:rPr>
       </w:pPr>
       <w:proofErr w:type="spellStart"/>
-      <w:proofErr w:type="gramStart"/>
       <w:r>
         <w:rPr>
           <w:rFonts w:cstheme="minorHAnsi"/>
@@ -11579,17 +11297,7 @@
           <w:bCs/>
           <w:color w:val="00000A"/>
         </w:rPr>
-        <w:t>(</w:t>
-      </w:r>
-      <w:proofErr w:type="gramEnd"/>
-      <w:r>
-        <w:rPr>
-          <w:rFonts w:cstheme="minorHAnsi"/>
-          <w:b/>
-          <w:bCs/>
-          <w:color w:val="00000A"/>
-        </w:rPr>
-        <w:t>)</w:t>
+        <w:t>()</w:t>
       </w:r>
     </w:p>
     <w:p>
@@ -11738,7 +11446,6 @@
         <w:t xml:space="preserve">Order channel information should be updated by the merchant in the </w:t>
       </w:r>
       <w:proofErr w:type="spellStart"/>
-      <w:proofErr w:type="gramStart"/>
       <w:r>
         <w:rPr>
           <w:rFonts w:cstheme="minorHAnsi"/>
@@ -11756,17 +11463,7 @@
           <w:bCs/>
           <w:color w:val="00000A"/>
         </w:rPr>
-        <w:t>(</w:t>
-      </w:r>
-      <w:proofErr w:type="gramEnd"/>
-      <w:r>
-        <w:rPr>
-          <w:rFonts w:cstheme="minorHAnsi"/>
-          <w:b/>
-          <w:bCs/>
-          <w:color w:val="00000A"/>
-        </w:rPr>
-        <w:t>)</w:t>
+        <w:t>()</w:t>
       </w:r>
       <w:r>
         <w:rPr>
@@ -12233,15 +11930,7 @@
     <w:p/>
     <w:p>
       <w:r>
-        <w:t xml:space="preserve">If the merchant is selling digital items, </w:t>
-      </w:r>
-      <w:proofErr w:type="gramStart"/>
-      <w:r>
-        <w:t>the</w:t>
-      </w:r>
-      <w:proofErr w:type="gramEnd"/>
-      <w:r>
-        <w:t xml:space="preserve"> </w:t>
+        <w:t xml:space="preserve">If the merchant is selling digital items, the </w:t>
       </w:r>
       <w:r>
         <w:rPr>
@@ -12256,11 +11945,9 @@
       <w:r>
         <w:t xml:space="preserve">inside the </w:t>
       </w:r>
-      <w:proofErr w:type="gramStart"/>
       <w:r>
         <w:t>purchase.products</w:t>
       </w:r>
-      <w:proofErr w:type="gramEnd"/>
       <w:r>
         <w:t xml:space="preserve"> object should be updated to true. By default, the value is </w:t>
       </w:r>
@@ -12636,7 +12323,6 @@
         </w:rPr>
         <w:t xml:space="preserve">unless the merchant needs </w:t>
       </w:r>
-      <w:proofErr w:type="gramStart"/>
       <w:r>
         <w:rPr>
           <w:rFonts w:cs="Trebuchet MS"/>
@@ -12657,7 +12343,6 @@
         <w:t>Signifyd's</w:t>
       </w:r>
       <w:proofErr w:type="spellEnd"/>
-      <w:proofErr w:type="gramEnd"/>
       <w:r>
         <w:rPr>
           <w:rFonts w:cs="Trebuchet MS"/>
@@ -12984,7 +12669,6 @@
         </w:rPr>
       </w:pPr>
       <w:proofErr w:type="spellStart"/>
-      <w:proofErr w:type="gramStart"/>
       <w:r>
         <w:rPr>
           <w:rFonts w:cs="Trebuchet MS"/>
@@ -12993,7 +12677,6 @@
         <w:t>SignifydSale</w:t>
       </w:r>
       <w:proofErr w:type="spellEnd"/>
-      <w:proofErr w:type="gramEnd"/>
       <w:r>
         <w:rPr>
           <w:rFonts w:cs="Trebuchet MS"/>
@@ -13796,15 +13479,7 @@
       </w:r>
       <w:proofErr w:type="spellEnd"/>
       <w:r>
-        <w:t xml:space="preserve"> are saved on the </w:t>
-      </w:r>
-      <w:proofErr w:type="gramStart"/>
-      <w:r>
-        <w:t>order</w:t>
-      </w:r>
-      <w:proofErr w:type="gramEnd"/>
-      <w:r>
-        <w:t xml:space="preserve"> and the order proceeds to authorization.</w:t>
+        <w:t xml:space="preserve"> are saved on the order and the order proceeds to authorization.</w:t>
       </w:r>
     </w:p>
     <w:p>
@@ -15142,21 +14817,7 @@
         <w:rPr>
           <w:rFonts w:cstheme="minorHAnsi"/>
         </w:rPr>
-        <w:t xml:space="preserve"> file on the </w:t>
-      </w:r>
-      <w:proofErr w:type="gramStart"/>
-      <w:r>
-        <w:rPr>
-          <w:rFonts w:cstheme="minorHAnsi"/>
-        </w:rPr>
-        <w:t>navigate</w:t>
-      </w:r>
-      <w:proofErr w:type="gramEnd"/>
-      <w:r>
-        <w:rPr>
-          <w:rFonts w:cstheme="minorHAnsi"/>
-        </w:rPr>
-        <w:t xml:space="preserve"> to the folder above the cartridges</w:t>
+        <w:t xml:space="preserve"> file on the navigate to the folder above the cartridges</w:t>
       </w:r>
     </w:p>
     <w:p>
@@ -15188,49 +14849,131 @@
           <w:rFonts w:asciiTheme="minorHAnsi" w:hAnsiTheme="minorHAnsi" w:cstheme="minorHAnsi"/>
           <w:color w:val="9876AA"/>
         </w:rPr>
-        <w:t>"hostname</w:t>
-      </w:r>
-      <w:proofErr w:type="gramStart"/>
+        <w:t xml:space="preserve">"hostname"  </w:t>
+      </w:r>
+      <w:r>
+        <w:rPr>
+          <w:rFonts w:asciiTheme="minorHAnsi" w:hAnsiTheme="minorHAnsi" w:cstheme="minorHAnsi"/>
+          <w:color w:val="CC7832"/>
+        </w:rPr>
+        <w:t xml:space="preserve">: </w:t>
+      </w:r>
+      <w:r>
+        <w:rPr>
+          <w:rFonts w:asciiTheme="minorHAnsi" w:hAnsiTheme="minorHAnsi" w:cstheme="minorHAnsi"/>
+        </w:rPr>
+        <w:t>"somesb.demandware.net"</w:t>
+      </w:r>
+      <w:r>
+        <w:rPr>
+          <w:rFonts w:asciiTheme="minorHAnsi" w:hAnsiTheme="minorHAnsi" w:cstheme="minorHAnsi"/>
+          <w:color w:val="CC7832"/>
+        </w:rPr>
+        <w:t>,</w:t>
+      </w:r>
+      <w:r>
+        <w:rPr>
+          <w:rFonts w:asciiTheme="minorHAnsi" w:hAnsiTheme="minorHAnsi" w:cstheme="minorHAnsi"/>
+          <w:color w:val="CC7832"/>
+        </w:rPr>
+        <w:br/>
+        <w:t xml:space="preserve">    </w:t>
+      </w:r>
       <w:r>
         <w:rPr>
           <w:rFonts w:asciiTheme="minorHAnsi" w:hAnsiTheme="minorHAnsi" w:cstheme="minorHAnsi"/>
           <w:color w:val="9876AA"/>
         </w:rPr>
-        <w:t xml:space="preserve">"  </w:t>
+        <w:t xml:space="preserve">"username"  </w:t>
       </w:r>
       <w:r>
         <w:rPr>
           <w:rFonts w:asciiTheme="minorHAnsi" w:hAnsiTheme="minorHAnsi" w:cstheme="minorHAnsi"/>
           <w:color w:val="CC7832"/>
         </w:rPr>
-        <w:t>:</w:t>
-      </w:r>
-      <w:proofErr w:type="gramEnd"/>
+        <w:t xml:space="preserve">: </w:t>
+      </w:r>
+      <w:r>
+        <w:rPr>
+          <w:rFonts w:asciiTheme="minorHAnsi" w:hAnsiTheme="minorHAnsi" w:cstheme="minorHAnsi"/>
+        </w:rPr>
+        <w:t>"</w:t>
+      </w:r>
+      <w:proofErr w:type="spellStart"/>
+      <w:r>
+        <w:rPr>
+          <w:rFonts w:asciiTheme="minorHAnsi" w:hAnsiTheme="minorHAnsi" w:cstheme="minorHAnsi"/>
+        </w:rPr>
+        <w:t>someUser</w:t>
+      </w:r>
+      <w:proofErr w:type="spellEnd"/>
+      <w:r>
+        <w:rPr>
+          <w:rFonts w:asciiTheme="minorHAnsi" w:hAnsiTheme="minorHAnsi" w:cstheme="minorHAnsi"/>
+        </w:rPr>
+        <w:t>"</w:t>
+      </w:r>
       <w:r>
         <w:rPr>
           <w:rFonts w:asciiTheme="minorHAnsi" w:hAnsiTheme="minorHAnsi" w:cstheme="minorHAnsi"/>
           <w:color w:val="CC7832"/>
         </w:rPr>
-        <w:t xml:space="preserve"> </w:t>
-      </w:r>
-      <w:r>
-        <w:rPr>
-          <w:rFonts w:asciiTheme="minorHAnsi" w:hAnsiTheme="minorHAnsi" w:cstheme="minorHAnsi"/>
-        </w:rPr>
-        <w:t>"somesb.demandware.net"</w:t>
+        <w:t>,</w:t>
       </w:r>
       <w:r>
         <w:rPr>
           <w:rFonts w:asciiTheme="minorHAnsi" w:hAnsiTheme="minorHAnsi" w:cstheme="minorHAnsi"/>
           <w:color w:val="CC7832"/>
         </w:rPr>
-        <w:t>,</w:t>
+        <w:br/>
+        <w:t xml:space="preserve">    </w:t>
+      </w:r>
+      <w:r>
+        <w:rPr>
+          <w:rFonts w:asciiTheme="minorHAnsi" w:hAnsiTheme="minorHAnsi" w:cstheme="minorHAnsi"/>
+          <w:color w:val="9876AA"/>
+        </w:rPr>
+        <w:t xml:space="preserve">"password"  </w:t>
       </w:r>
       <w:r>
         <w:rPr>
           <w:rFonts w:asciiTheme="minorHAnsi" w:hAnsiTheme="minorHAnsi" w:cstheme="minorHAnsi"/>
           <w:color w:val="CC7832"/>
         </w:rPr>
+        <w:t xml:space="preserve">: </w:t>
+      </w:r>
+      <w:r>
+        <w:rPr>
+          <w:rFonts w:asciiTheme="minorHAnsi" w:hAnsiTheme="minorHAnsi" w:cstheme="minorHAnsi"/>
+        </w:rPr>
+        <w:t>"</w:t>
+      </w:r>
+      <w:proofErr w:type="spellStart"/>
+      <w:r>
+        <w:rPr>
+          <w:rFonts w:asciiTheme="minorHAnsi" w:hAnsiTheme="minorHAnsi" w:cstheme="minorHAnsi"/>
+        </w:rPr>
+        <w:t>somePassoword</w:t>
+      </w:r>
+      <w:proofErr w:type="spellEnd"/>
+      <w:r>
+        <w:rPr>
+          <w:rFonts w:asciiTheme="minorHAnsi" w:hAnsiTheme="minorHAnsi" w:cstheme="minorHAnsi"/>
+        </w:rPr>
+        <w:t>"</w:t>
+      </w:r>
+      <w:r>
+        <w:rPr>
+          <w:rFonts w:asciiTheme="minorHAnsi" w:hAnsiTheme="minorHAnsi" w:cstheme="minorHAnsi"/>
+          <w:color w:val="CC7832"/>
+        </w:rPr>
+        <w:t>,</w:t>
+      </w:r>
+      <w:r>
+        <w:rPr>
+          <w:rFonts w:asciiTheme="minorHAnsi" w:hAnsiTheme="minorHAnsi" w:cstheme="minorHAnsi"/>
+          <w:color w:val="CC7832"/>
+        </w:rPr>
         <w:br/>
         <w:t xml:space="preserve">    </w:t>
       </w:r>
@@ -15239,160 +14982,14 @@
           <w:rFonts w:asciiTheme="minorHAnsi" w:hAnsiTheme="minorHAnsi" w:cstheme="minorHAnsi"/>
           <w:color w:val="9876AA"/>
         </w:rPr>
-        <w:t>"username</w:t>
-      </w:r>
-      <w:proofErr w:type="gramStart"/>
-      <w:r>
-        <w:rPr>
-          <w:rFonts w:asciiTheme="minorHAnsi" w:hAnsiTheme="minorHAnsi" w:cstheme="minorHAnsi"/>
-          <w:color w:val="9876AA"/>
-        </w:rPr>
-        <w:t xml:space="preserve">"  </w:t>
+        <w:t xml:space="preserve">"version"   </w:t>
       </w:r>
       <w:r>
         <w:rPr>
           <w:rFonts w:asciiTheme="minorHAnsi" w:hAnsiTheme="minorHAnsi" w:cstheme="minorHAnsi"/>
           <w:color w:val="CC7832"/>
         </w:rPr>
-        <w:t>:</w:t>
-      </w:r>
-      <w:proofErr w:type="gramEnd"/>
-      <w:r>
-        <w:rPr>
-          <w:rFonts w:asciiTheme="minorHAnsi" w:hAnsiTheme="minorHAnsi" w:cstheme="minorHAnsi"/>
-          <w:color w:val="CC7832"/>
-        </w:rPr>
-        <w:t xml:space="preserve"> </w:t>
-      </w:r>
-      <w:r>
-        <w:rPr>
-          <w:rFonts w:asciiTheme="minorHAnsi" w:hAnsiTheme="minorHAnsi" w:cstheme="minorHAnsi"/>
-        </w:rPr>
-        <w:t>"</w:t>
-      </w:r>
-      <w:proofErr w:type="spellStart"/>
-      <w:r>
-        <w:rPr>
-          <w:rFonts w:asciiTheme="minorHAnsi" w:hAnsiTheme="minorHAnsi" w:cstheme="minorHAnsi"/>
-        </w:rPr>
-        <w:t>someUser</w:t>
-      </w:r>
-      <w:proofErr w:type="spellEnd"/>
-      <w:r>
-        <w:rPr>
-          <w:rFonts w:asciiTheme="minorHAnsi" w:hAnsiTheme="minorHAnsi" w:cstheme="minorHAnsi"/>
-        </w:rPr>
-        <w:t>"</w:t>
-      </w:r>
-      <w:r>
-        <w:rPr>
-          <w:rFonts w:asciiTheme="minorHAnsi" w:hAnsiTheme="minorHAnsi" w:cstheme="minorHAnsi"/>
-          <w:color w:val="CC7832"/>
-        </w:rPr>
-        <w:t>,</w:t>
-      </w:r>
-      <w:r>
-        <w:rPr>
-          <w:rFonts w:asciiTheme="minorHAnsi" w:hAnsiTheme="minorHAnsi" w:cstheme="minorHAnsi"/>
-          <w:color w:val="CC7832"/>
-        </w:rPr>
-        <w:br/>
-        <w:t xml:space="preserve">    </w:t>
-      </w:r>
-      <w:r>
-        <w:rPr>
-          <w:rFonts w:asciiTheme="minorHAnsi" w:hAnsiTheme="minorHAnsi" w:cstheme="minorHAnsi"/>
-          <w:color w:val="9876AA"/>
-        </w:rPr>
-        <w:t>"password</w:t>
-      </w:r>
-      <w:proofErr w:type="gramStart"/>
-      <w:r>
-        <w:rPr>
-          <w:rFonts w:asciiTheme="minorHAnsi" w:hAnsiTheme="minorHAnsi" w:cstheme="minorHAnsi"/>
-          <w:color w:val="9876AA"/>
-        </w:rPr>
-        <w:t xml:space="preserve">"  </w:t>
-      </w:r>
-      <w:r>
-        <w:rPr>
-          <w:rFonts w:asciiTheme="minorHAnsi" w:hAnsiTheme="minorHAnsi" w:cstheme="minorHAnsi"/>
-          <w:color w:val="CC7832"/>
-        </w:rPr>
-        <w:t>:</w:t>
-      </w:r>
-      <w:proofErr w:type="gramEnd"/>
-      <w:r>
-        <w:rPr>
-          <w:rFonts w:asciiTheme="minorHAnsi" w:hAnsiTheme="minorHAnsi" w:cstheme="minorHAnsi"/>
-          <w:color w:val="CC7832"/>
-        </w:rPr>
-        <w:t xml:space="preserve"> </w:t>
-      </w:r>
-      <w:r>
-        <w:rPr>
-          <w:rFonts w:asciiTheme="minorHAnsi" w:hAnsiTheme="minorHAnsi" w:cstheme="minorHAnsi"/>
-        </w:rPr>
-        <w:t>"</w:t>
-      </w:r>
-      <w:proofErr w:type="spellStart"/>
-      <w:r>
-        <w:rPr>
-          <w:rFonts w:asciiTheme="minorHAnsi" w:hAnsiTheme="minorHAnsi" w:cstheme="minorHAnsi"/>
-        </w:rPr>
-        <w:t>somePassoword</w:t>
-      </w:r>
-      <w:proofErr w:type="spellEnd"/>
-      <w:r>
-        <w:rPr>
-          <w:rFonts w:asciiTheme="minorHAnsi" w:hAnsiTheme="minorHAnsi" w:cstheme="minorHAnsi"/>
-        </w:rPr>
-        <w:t>"</w:t>
-      </w:r>
-      <w:r>
-        <w:rPr>
-          <w:rFonts w:asciiTheme="minorHAnsi" w:hAnsiTheme="minorHAnsi" w:cstheme="minorHAnsi"/>
-          <w:color w:val="CC7832"/>
-        </w:rPr>
-        <w:t>,</w:t>
-      </w:r>
-      <w:r>
-        <w:rPr>
-          <w:rFonts w:asciiTheme="minorHAnsi" w:hAnsiTheme="minorHAnsi" w:cstheme="minorHAnsi"/>
-          <w:color w:val="CC7832"/>
-        </w:rPr>
-        <w:br/>
-        <w:t xml:space="preserve">    </w:t>
-      </w:r>
-      <w:r>
-        <w:rPr>
-          <w:rFonts w:asciiTheme="minorHAnsi" w:hAnsiTheme="minorHAnsi" w:cstheme="minorHAnsi"/>
-          <w:color w:val="9876AA"/>
-        </w:rPr>
-        <w:t xml:space="preserve">"version" </w:t>
-      </w:r>
-      <w:proofErr w:type="gramStart"/>
-      <w:r>
-        <w:rPr>
-          <w:rFonts w:asciiTheme="minorHAnsi" w:hAnsiTheme="minorHAnsi" w:cstheme="minorHAnsi"/>
-          <w:color w:val="9876AA"/>
-        </w:rPr>
-        <w:t xml:space="preserve">  </w:t>
-      </w:r>
-      <w:r>
-        <w:rPr>
-          <w:rFonts w:asciiTheme="minorHAnsi" w:hAnsiTheme="minorHAnsi" w:cstheme="minorHAnsi"/>
-          <w:color w:val="CC7832"/>
-        </w:rPr>
-        <w:t>:</w:t>
-      </w:r>
-      <w:proofErr w:type="gramEnd"/>
-      <w:r>
-        <w:rPr>
-          <w:rFonts w:asciiTheme="minorHAnsi" w:hAnsiTheme="minorHAnsi" w:cstheme="minorHAnsi"/>
-          <w:color w:val="CC7832"/>
-        </w:rPr>
-        <w:t xml:space="preserve"> </w:t>
+        <w:t xml:space="preserve">: </w:t>
       </w:r>
       <w:r>
         <w:rPr>
@@ -15455,7 +15052,6 @@
         <w:t xml:space="preserve"> run </w:t>
       </w:r>
       <w:proofErr w:type="spellStart"/>
-      <w:proofErr w:type="gramStart"/>
       <w:r>
         <w:rPr>
           <w:rFonts w:cstheme="minorHAnsi"/>
@@ -15463,7 +15059,6 @@
         <w:t>test:integration</w:t>
       </w:r>
       <w:proofErr w:type="spellEnd"/>
-      <w:proofErr w:type="gramEnd"/>
     </w:p>
     <w:p>
       <w:pPr>
@@ -15986,25 +15581,7 @@
           <w:b/>
           <w:bCs/>
         </w:rPr>
-        <w:t xml:space="preserve">Incorrect data being passed </w:t>
-      </w:r>
-      <w:proofErr w:type="gramStart"/>
-      <w:r>
-        <w:rPr>
-          <w:rFonts w:cstheme="minorHAnsi"/>
-          <w:b/>
-          <w:bCs/>
-        </w:rPr>
-        <w:t>in</w:t>
-      </w:r>
-      <w:proofErr w:type="gramEnd"/>
-      <w:r>
-        <w:rPr>
-          <w:rFonts w:cstheme="minorHAnsi"/>
-          <w:b/>
-          <w:bCs/>
-        </w:rPr>
-        <w:t xml:space="preserve"> the service requests</w:t>
+        <w:t>Incorrect data being passed in the service requests</w:t>
       </w:r>
       <w:r>
         <w:rPr>
@@ -16177,8 +15754,8 @@
         <w:pStyle w:val="Ttulo1"/>
       </w:pPr>
       <w:bookmarkStart w:id="68" w:name="_Toc104994184"/>
-      <w:bookmarkStart w:id="69" w:name="_Toc245264376"/>
-      <w:bookmarkStart w:id="70" w:name="_Toc211501390"/>
+      <w:bookmarkStart w:id="69" w:name="_Toc211501390"/>
+      <w:bookmarkStart w:id="70" w:name="_Toc245264376"/>
       <w:r>
         <w:t xml:space="preserve">6 </w:t>
       </w:r>
@@ -16186,7 +15763,7 @@
         <w:t>Operations, Maintenance</w:t>
       </w:r>
       <w:bookmarkEnd w:id="68"/>
-      <w:bookmarkEnd w:id="70"/>
+      <w:bookmarkEnd w:id="69"/>
     </w:p>
     <w:p>
       <w:pPr>
@@ -16320,7 +15897,7 @@
         </w:rPr>
         <w:t xml:space="preserve">. </w:t>
       </w:r>
-      <w:bookmarkEnd w:id="69"/>
+      <w:bookmarkEnd w:id="70"/>
     </w:p>
     <w:p>
       <w:pPr>
@@ -16523,14 +16100,14 @@
         </w:pBdr>
       </w:pPr>
       <w:bookmarkStart w:id="77" w:name="_Toc104994188"/>
-      <w:bookmarkStart w:id="78" w:name="_Hlk75794236"/>
-      <w:bookmarkStart w:id="79" w:name="_Toc211501394"/>
+      <w:bookmarkStart w:id="78" w:name="_Toc211501394"/>
+      <w:bookmarkStart w:id="79" w:name="_Hlk75794236"/>
       <w:r>
         <w:lastRenderedPageBreak/>
         <w:t>7 Release History</w:t>
       </w:r>
       <w:bookmarkEnd w:id="77"/>
-      <w:bookmarkEnd w:id="79"/>
+      <w:bookmarkEnd w:id="78"/>
     </w:p>
     <w:p>
       <w:pPr>
@@ -16548,7 +16125,7 @@
       </w:pPr>
       <w:bookmarkStart w:id="80" w:name="_Toc279703501"/>
       <w:bookmarkStart w:id="81" w:name="_Toc279703594"/>
-      <w:bookmarkEnd w:id="78"/>
+      <w:bookmarkEnd w:id="79"/>
     </w:p>
     <w:tbl>
       <w:tblPr>
@@ -24980,6 +24557,10 @@
 </file>
 
 <file path=customXml/item3.xml><?xml version="1.0" encoding="utf-8"?>
+<b:Sources xmlns:b="http://schemas.openxmlformats.org/officeDocument/2006/bibliography" xmlns="http://schemas.openxmlformats.org/officeDocument/2006/bibliography" SelectedStyle="\CHICAGO.XSL" StyleName="Chicago"/>
+</file>
+
+<file path=customXml/item4.xml><?xml version="1.0" encoding="utf-8"?>
 <ct:contentTypeSchema xmlns:ct="http://schemas.microsoft.com/office/2006/metadata/contentType" xmlns:ma="http://schemas.microsoft.com/office/2006/metadata/properties/metaAttributes" ct:_="" ma:_="" ma:contentTypeName="Document" ma:contentTypeID="0x010100BAC6AAE9A7AC6F448B8E6AD308F25C33" ma:contentTypeVersion="9" ma:contentTypeDescription="Create a new document." ma:contentTypeScope="" ma:versionID="9947e9a47e1bfbe6ee25356abc8c556f">
   <xsd:schema xmlns:xsd="http://www.w3.org/2001/XMLSchema" xmlns:xs="http://www.w3.org/2001/XMLSchema" xmlns:p="http://schemas.microsoft.com/office/2006/metadata/properties" xmlns:ns2="41dbd0cf-c47a-4cea-8dfa-c6db00955148" xmlns:ns3="2680ebc2-70e2-42cc-af17-343d078fef82" xmlns:ns4="3ab059b2-6124-4199-bb85-3249ccb31308" targetNamespace="http://schemas.microsoft.com/office/2006/metadata/properties" ma:root="true" ma:fieldsID="784c332b4ff724ef588fa3376e0daf40" ns2:_="" ns3:_="" ns4:_="">
     <xsd:import namespace="41dbd0cf-c47a-4cea-8dfa-c6db00955148"/>
@@ -25177,10 +24758,6 @@
 </ct:contentTypeSchema>
 </file>
 
-<file path=customXml/item4.xml><?xml version="1.0" encoding="utf-8"?>
-<b:Sources xmlns:b="http://schemas.openxmlformats.org/officeDocument/2006/bibliography" xmlns="http://schemas.openxmlformats.org/officeDocument/2006/bibliography" SelectedStyle="\CHICAGO.XSL" StyleName="Chicago"/>
-</file>
-
 <file path=customXml/item5.xml><?xml version="1.0" encoding="utf-8"?>
 <b:Sources xmlns:b="http://schemas.openxmlformats.org/officeDocument/2006/bibliography" xmlns="http://schemas.openxmlformats.org/officeDocument/2006/bibliography" SelectedStyle="\CHICAGO.XSL" StyleName="Chicago"/>
 </file>
@@ -25204,7 +24781,7 @@
 </file>
 
 <file path=customXml/itemProps1.xml><?xml version="1.0" encoding="utf-8"?>
-<ds:datastoreItem xmlns:ds="http://schemas.openxmlformats.org/officeDocument/2006/customXml" ds:itemID="{DFFD90AB-A9CA-48E9-A772-13C69588A728}">
+<ds:datastoreItem xmlns:ds="http://schemas.openxmlformats.org/officeDocument/2006/customXml" ds:itemID="{05CD6A24-F136-463B-BF16-F15886741A5F}">
   <ds:schemaRefs>
     <ds:schemaRef ds:uri="http://schemas.openxmlformats.org/officeDocument/2006/bibliography"/>
   </ds:schemaRefs>
@@ -25220,6 +24797,14 @@
 </file>
 
 <file path=customXml/itemProps3.xml><?xml version="1.0" encoding="utf-8"?>
+<ds:datastoreItem xmlns:ds="http://schemas.openxmlformats.org/officeDocument/2006/customXml" ds:itemID="{0ACC11CF-7E2F-4A39-A1CC-435974F0A74C}">
+  <ds:schemaRefs>
+    <ds:schemaRef ds:uri="http://schemas.openxmlformats.org/officeDocument/2006/bibliography"/>
+  </ds:schemaRefs>
+</ds:datastoreItem>
+</file>
+
+<file path=customXml/itemProps4.xml><?xml version="1.0" encoding="utf-8"?>
 <ds:datastoreItem xmlns:ds="http://schemas.openxmlformats.org/officeDocument/2006/customXml" ds:itemID="{AB403CD4-F922-4E1D-B3EA-72C1A6D547E2}">
   <ds:schemaRefs>
     <ds:schemaRef ds:uri="http://schemas.microsoft.com/office/2006/metadata/contentType"/>
@@ -25239,16 +24824,8 @@
 </ds:datastoreItem>
 </file>
 
-<file path=customXml/itemProps4.xml><?xml version="1.0" encoding="utf-8"?>
-<ds:datastoreItem xmlns:ds="http://schemas.openxmlformats.org/officeDocument/2006/customXml" ds:itemID="{74EDC720-C843-4BCC-ACEC-72DB380D8DF2}">
-  <ds:schemaRefs>
-    <ds:schemaRef ds:uri="http://schemas.openxmlformats.org/officeDocument/2006/bibliography"/>
-  </ds:schemaRefs>
-</ds:datastoreItem>
-</file>
-
 <file path=customXml/itemProps5.xml><?xml version="1.0" encoding="utf-8"?>
-<ds:datastoreItem xmlns:ds="http://schemas.openxmlformats.org/officeDocument/2006/customXml" ds:itemID="{0ACC11CF-7E2F-4A39-A1CC-435974F0A74C}">
+<ds:datastoreItem xmlns:ds="http://schemas.openxmlformats.org/officeDocument/2006/customXml" ds:itemID="{DFFD90AB-A9CA-48E9-A772-13C69588A728}">
   <ds:schemaRefs>
     <ds:schemaRef ds:uri="http://schemas.openxmlformats.org/officeDocument/2006/bibliography"/>
   </ds:schemaRefs>
@@ -25267,7 +24844,7 @@
 </file>
 
 <file path=customXml/itemProps7.xml><?xml version="1.0" encoding="utf-8"?>
-<ds:datastoreItem xmlns:ds="http://schemas.openxmlformats.org/officeDocument/2006/customXml" ds:itemID="{05CD6A24-F136-463B-BF16-F15886741A5F}">
+<ds:datastoreItem xmlns:ds="http://schemas.openxmlformats.org/officeDocument/2006/customXml" ds:itemID="{74EDC720-C843-4BCC-ACEC-72DB380D8DF2}">
   <ds:schemaRefs>
     <ds:schemaRef ds:uri="http://schemas.openxmlformats.org/officeDocument/2006/bibliography"/>
   </ds:schemaRefs>

</xml_diff>

<commit_message>
SIG-50 - Adds retry logic to callback to mitigate optimistic locking error (#59)
* SIG-50 - Adds retry logic to callback to mitigate optimistic locking error

* SIG-50 - Updated documentation
</commit_message>
<xml_diff>
--- a/link/documentation/Signifyd LINK Integration Documentation 22.1.0.docx
+++ b/link/documentation/Signifyd LINK Integration Documentation 22.1.0.docx
@@ -4620,15 +4620,7 @@
         <w:t xml:space="preserve">references </w:t>
       </w:r>
       <w:r>
-        <w:t xml:space="preserve">are inside the group Signifyd Settings. The preferences are used to control </w:t>
-      </w:r>
-      <w:proofErr w:type="gramStart"/>
-      <w:r>
-        <w:t>the cartridge</w:t>
-      </w:r>
-      <w:proofErr w:type="gramEnd"/>
-      <w:r>
-        <w:t xml:space="preserve"> behavior.</w:t>
+        <w:t>are inside the group Signifyd Settings. The preferences are used to control the cartridge behavior.</w:t>
       </w:r>
     </w:p>
     <w:p>
@@ -5066,6 +5058,15 @@
       <w:r>
         <w:t xml:space="preserve"> This triggers an update to the order in SFCC and could also indicate that the order is ready to export (depending on settings).</w:t>
       </w:r>
+      <w:r>
+        <w:t xml:space="preserve"> In case of failure during the callback function execution that prevents the SFCC order object to be updated (for example an ‘o</w:t>
+      </w:r>
+      <w:r>
+        <w:t>ptimistic locking failure</w:t>
+      </w:r>
+      <w:r>
+        <w:t>’), the cartridge will retry 3 times.</w:t>
+      </w:r>
     </w:p>
     <w:p>
       <w:r>
@@ -5077,13 +5078,8 @@
       <w:r>
         <w:t xml:space="preserve">, </w:t>
       </w:r>
-      <w:proofErr w:type="gramStart"/>
-      <w:r>
-        <w:t>the communication</w:t>
-      </w:r>
-      <w:proofErr w:type="gramEnd"/>
-      <w:r>
-        <w:t xml:space="preserve"> to the client should also be done by the merchant, since the checkout experience on the storefront itself is complete at this stage.</w:t>
+      <w:r>
+        <w:t>the communication to the client should also be done by the merchant, since the checkout experience on the storefront itself is complete at this stage.</w:t>
       </w:r>
     </w:p>
     <w:p/>
@@ -5091,8 +5087,8 @@
       <w:pPr>
         <w:pStyle w:val="Ttulo3"/>
       </w:pPr>
-      <w:bookmarkStart w:id="16" w:name="_Hlk83804264"/>
-      <w:bookmarkStart w:id="17" w:name="_Toc211501347"/>
+      <w:bookmarkStart w:id="16" w:name="_Toc211501347"/>
+      <w:bookmarkStart w:id="17" w:name="_Hlk83804264"/>
       <w:r>
         <w:t>4.1.</w:t>
       </w:r>
@@ -5108,7 +5104,7 @@
       <w:r>
         <w:t>authorization</w:t>
       </w:r>
-      <w:bookmarkEnd w:id="17"/>
+      <w:bookmarkEnd w:id="16"/>
     </w:p>
     <w:p/>
     <w:p>
@@ -5147,7 +5143,7 @@
       <w:r>
         <w:t xml:space="preserve">Signifyd decisions are returned synchronously </w:t>
       </w:r>
-      <w:bookmarkEnd w:id="16"/>
+      <w:bookmarkEnd w:id="17"/>
       <w:r>
         <w:t xml:space="preserve">after the </w:t>
       </w:r>
@@ -5233,6 +5229,7 @@
           <w:b/>
           <w:bCs/>
         </w:rPr>
+        <w:lastRenderedPageBreak/>
         <w:t>Action 1.</w:t>
       </w:r>
       <w:r>
@@ -5279,7 +5276,7 @@
           <w:iCs/>
           <w:color w:val="00000A"/>
         </w:rPr>
-        <w:t xml:space="preserve">If Signifyd returns a declined/rejected response, the </w:t>
+        <w:t>If Signifyd returns a declined/rejected response, the authorization call will not happen, and the order will be failed.</w:t>
       </w:r>
       <w:r>
         <w:rPr>
@@ -5288,8 +5285,7 @@
           <w:iCs/>
           <w:color w:val="00000A"/>
         </w:rPr>
-        <w:lastRenderedPageBreak/>
-        <w:t>authorization call will not happen, and the order will be failed.</w:t>
+        <w:t xml:space="preserve"> The failed order will be in “failed” status in Business Manager, where the merchant can also check the Signifyd order attributes, like the score received and the reason it failed.</w:t>
       </w:r>
       <w:r>
         <w:rPr>
@@ -5298,7 +5294,7 @@
           <w:iCs/>
           <w:color w:val="00000A"/>
         </w:rPr>
-        <w:t xml:space="preserve"> The failed order will be in “failed” status in Business Manager, where the merchant can also check the Signifyd order attributes, like the score received and the reason it failed.</w:t>
+        <w:t xml:space="preserve"> The storefront will display a default error message </w:t>
       </w:r>
       <w:r>
         <w:rPr>
@@ -5307,7 +5303,7 @@
           <w:iCs/>
           <w:color w:val="00000A"/>
         </w:rPr>
-        <w:t xml:space="preserve"> The storefront will display a default error message </w:t>
+        <w:t>to</w:t>
       </w:r>
       <w:r>
         <w:rPr>
@@ -5316,7 +5312,7 @@
           <w:iCs/>
           <w:color w:val="00000A"/>
         </w:rPr>
-        <w:t>to</w:t>
+        <w:t xml:space="preserve"> the customer. If the merchant wants to customize this message, it can be changed directly in the code.</w:t>
       </w:r>
       <w:r>
         <w:rPr>
@@ -5325,7 +5321,7 @@
           <w:iCs/>
           <w:color w:val="00000A"/>
         </w:rPr>
-        <w:t xml:space="preserve"> the customer. If the merchant wants to customize this message, it can be changed directly in the code.</w:t>
+        <w:t xml:space="preserve"> If Signifyd returns an accept/approved response, Salesforce Commerce Cloud proceeds with the </w:t>
       </w:r>
       <w:r>
         <w:rPr>
@@ -5334,7 +5330,7 @@
           <w:iCs/>
           <w:color w:val="00000A"/>
         </w:rPr>
-        <w:t xml:space="preserve"> If Signifyd returns an accept/approved response, Salesforce Commerce Cloud proceeds with the </w:t>
+        <w:t>authorization</w:t>
       </w:r>
       <w:r>
         <w:rPr>
@@ -5343,15 +5339,6 @@
           <w:iCs/>
           <w:color w:val="00000A"/>
         </w:rPr>
-        <w:t>authorization</w:t>
-      </w:r>
-      <w:r>
-        <w:rPr>
-          <w:rFonts w:cs="Trebuchet MS"/>
-          <w:bCs/>
-          <w:iCs/>
-          <w:color w:val="00000A"/>
-        </w:rPr>
         <w:t xml:space="preserve"> process against the payment provider.</w:t>
       </w:r>
     </w:p>
@@ -5498,15 +5485,7 @@
         <w:t xml:space="preserve">When the passive mode is switched off, Signifyd decision will be updated </w:t>
       </w:r>
       <w:r>
-        <w:t xml:space="preserve">on the </w:t>
-      </w:r>
-      <w:proofErr w:type="gramStart"/>
-      <w:r>
-        <w:t>order</w:t>
-      </w:r>
-      <w:proofErr w:type="gramEnd"/>
-      <w:r>
-        <w:t xml:space="preserve"> and the order status will be impacted according to the accept/reject decisions.</w:t>
+        <w:t>on the order and the order status will be impacted according to the accept/reject decisions.</w:t>
       </w:r>
     </w:p>
     <w:p/>
@@ -5679,6 +5658,7 @@
         <w:rPr>
           <w:noProof/>
         </w:rPr>
+        <w:lastRenderedPageBreak/>
         <w:drawing>
           <wp:inline distT="0" distB="0" distL="0" distR="0" wp14:anchorId="7A1BE199" wp14:editId="3AE8E5FB">
             <wp:extent cx="2790525" cy="1936750"/>
@@ -5735,7 +5715,6 @@
       </w:pPr>
       <w:bookmarkStart w:id="22" w:name="_Toc211501351"/>
       <w:r>
-        <w:lastRenderedPageBreak/>
         <w:t>4.1.6 Re</w:t>
       </w:r>
       <w:r>
@@ -5896,7 +5875,11 @@
       </w:r>
       <w:proofErr w:type="spellEnd"/>
       <w:r>
-        <w:t xml:space="preserve"> and if set to true this indicates that the Salesforce Commerce Cloud order is held until the webhook listener is called and indicates that the order is approved. This is accomplished by marking </w:t>
+        <w:t xml:space="preserve"> and if set to true this indicates that the Salesforce Commerce Cloud order is held until the webhook listener is called and indicates that the order </w:t>
+      </w:r>
+      <w:r>
+        <w:lastRenderedPageBreak/>
+        <w:t xml:space="preserve">is approved. This is accomplished by marking </w:t>
       </w:r>
       <w:r>
         <w:t>the order</w:t>
@@ -6026,7 +6009,6 @@
     <w:p/>
     <w:p>
       <w:r>
-        <w:lastRenderedPageBreak/>
         <w:t xml:space="preserve">To use </w:t>
       </w:r>
       <w:proofErr w:type="spellStart"/>
@@ -6825,6 +6807,7 @@
                 <w:sz w:val="20"/>
                 <w:szCs w:val="20"/>
               </w:rPr>
+              <w:lastRenderedPageBreak/>
               <w:t xml:space="preserve">- In case the payment was captured prior to receiving </w:t>
             </w:r>
             <w:proofErr w:type="spellStart"/>
@@ -6868,6 +6851,7 @@
                 <w:sz w:val="20"/>
                 <w:szCs w:val="20"/>
               </w:rPr>
+              <w:lastRenderedPageBreak/>
               <w:t>N/A</w:t>
             </w:r>
           </w:p>
@@ -7005,19 +6989,19 @@
                 <w:sz w:val="20"/>
                 <w:szCs w:val="20"/>
               </w:rPr>
-              <w:t xml:space="preserve"> would need to resubmit </w:t>
-            </w:r>
-            <w:proofErr w:type="gramStart"/>
-            <w:r>
+              <w:t xml:space="preserve"> would need to resubmit order from the console and add additional details related to why this declined order is being resubmitted.</w:t>
+            </w:r>
+          </w:p>
+          <w:p>
+            <w:pPr>
+              <w:cnfStyle w:val="000000000000" w:firstRow="0" w:lastRow="0" w:firstColumn="0" w:lastColumn="0" w:oddVBand="0" w:evenVBand="0" w:oddHBand="0" w:evenHBand="0" w:firstRowFirstColumn="0" w:firstRowLastColumn="0" w:lastRowFirstColumn="0" w:lastRowLastColumn="0"/>
               <w:rPr>
                 <w:rFonts w:cstheme="minorHAnsi"/>
                 <w:color w:val="000000" w:themeColor="text1"/>
                 <w:sz w:val="20"/>
                 <w:szCs w:val="20"/>
               </w:rPr>
-              <w:t>order</w:t>
-            </w:r>
-            <w:proofErr w:type="gramEnd"/>
+            </w:pPr>
             <w:r>
               <w:rPr>
                 <w:rFonts w:cstheme="minorHAnsi"/>
@@ -7025,57 +7009,7 @@
                 <w:sz w:val="20"/>
                 <w:szCs w:val="20"/>
               </w:rPr>
-              <w:t xml:space="preserve"> from the console and add additional details related to why this </w:t>
-            </w:r>
-            <w:proofErr w:type="gramStart"/>
-            <w:r>
-              <w:rPr>
-                <w:rFonts w:cstheme="minorHAnsi"/>
-                <w:color w:val="000000" w:themeColor="text1"/>
-                <w:sz w:val="20"/>
-                <w:szCs w:val="20"/>
-              </w:rPr>
-              <w:t>declined</w:t>
-            </w:r>
-            <w:proofErr w:type="gramEnd"/>
-            <w:r>
-              <w:rPr>
-                <w:rFonts w:cstheme="minorHAnsi"/>
-                <w:color w:val="000000" w:themeColor="text1"/>
-                <w:sz w:val="20"/>
-                <w:szCs w:val="20"/>
-              </w:rPr>
-              <w:t xml:space="preserve"> order is being resubmitted.</w:t>
-            </w:r>
-          </w:p>
-          <w:p>
-            <w:pPr>
-              <w:cnfStyle w:val="000000000000" w:firstRow="0" w:lastRow="0" w:firstColumn="0" w:lastColumn="0" w:oddVBand="0" w:evenVBand="0" w:oddHBand="0" w:evenHBand="0" w:firstRowFirstColumn="0" w:firstRowLastColumn="0" w:lastRowFirstColumn="0" w:lastRowLastColumn="0"/>
-              <w:rPr>
-                <w:rFonts w:cstheme="minorHAnsi"/>
-                <w:color w:val="000000" w:themeColor="text1"/>
-                <w:sz w:val="20"/>
-                <w:szCs w:val="20"/>
-              </w:rPr>
-            </w:pPr>
-            <w:r>
-              <w:rPr>
-                <w:rFonts w:cstheme="minorHAnsi"/>
-                <w:color w:val="000000" w:themeColor="text1"/>
-                <w:sz w:val="20"/>
-                <w:szCs w:val="20"/>
-              </w:rPr>
-              <w:t xml:space="preserve">-  If Signifyd subsequently approves this order post resubmit, then order should be progressed to the OMS for </w:t>
-            </w:r>
-            <w:r>
-              <w:rPr>
-                <w:rFonts w:cstheme="minorHAnsi"/>
-                <w:color w:val="000000" w:themeColor="text1"/>
-                <w:sz w:val="20"/>
-                <w:szCs w:val="20"/>
-              </w:rPr>
-              <w:lastRenderedPageBreak/>
-              <w:t>fulfillment (this would happen automatically via webhooks)</w:t>
+              <w:t>-  If Signifyd subsequently approves this order post resubmit, then order should be progressed to the OMS for fulfillment (this would happen automatically via webhooks)</w:t>
             </w:r>
           </w:p>
           <w:p>
@@ -7208,7 +7142,6 @@
         <w:t>“</w:t>
       </w:r>
       <w:proofErr w:type="spellStart"/>
-      <w:proofErr w:type="gramStart"/>
       <w:r>
         <w:t>caseId</w:t>
       </w:r>
@@ -7217,11 +7150,7 @@
         <w:t>”</w:t>
       </w:r>
       <w:r>
-        <w:t>=</w:t>
-      </w:r>
-      <w:proofErr w:type="gramEnd"/>
-      <w:r>
-        <w:t xml:space="preserve"> </w:t>
+        <w:t xml:space="preserve">= </w:t>
       </w:r>
       <w:r>
         <w:t>“</w:t>
@@ -7322,39 +7251,7 @@
           <w:b/>
           <w:bCs/>
         </w:rPr>
-        <w:t xml:space="preserve">Merchant Tools </w:t>
-      </w:r>
-      <w:proofErr w:type="gramStart"/>
-      <w:r>
-        <w:rPr>
-          <w:b/>
-          <w:bCs/>
-        </w:rPr>
-        <w:t>&gt;  Ordering</w:t>
-      </w:r>
-      <w:proofErr w:type="gramEnd"/>
-      <w:r>
-        <w:rPr>
-          <w:b/>
-          <w:bCs/>
-        </w:rPr>
-        <w:t xml:space="preserve"> </w:t>
-      </w:r>
-      <w:proofErr w:type="gramStart"/>
-      <w:r>
-        <w:rPr>
-          <w:b/>
-          <w:bCs/>
-        </w:rPr>
-        <w:t>&gt;  Payment</w:t>
-      </w:r>
-      <w:proofErr w:type="gramEnd"/>
-      <w:r>
-        <w:rPr>
-          <w:b/>
-          <w:bCs/>
-        </w:rPr>
-        <w:t xml:space="preserve"> Methods</w:t>
+        <w:t>Merchant Tools &gt;  Ordering &gt;  Payment Methods</w:t>
       </w:r>
       <w:r>
         <w:t>.</w:t>
@@ -7539,17 +7436,7 @@
       </w:pPr>
       <w:bookmarkStart w:id="28" w:name="_Toc211501357"/>
       <w:r>
-        <w:lastRenderedPageBreak/>
-        <w:t>4.1.1</w:t>
-      </w:r>
-      <w:r>
-        <w:t>1</w:t>
-      </w:r>
-      <w:r>
-        <w:t xml:space="preserve"> </w:t>
-      </w:r>
-      <w:r>
-        <w:t>Order notes</w:t>
+        <w:t>4.1.11 Order notes</w:t>
       </w:r>
       <w:bookmarkEnd w:id="28"/>
     </w:p>
@@ -7773,21 +7660,7 @@
         <w:rPr>
           <w:rFonts w:cstheme="minorHAnsi"/>
         </w:rPr>
-        <w:t xml:space="preserve">anager </w:t>
-      </w:r>
-      <w:proofErr w:type="gramStart"/>
-      <w:r>
-        <w:rPr>
-          <w:rFonts w:cstheme="minorHAnsi"/>
-        </w:rPr>
-        <w:t>into</w:t>
-      </w:r>
-      <w:proofErr w:type="gramEnd"/>
-      <w:r>
-        <w:rPr>
-          <w:rFonts w:cstheme="minorHAnsi"/>
-        </w:rPr>
-        <w:t xml:space="preserve"> your site:</w:t>
+        <w:t>anager into your site:</w:t>
       </w:r>
       <w:r>
         <w:rPr>
@@ -7887,6 +7760,7 @@
           <w:sz w:val="24"/>
           <w:szCs w:val="24"/>
         </w:rPr>
+        <w:lastRenderedPageBreak/>
         <w:drawing>
           <wp:inline distT="0" distB="0" distL="0" distR="0" wp14:anchorId="66F81BE5" wp14:editId="3391D529">
             <wp:extent cx="5991225" cy="2781300"/>
@@ -7987,7 +7861,6 @@
           <w:sz w:val="24"/>
           <w:szCs w:val="24"/>
         </w:rPr>
-        <w:lastRenderedPageBreak/>
         <w:drawing>
           <wp:inline distT="0" distB="0" distL="0" distR="0" wp14:anchorId="463D53B3" wp14:editId="39C0C6C1">
             <wp:extent cx="4135522" cy="1067231"/>
@@ -8209,6 +8082,7 @@
           <w:sz w:val="24"/>
           <w:szCs w:val="24"/>
         </w:rPr>
+        <w:lastRenderedPageBreak/>
         <w:drawing>
           <wp:inline distT="0" distB="0" distL="0" distR="0" wp14:anchorId="6345FB73" wp14:editId="0ECC5F5E">
             <wp:extent cx="6188710" cy="1596390"/>
@@ -8300,7 +8174,6 @@
           <w:sz w:val="24"/>
           <w:szCs w:val="24"/>
         </w:rPr>
-        <w:lastRenderedPageBreak/>
         <w:drawing>
           <wp:inline distT="0" distB="0" distL="0" distR="0" wp14:anchorId="6A804093" wp14:editId="0B1B1492">
             <wp:extent cx="6188710" cy="1637030"/>
@@ -8493,6 +8366,7 @@
         <w:rPr>
           <w:rFonts w:cstheme="minorHAnsi"/>
         </w:rPr>
+        <w:lastRenderedPageBreak/>
         <w:t xml:space="preserve">In Business Manager go to Administration-&gt;Operations-&gt;Import Export and select ‘upload’ then browse to the </w:t>
       </w:r>
       <w:r>
@@ -8538,7 +8412,6 @@
           <w:sz w:val="24"/>
           <w:szCs w:val="24"/>
         </w:rPr>
-        <w:lastRenderedPageBreak/>
         <w:drawing>
           <wp:inline distT="0" distB="0" distL="0" distR="0" wp14:anchorId="6613D0E5" wp14:editId="09F633E3">
             <wp:extent cx="3886200" cy="3495675"/>
@@ -8761,6 +8634,7 @@
         <w:rPr>
           <w:rFonts w:cstheme="minorHAnsi"/>
         </w:rPr>
+        <w:lastRenderedPageBreak/>
         <w:t>In Business Manager</w:t>
       </w:r>
       <w:r>
@@ -8809,7 +8683,6 @@
           <w:sz w:val="24"/>
           <w:szCs w:val="24"/>
         </w:rPr>
-        <w:lastRenderedPageBreak/>
         <w:drawing>
           <wp:inline distT="0" distB="0" distL="0" distR="0" wp14:anchorId="6D6F8005" wp14:editId="22A519FB">
             <wp:extent cx="3886200" cy="3495675"/>
@@ -9110,6 +8983,7 @@
       </w:pPr>
       <w:bookmarkStart w:id="35" w:name="_Toc211501364"/>
       <w:r>
+        <w:lastRenderedPageBreak/>
         <w:t xml:space="preserve">5.2.1 </w:t>
       </w:r>
       <w:r>
@@ -9152,7 +9026,6 @@
           <w:bCs/>
           <w:color w:val="00000A"/>
         </w:rPr>
-        <w:lastRenderedPageBreak/>
         <w:t xml:space="preserve">Script: </w:t>
       </w:r>
       <w:r>
@@ -9225,7 +9098,6 @@
         <w:t xml:space="preserve">Function </w:t>
       </w:r>
       <w:proofErr w:type="spellStart"/>
-      <w:proofErr w:type="gramStart"/>
       <w:r>
         <w:rPr>
           <w:rFonts w:cstheme="minorHAnsi"/>
@@ -9243,17 +9115,7 @@
           <w:bCs/>
           <w:color w:val="00000A"/>
         </w:rPr>
-        <w:t>(</w:t>
-      </w:r>
-      <w:proofErr w:type="gramEnd"/>
-      <w:r>
-        <w:rPr>
-          <w:rFonts w:cstheme="minorHAnsi"/>
-          <w:b/>
-          <w:bCs/>
-          <w:color w:val="00000A"/>
-        </w:rPr>
-        <w:t>)</w:t>
+        <w:t>()</w:t>
       </w:r>
       <w:r>
         <w:rPr>
@@ -9453,7 +9315,6 @@
         <w:t xml:space="preserve">, then the order export status will be set to Ready For Export as in the default </w:t>
       </w:r>
       <w:proofErr w:type="spellStart"/>
-      <w:proofErr w:type="gramStart"/>
       <w:r>
         <w:rPr>
           <w:rFonts w:cstheme="minorHAnsi"/>
@@ -9471,17 +9332,7 @@
           <w:bCs/>
           <w:color w:val="00000A"/>
         </w:rPr>
-        <w:t>(</w:t>
-      </w:r>
-      <w:proofErr w:type="gramEnd"/>
-      <w:r>
-        <w:rPr>
-          <w:rFonts w:cstheme="minorHAnsi"/>
-          <w:b/>
-          <w:bCs/>
-          <w:color w:val="00000A"/>
-        </w:rPr>
-        <w:t xml:space="preserve">) </w:t>
+        <w:t xml:space="preserve">() </w:t>
       </w:r>
       <w:r>
         <w:rPr>
@@ -9630,7 +9481,6 @@
         <w:t xml:space="preserve">contains code to override the SFRA default function </w:t>
       </w:r>
       <w:proofErr w:type="spellStart"/>
-      <w:proofErr w:type="gramStart"/>
       <w:r>
         <w:rPr>
           <w:rFonts w:cstheme="minorHAnsi"/>
@@ -9648,17 +9498,7 @@
           <w:bCs/>
           <w:color w:val="00000A"/>
         </w:rPr>
-        <w:t>(</w:t>
-      </w:r>
-      <w:proofErr w:type="gramEnd"/>
-      <w:r>
-        <w:rPr>
-          <w:rFonts w:cstheme="minorHAnsi"/>
-          <w:b/>
-          <w:bCs/>
-          <w:color w:val="00000A"/>
-        </w:rPr>
-        <w:t>)</w:t>
+        <w:t>()</w:t>
       </w:r>
       <w:r>
         <w:rPr>
@@ -9740,19 +9580,8 @@
           <w:bCs/>
           <w:color w:val="00000A"/>
         </w:rPr>
-        <w:t>{merchant_customized_</w:t>
-      </w:r>
-      <w:proofErr w:type="gramStart"/>
-      <w:r>
-        <w:rPr>
-          <w:rFonts w:cstheme="minorHAnsi"/>
-          <w:b/>
-          <w:bCs/>
-          <w:color w:val="00000A"/>
-        </w:rPr>
-        <w:t>cartridge}/cartridge/scripts/checkout/checkoutHelpers.js</w:t>
-      </w:r>
-      <w:proofErr w:type="gramEnd"/>
+        <w:t>{merchant_customized_cartridge}/cartridge/scripts/checkout/checkoutHelpers.js</w:t>
+      </w:r>
     </w:p>
     <w:p>
       <w:pPr>
@@ -10020,6 +9849,7 @@
           <w:rFonts w:eastAsia="Times New Roman" w:cstheme="minorHAnsi"/>
           <w:color w:val="4F81BD" w:themeColor="accent1"/>
         </w:rPr>
+        <w:lastRenderedPageBreak/>
         <w:t>var Signifyd = require('int_signifyd/cartridge/scripts/service/</w:t>
       </w:r>
       <w:proofErr w:type="spellStart"/>
@@ -10082,17 +9912,8 @@
           <w:rFonts w:eastAsia="Times New Roman" w:cstheme="minorHAnsi"/>
           <w:color w:val="4F81BD" w:themeColor="accent1"/>
         </w:rPr>
-        <w:t>(</w:t>
-      </w:r>
-      <w:proofErr w:type="gramStart"/>
-      <w:r>
-        <w:rPr>
-          <w:rFonts w:eastAsia="Times New Roman" w:cstheme="minorHAnsi"/>
-          <w:color w:val="4F81BD" w:themeColor="accent1"/>
-        </w:rPr>
-        <w:t>);</w:t>
-      </w:r>
-      <w:proofErr w:type="gramEnd"/>
+        <w:t>();</w:t>
+      </w:r>
     </w:p>
     <w:p>
       <w:pPr>
@@ -10109,7 +9930,6 @@
         <w:rPr>
           <w:rFonts w:cstheme="minorHAnsi"/>
         </w:rPr>
-        <w:lastRenderedPageBreak/>
         <w:t>Add those two rows near the end of the same function method:</w:t>
       </w:r>
     </w:p>
@@ -10163,7 +9983,6 @@
         <w:t>orderSessionID</w:t>
       </w:r>
       <w:proofErr w:type="spellEnd"/>
-      <w:proofErr w:type="gramStart"/>
       <w:r>
         <w:rPr>
           <w:rFonts w:eastAsia="Times New Roman" w:cstheme="minorHAnsi"/>
@@ -10171,7 +9990,6 @@
         </w:rPr>
         <w:t>);</w:t>
       </w:r>
-      <w:proofErr w:type="gramEnd"/>
     </w:p>
     <w:p>
       <w:pPr>
@@ -10207,7 +10025,6 @@
         <w:t>placeOrderResult.Order</w:t>
       </w:r>
       <w:proofErr w:type="spellEnd"/>
-      <w:proofErr w:type="gramStart"/>
       <w:r>
         <w:rPr>
           <w:rFonts w:eastAsia="Times New Roman" w:cstheme="minorHAnsi"/>
@@ -10215,7 +10032,6 @@
         </w:rPr>
         <w:t>);</w:t>
       </w:r>
-      <w:proofErr w:type="gramEnd"/>
     </w:p>
     <w:p>
       <w:pPr>
@@ -10335,34 +10151,14 @@
         </w:rPr>
         <w:br/>
       </w:r>
-      <w:proofErr w:type="gramStart"/>
       <w:r>
         <w:rPr>
           <w:rFonts w:cstheme="minorHAnsi"/>
           <w:b/>
           <w:color w:val="4F81BD" w:themeColor="accent1"/>
         </w:rPr>
-        <w:t>….&lt;</w:t>
-      </w:r>
-      <w:proofErr w:type="gramEnd"/>
-      <w:r>
-        <w:rPr>
-          <w:rFonts w:cstheme="minorHAnsi"/>
-          <w:b/>
-          <w:color w:val="4F81BD" w:themeColor="accent1"/>
-        </w:rPr>
-        <w:t>Insert code here&gt;</w:t>
-      </w:r>
-      <w:proofErr w:type="gramStart"/>
-      <w:r>
-        <w:rPr>
-          <w:rFonts w:cstheme="minorHAnsi"/>
-          <w:b/>
-          <w:color w:val="4F81BD" w:themeColor="accent1"/>
-        </w:rPr>
-        <w:t>…..</w:t>
-      </w:r>
-      <w:proofErr w:type="gramEnd"/>
+        <w:t>….&lt;Insert code here&gt;…..</w:t>
+      </w:r>
       <w:r>
         <w:rPr>
           <w:rFonts w:cstheme="minorHAnsi"/>
@@ -10640,39 +10436,7 @@
           <w:rFonts w:cstheme="minorHAnsi"/>
           <w:color w:val="4F81BD" w:themeColor="accent1"/>
         </w:rPr>
-        <w:t xml:space="preserve"> condition="${</w:t>
-      </w:r>
-      <w:proofErr w:type="gramStart"/>
-      <w:r>
-        <w:rPr>
-          <w:rFonts w:cstheme="minorHAnsi"/>
-          <w:color w:val="4F81BD" w:themeColor="accent1"/>
-        </w:rPr>
-        <w:t>dw.system</w:t>
-      </w:r>
-      <w:proofErr w:type="gramEnd"/>
-      <w:r>
-        <w:rPr>
-          <w:rFonts w:cstheme="minorHAnsi"/>
-          <w:color w:val="4F81BD" w:themeColor="accent1"/>
-        </w:rPr>
-        <w:t>.Site.getCurrent(</w:t>
-      </w:r>
-      <w:proofErr w:type="gramStart"/>
-      <w:r>
-        <w:rPr>
-          <w:rFonts w:cstheme="minorHAnsi"/>
-          <w:color w:val="4F81BD" w:themeColor="accent1"/>
-        </w:rPr>
-        <w:t>).getCustomPreferenceValue</w:t>
-      </w:r>
-      <w:proofErr w:type="gramEnd"/>
-      <w:r>
-        <w:rPr>
-          <w:rFonts w:cstheme="minorHAnsi"/>
-          <w:color w:val="4F81BD" w:themeColor="accent1"/>
-        </w:rPr>
-        <w:t>('SignifydEnableCartridge')}"&gt;</w:t>
+        <w:t xml:space="preserve"> condition="${dw.system.Site.getCurrent().getCustomPreferenceValue('SignifydEnableCartridge')}"&gt;</w:t>
       </w:r>
       <w:r>
         <w:rPr>
@@ -10749,6 +10513,7 @@
         <w:rPr>
           <w:rFonts w:cstheme="minorHAnsi"/>
         </w:rPr>
+        <w:lastRenderedPageBreak/>
         <w:t>The result should look like the following:</w:t>
       </w:r>
     </w:p>
@@ -10763,7 +10528,6 @@
           <w:rFonts w:cstheme="minorHAnsi"/>
           <w:noProof/>
         </w:rPr>
-        <w:lastRenderedPageBreak/>
         <w:drawing>
           <wp:inline distT="0" distB="0" distL="0" distR="0" wp14:anchorId="34456EF4" wp14:editId="43FBEBC4">
             <wp:extent cx="6181725" cy="1457325"/>
@@ -11345,7 +11109,6 @@
         <w:t xml:space="preserve"> for valid response codes. AVS and CVV values should be updated by the merchant for </w:t>
       </w:r>
       <w:proofErr w:type="spellStart"/>
-      <w:proofErr w:type="gramStart"/>
       <w:r>
         <w:rPr>
           <w:rFonts w:cstheme="minorHAnsi"/>
@@ -11359,56 +11122,23 @@
           <w:rFonts w:cstheme="minorHAnsi"/>
           <w:color w:val="00000A"/>
         </w:rPr>
-        <w:t>(</w:t>
-      </w:r>
-      <w:proofErr w:type="gramEnd"/>
+        <w:t xml:space="preserve">() (in case of Pre-auth enabled) and </w:t>
+      </w:r>
+      <w:proofErr w:type="spellStart"/>
       <w:r>
         <w:rPr>
           <w:rFonts w:cstheme="minorHAnsi"/>
           <w:color w:val="00000A"/>
         </w:rPr>
-        <w:t xml:space="preserve">) (in </w:t>
-      </w:r>
-      <w:proofErr w:type="gramStart"/>
+        <w:t>getParams</w:t>
+      </w:r>
+      <w:proofErr w:type="spellEnd"/>
       <w:r>
         <w:rPr>
           <w:rFonts w:cstheme="minorHAnsi"/>
           <w:color w:val="00000A"/>
         </w:rPr>
-        <w:t>case of</w:t>
-      </w:r>
-      <w:proofErr w:type="gramEnd"/>
-      <w:r>
-        <w:rPr>
-          <w:rFonts w:cstheme="minorHAnsi"/>
-          <w:color w:val="00000A"/>
-        </w:rPr>
-        <w:t xml:space="preserve"> Pre-auth enabled) and </w:t>
-      </w:r>
-      <w:proofErr w:type="spellStart"/>
-      <w:proofErr w:type="gramStart"/>
-      <w:r>
-        <w:rPr>
-          <w:rFonts w:cstheme="minorHAnsi"/>
-          <w:color w:val="00000A"/>
-        </w:rPr>
-        <w:t>getParams</w:t>
-      </w:r>
-      <w:proofErr w:type="spellEnd"/>
-      <w:r>
-        <w:rPr>
-          <w:rFonts w:cstheme="minorHAnsi"/>
-          <w:color w:val="00000A"/>
-        </w:rPr>
-        <w:t>(</w:t>
-      </w:r>
-      <w:proofErr w:type="gramEnd"/>
-      <w:r>
-        <w:rPr>
-          <w:rFonts w:cstheme="minorHAnsi"/>
-          <w:color w:val="00000A"/>
-        </w:rPr>
-        <w:t>) (in case Post-auth enabled) functions on signifyd.js file.</w:t>
+        <w:t>() (in case Post-auth enabled) functions on signifyd.js file.</w:t>
       </w:r>
     </w:p>
     <w:p>
@@ -11440,7 +11170,6 @@
         </w:rPr>
       </w:pPr>
       <w:proofErr w:type="spellStart"/>
-      <w:proofErr w:type="gramStart"/>
       <w:r>
         <w:rPr>
           <w:rFonts w:cstheme="minorHAnsi"/>
@@ -11458,17 +11187,7 @@
           <w:bCs/>
           <w:color w:val="00000A"/>
         </w:rPr>
-        <w:t>(</w:t>
-      </w:r>
-      <w:proofErr w:type="gramEnd"/>
-      <w:r>
-        <w:rPr>
-          <w:rFonts w:cstheme="minorHAnsi"/>
-          <w:b/>
-          <w:bCs/>
-          <w:color w:val="00000A"/>
-        </w:rPr>
-        <w:t>)</w:t>
+        <w:t>()</w:t>
       </w:r>
     </w:p>
     <w:p>
@@ -11560,7 +11279,6 @@
         </w:rPr>
       </w:pPr>
       <w:proofErr w:type="spellStart"/>
-      <w:proofErr w:type="gramStart"/>
       <w:r>
         <w:rPr>
           <w:rFonts w:cstheme="minorHAnsi"/>
@@ -11579,17 +11297,7 @@
           <w:bCs/>
           <w:color w:val="00000A"/>
         </w:rPr>
-        <w:t>(</w:t>
-      </w:r>
-      <w:proofErr w:type="gramEnd"/>
-      <w:r>
-        <w:rPr>
-          <w:rFonts w:cstheme="minorHAnsi"/>
-          <w:b/>
-          <w:bCs/>
-          <w:color w:val="00000A"/>
-        </w:rPr>
-        <w:t>)</w:t>
+        <w:t>()</w:t>
       </w:r>
     </w:p>
     <w:p>
@@ -11738,7 +11446,6 @@
         <w:t xml:space="preserve">Order channel information should be updated by the merchant in the </w:t>
       </w:r>
       <w:proofErr w:type="spellStart"/>
-      <w:proofErr w:type="gramStart"/>
       <w:r>
         <w:rPr>
           <w:rFonts w:cstheme="minorHAnsi"/>
@@ -11756,17 +11463,7 @@
           <w:bCs/>
           <w:color w:val="00000A"/>
         </w:rPr>
-        <w:t>(</w:t>
-      </w:r>
-      <w:proofErr w:type="gramEnd"/>
-      <w:r>
-        <w:rPr>
-          <w:rFonts w:cstheme="minorHAnsi"/>
-          <w:b/>
-          <w:bCs/>
-          <w:color w:val="00000A"/>
-        </w:rPr>
-        <w:t>)</w:t>
+        <w:t>()</w:t>
       </w:r>
       <w:r>
         <w:rPr>
@@ -12233,15 +11930,7 @@
     <w:p/>
     <w:p>
       <w:r>
-        <w:t xml:space="preserve">If the merchant is selling digital items, </w:t>
-      </w:r>
-      <w:proofErr w:type="gramStart"/>
-      <w:r>
-        <w:t>the</w:t>
-      </w:r>
-      <w:proofErr w:type="gramEnd"/>
-      <w:r>
-        <w:t xml:space="preserve"> </w:t>
+        <w:t xml:space="preserve">If the merchant is selling digital items, the </w:t>
       </w:r>
       <w:r>
         <w:rPr>
@@ -12256,11 +11945,9 @@
       <w:r>
         <w:t xml:space="preserve">inside the </w:t>
       </w:r>
-      <w:proofErr w:type="gramStart"/>
       <w:r>
         <w:t>purchase.products</w:t>
       </w:r>
-      <w:proofErr w:type="gramEnd"/>
       <w:r>
         <w:t xml:space="preserve"> object should be updated to true. By default, the value is </w:t>
       </w:r>
@@ -12636,7 +12323,6 @@
         </w:rPr>
         <w:t xml:space="preserve">unless the merchant needs </w:t>
       </w:r>
-      <w:proofErr w:type="gramStart"/>
       <w:r>
         <w:rPr>
           <w:rFonts w:cs="Trebuchet MS"/>
@@ -12657,7 +12343,6 @@
         <w:t>Signifyd's</w:t>
       </w:r>
       <w:proofErr w:type="spellEnd"/>
-      <w:proofErr w:type="gramEnd"/>
       <w:r>
         <w:rPr>
           <w:rFonts w:cs="Trebuchet MS"/>
@@ -12984,7 +12669,6 @@
         </w:rPr>
       </w:pPr>
       <w:proofErr w:type="spellStart"/>
-      <w:proofErr w:type="gramStart"/>
       <w:r>
         <w:rPr>
           <w:rFonts w:cs="Trebuchet MS"/>
@@ -12993,7 +12677,6 @@
         <w:t>SignifydSale</w:t>
       </w:r>
       <w:proofErr w:type="spellEnd"/>
-      <w:proofErr w:type="gramEnd"/>
       <w:r>
         <w:rPr>
           <w:rFonts w:cs="Trebuchet MS"/>
@@ -13796,15 +13479,7 @@
       </w:r>
       <w:proofErr w:type="spellEnd"/>
       <w:r>
-        <w:t xml:space="preserve"> are saved on the </w:t>
-      </w:r>
-      <w:proofErr w:type="gramStart"/>
-      <w:r>
-        <w:t>order</w:t>
-      </w:r>
-      <w:proofErr w:type="gramEnd"/>
-      <w:r>
-        <w:t xml:space="preserve"> and the order proceeds to authorization.</w:t>
+        <w:t xml:space="preserve"> are saved on the order and the order proceeds to authorization.</w:t>
       </w:r>
     </w:p>
     <w:p>
@@ -15142,21 +14817,7 @@
         <w:rPr>
           <w:rFonts w:cstheme="minorHAnsi"/>
         </w:rPr>
-        <w:t xml:space="preserve"> file on the </w:t>
-      </w:r>
-      <w:proofErr w:type="gramStart"/>
-      <w:r>
-        <w:rPr>
-          <w:rFonts w:cstheme="minorHAnsi"/>
-        </w:rPr>
-        <w:t>navigate</w:t>
-      </w:r>
-      <w:proofErr w:type="gramEnd"/>
-      <w:r>
-        <w:rPr>
-          <w:rFonts w:cstheme="minorHAnsi"/>
-        </w:rPr>
-        <w:t xml:space="preserve"> to the folder above the cartridges</w:t>
+        <w:t xml:space="preserve"> file on the navigate to the folder above the cartridges</w:t>
       </w:r>
     </w:p>
     <w:p>
@@ -15188,49 +14849,131 @@
           <w:rFonts w:asciiTheme="minorHAnsi" w:hAnsiTheme="minorHAnsi" w:cstheme="minorHAnsi"/>
           <w:color w:val="9876AA"/>
         </w:rPr>
-        <w:t>"hostname</w:t>
-      </w:r>
-      <w:proofErr w:type="gramStart"/>
+        <w:t xml:space="preserve">"hostname"  </w:t>
+      </w:r>
+      <w:r>
+        <w:rPr>
+          <w:rFonts w:asciiTheme="minorHAnsi" w:hAnsiTheme="minorHAnsi" w:cstheme="minorHAnsi"/>
+          <w:color w:val="CC7832"/>
+        </w:rPr>
+        <w:t xml:space="preserve">: </w:t>
+      </w:r>
+      <w:r>
+        <w:rPr>
+          <w:rFonts w:asciiTheme="minorHAnsi" w:hAnsiTheme="minorHAnsi" w:cstheme="minorHAnsi"/>
+        </w:rPr>
+        <w:t>"somesb.demandware.net"</w:t>
+      </w:r>
+      <w:r>
+        <w:rPr>
+          <w:rFonts w:asciiTheme="minorHAnsi" w:hAnsiTheme="minorHAnsi" w:cstheme="minorHAnsi"/>
+          <w:color w:val="CC7832"/>
+        </w:rPr>
+        <w:t>,</w:t>
+      </w:r>
+      <w:r>
+        <w:rPr>
+          <w:rFonts w:asciiTheme="minorHAnsi" w:hAnsiTheme="minorHAnsi" w:cstheme="minorHAnsi"/>
+          <w:color w:val="CC7832"/>
+        </w:rPr>
+        <w:br/>
+        <w:t xml:space="preserve">    </w:t>
+      </w:r>
       <w:r>
         <w:rPr>
           <w:rFonts w:asciiTheme="minorHAnsi" w:hAnsiTheme="minorHAnsi" w:cstheme="minorHAnsi"/>
           <w:color w:val="9876AA"/>
         </w:rPr>
-        <w:t xml:space="preserve">"  </w:t>
+        <w:t xml:space="preserve">"username"  </w:t>
       </w:r>
       <w:r>
         <w:rPr>
           <w:rFonts w:asciiTheme="minorHAnsi" w:hAnsiTheme="minorHAnsi" w:cstheme="minorHAnsi"/>
           <w:color w:val="CC7832"/>
         </w:rPr>
-        <w:t>:</w:t>
-      </w:r>
-      <w:proofErr w:type="gramEnd"/>
+        <w:t xml:space="preserve">: </w:t>
+      </w:r>
+      <w:r>
+        <w:rPr>
+          <w:rFonts w:asciiTheme="minorHAnsi" w:hAnsiTheme="minorHAnsi" w:cstheme="minorHAnsi"/>
+        </w:rPr>
+        <w:t>"</w:t>
+      </w:r>
+      <w:proofErr w:type="spellStart"/>
+      <w:r>
+        <w:rPr>
+          <w:rFonts w:asciiTheme="minorHAnsi" w:hAnsiTheme="minorHAnsi" w:cstheme="minorHAnsi"/>
+        </w:rPr>
+        <w:t>someUser</w:t>
+      </w:r>
+      <w:proofErr w:type="spellEnd"/>
+      <w:r>
+        <w:rPr>
+          <w:rFonts w:asciiTheme="minorHAnsi" w:hAnsiTheme="minorHAnsi" w:cstheme="minorHAnsi"/>
+        </w:rPr>
+        <w:t>"</w:t>
+      </w:r>
       <w:r>
         <w:rPr>
           <w:rFonts w:asciiTheme="minorHAnsi" w:hAnsiTheme="minorHAnsi" w:cstheme="minorHAnsi"/>
           <w:color w:val="CC7832"/>
         </w:rPr>
-        <w:t xml:space="preserve"> </w:t>
-      </w:r>
-      <w:r>
-        <w:rPr>
-          <w:rFonts w:asciiTheme="minorHAnsi" w:hAnsiTheme="minorHAnsi" w:cstheme="minorHAnsi"/>
-        </w:rPr>
-        <w:t>"somesb.demandware.net"</w:t>
+        <w:t>,</w:t>
       </w:r>
       <w:r>
         <w:rPr>
           <w:rFonts w:asciiTheme="minorHAnsi" w:hAnsiTheme="minorHAnsi" w:cstheme="minorHAnsi"/>
           <w:color w:val="CC7832"/>
         </w:rPr>
-        <w:t>,</w:t>
+        <w:br/>
+        <w:t xml:space="preserve">    </w:t>
+      </w:r>
+      <w:r>
+        <w:rPr>
+          <w:rFonts w:asciiTheme="minorHAnsi" w:hAnsiTheme="minorHAnsi" w:cstheme="minorHAnsi"/>
+          <w:color w:val="9876AA"/>
+        </w:rPr>
+        <w:t xml:space="preserve">"password"  </w:t>
       </w:r>
       <w:r>
         <w:rPr>
           <w:rFonts w:asciiTheme="minorHAnsi" w:hAnsiTheme="minorHAnsi" w:cstheme="minorHAnsi"/>
           <w:color w:val="CC7832"/>
         </w:rPr>
+        <w:t xml:space="preserve">: </w:t>
+      </w:r>
+      <w:r>
+        <w:rPr>
+          <w:rFonts w:asciiTheme="minorHAnsi" w:hAnsiTheme="minorHAnsi" w:cstheme="minorHAnsi"/>
+        </w:rPr>
+        <w:t>"</w:t>
+      </w:r>
+      <w:proofErr w:type="spellStart"/>
+      <w:r>
+        <w:rPr>
+          <w:rFonts w:asciiTheme="minorHAnsi" w:hAnsiTheme="minorHAnsi" w:cstheme="minorHAnsi"/>
+        </w:rPr>
+        <w:t>somePassoword</w:t>
+      </w:r>
+      <w:proofErr w:type="spellEnd"/>
+      <w:r>
+        <w:rPr>
+          <w:rFonts w:asciiTheme="minorHAnsi" w:hAnsiTheme="minorHAnsi" w:cstheme="minorHAnsi"/>
+        </w:rPr>
+        <w:t>"</w:t>
+      </w:r>
+      <w:r>
+        <w:rPr>
+          <w:rFonts w:asciiTheme="minorHAnsi" w:hAnsiTheme="minorHAnsi" w:cstheme="minorHAnsi"/>
+          <w:color w:val="CC7832"/>
+        </w:rPr>
+        <w:t>,</w:t>
+      </w:r>
+      <w:r>
+        <w:rPr>
+          <w:rFonts w:asciiTheme="minorHAnsi" w:hAnsiTheme="minorHAnsi" w:cstheme="minorHAnsi"/>
+          <w:color w:val="CC7832"/>
+        </w:rPr>
         <w:br/>
         <w:t xml:space="preserve">    </w:t>
       </w:r>
@@ -15239,160 +14982,14 @@
           <w:rFonts w:asciiTheme="minorHAnsi" w:hAnsiTheme="minorHAnsi" w:cstheme="minorHAnsi"/>
           <w:color w:val="9876AA"/>
         </w:rPr>
-        <w:t>"username</w:t>
-      </w:r>
-      <w:proofErr w:type="gramStart"/>
-      <w:r>
-        <w:rPr>
-          <w:rFonts w:asciiTheme="minorHAnsi" w:hAnsiTheme="minorHAnsi" w:cstheme="minorHAnsi"/>
-          <w:color w:val="9876AA"/>
-        </w:rPr>
-        <w:t xml:space="preserve">"  </w:t>
+        <w:t xml:space="preserve">"version"   </w:t>
       </w:r>
       <w:r>
         <w:rPr>
           <w:rFonts w:asciiTheme="minorHAnsi" w:hAnsiTheme="minorHAnsi" w:cstheme="minorHAnsi"/>
           <w:color w:val="CC7832"/>
         </w:rPr>
-        <w:t>:</w:t>
-      </w:r>
-      <w:proofErr w:type="gramEnd"/>
-      <w:r>
-        <w:rPr>
-          <w:rFonts w:asciiTheme="minorHAnsi" w:hAnsiTheme="minorHAnsi" w:cstheme="minorHAnsi"/>
-          <w:color w:val="CC7832"/>
-        </w:rPr>
-        <w:t xml:space="preserve"> </w:t>
-      </w:r>
-      <w:r>
-        <w:rPr>
-          <w:rFonts w:asciiTheme="minorHAnsi" w:hAnsiTheme="minorHAnsi" w:cstheme="minorHAnsi"/>
-        </w:rPr>
-        <w:t>"</w:t>
-      </w:r>
-      <w:proofErr w:type="spellStart"/>
-      <w:r>
-        <w:rPr>
-          <w:rFonts w:asciiTheme="minorHAnsi" w:hAnsiTheme="minorHAnsi" w:cstheme="minorHAnsi"/>
-        </w:rPr>
-        <w:t>someUser</w:t>
-      </w:r>
-      <w:proofErr w:type="spellEnd"/>
-      <w:r>
-        <w:rPr>
-          <w:rFonts w:asciiTheme="minorHAnsi" w:hAnsiTheme="minorHAnsi" w:cstheme="minorHAnsi"/>
-        </w:rPr>
-        <w:t>"</w:t>
-      </w:r>
-      <w:r>
-        <w:rPr>
-          <w:rFonts w:asciiTheme="minorHAnsi" w:hAnsiTheme="minorHAnsi" w:cstheme="minorHAnsi"/>
-          <w:color w:val="CC7832"/>
-        </w:rPr>
-        <w:t>,</w:t>
-      </w:r>
-      <w:r>
-        <w:rPr>
-          <w:rFonts w:asciiTheme="minorHAnsi" w:hAnsiTheme="minorHAnsi" w:cstheme="minorHAnsi"/>
-          <w:color w:val="CC7832"/>
-        </w:rPr>
-        <w:br/>
-        <w:t xml:space="preserve">    </w:t>
-      </w:r>
-      <w:r>
-        <w:rPr>
-          <w:rFonts w:asciiTheme="minorHAnsi" w:hAnsiTheme="minorHAnsi" w:cstheme="minorHAnsi"/>
-          <w:color w:val="9876AA"/>
-        </w:rPr>
-        <w:t>"password</w:t>
-      </w:r>
-      <w:proofErr w:type="gramStart"/>
-      <w:r>
-        <w:rPr>
-          <w:rFonts w:asciiTheme="minorHAnsi" w:hAnsiTheme="minorHAnsi" w:cstheme="minorHAnsi"/>
-          <w:color w:val="9876AA"/>
-        </w:rPr>
-        <w:t xml:space="preserve">"  </w:t>
-      </w:r>
-      <w:r>
-        <w:rPr>
-          <w:rFonts w:asciiTheme="minorHAnsi" w:hAnsiTheme="minorHAnsi" w:cstheme="minorHAnsi"/>
-          <w:color w:val="CC7832"/>
-        </w:rPr>
-        <w:t>:</w:t>
-      </w:r>
-      <w:proofErr w:type="gramEnd"/>
-      <w:r>
-        <w:rPr>
-          <w:rFonts w:asciiTheme="minorHAnsi" w:hAnsiTheme="minorHAnsi" w:cstheme="minorHAnsi"/>
-          <w:color w:val="CC7832"/>
-        </w:rPr>
-        <w:t xml:space="preserve"> </w:t>
-      </w:r>
-      <w:r>
-        <w:rPr>
-          <w:rFonts w:asciiTheme="minorHAnsi" w:hAnsiTheme="minorHAnsi" w:cstheme="minorHAnsi"/>
-        </w:rPr>
-        <w:t>"</w:t>
-      </w:r>
-      <w:proofErr w:type="spellStart"/>
-      <w:r>
-        <w:rPr>
-          <w:rFonts w:asciiTheme="minorHAnsi" w:hAnsiTheme="minorHAnsi" w:cstheme="minorHAnsi"/>
-        </w:rPr>
-        <w:t>somePassoword</w:t>
-      </w:r>
-      <w:proofErr w:type="spellEnd"/>
-      <w:r>
-        <w:rPr>
-          <w:rFonts w:asciiTheme="minorHAnsi" w:hAnsiTheme="minorHAnsi" w:cstheme="minorHAnsi"/>
-        </w:rPr>
-        <w:t>"</w:t>
-      </w:r>
-      <w:r>
-        <w:rPr>
-          <w:rFonts w:asciiTheme="minorHAnsi" w:hAnsiTheme="minorHAnsi" w:cstheme="minorHAnsi"/>
-          <w:color w:val="CC7832"/>
-        </w:rPr>
-        <w:t>,</w:t>
-      </w:r>
-      <w:r>
-        <w:rPr>
-          <w:rFonts w:asciiTheme="minorHAnsi" w:hAnsiTheme="minorHAnsi" w:cstheme="minorHAnsi"/>
-          <w:color w:val="CC7832"/>
-        </w:rPr>
-        <w:br/>
-        <w:t xml:space="preserve">    </w:t>
-      </w:r>
-      <w:r>
-        <w:rPr>
-          <w:rFonts w:asciiTheme="minorHAnsi" w:hAnsiTheme="minorHAnsi" w:cstheme="minorHAnsi"/>
-          <w:color w:val="9876AA"/>
-        </w:rPr>
-        <w:t xml:space="preserve">"version" </w:t>
-      </w:r>
-      <w:proofErr w:type="gramStart"/>
-      <w:r>
-        <w:rPr>
-          <w:rFonts w:asciiTheme="minorHAnsi" w:hAnsiTheme="minorHAnsi" w:cstheme="minorHAnsi"/>
-          <w:color w:val="9876AA"/>
-        </w:rPr>
-        <w:t xml:space="preserve">  </w:t>
-      </w:r>
-      <w:r>
-        <w:rPr>
-          <w:rFonts w:asciiTheme="minorHAnsi" w:hAnsiTheme="minorHAnsi" w:cstheme="minorHAnsi"/>
-          <w:color w:val="CC7832"/>
-        </w:rPr>
-        <w:t>:</w:t>
-      </w:r>
-      <w:proofErr w:type="gramEnd"/>
-      <w:r>
-        <w:rPr>
-          <w:rFonts w:asciiTheme="minorHAnsi" w:hAnsiTheme="minorHAnsi" w:cstheme="minorHAnsi"/>
-          <w:color w:val="CC7832"/>
-        </w:rPr>
-        <w:t xml:space="preserve"> </w:t>
+        <w:t xml:space="preserve">: </w:t>
       </w:r>
       <w:r>
         <w:rPr>
@@ -15455,7 +15052,6 @@
         <w:t xml:space="preserve"> run </w:t>
       </w:r>
       <w:proofErr w:type="spellStart"/>
-      <w:proofErr w:type="gramStart"/>
       <w:r>
         <w:rPr>
           <w:rFonts w:cstheme="minorHAnsi"/>
@@ -15463,7 +15059,6 @@
         <w:t>test:integration</w:t>
       </w:r>
       <w:proofErr w:type="spellEnd"/>
-      <w:proofErr w:type="gramEnd"/>
     </w:p>
     <w:p>
       <w:pPr>
@@ -15986,25 +15581,7 @@
           <w:b/>
           <w:bCs/>
         </w:rPr>
-        <w:t xml:space="preserve">Incorrect data being passed </w:t>
-      </w:r>
-      <w:proofErr w:type="gramStart"/>
-      <w:r>
-        <w:rPr>
-          <w:rFonts w:cstheme="minorHAnsi"/>
-          <w:b/>
-          <w:bCs/>
-        </w:rPr>
-        <w:t>in</w:t>
-      </w:r>
-      <w:proofErr w:type="gramEnd"/>
-      <w:r>
-        <w:rPr>
-          <w:rFonts w:cstheme="minorHAnsi"/>
-          <w:b/>
-          <w:bCs/>
-        </w:rPr>
-        <w:t xml:space="preserve"> the service requests</w:t>
+        <w:t>Incorrect data being passed in the service requests</w:t>
       </w:r>
       <w:r>
         <w:rPr>
@@ -16177,8 +15754,8 @@
         <w:pStyle w:val="Ttulo1"/>
       </w:pPr>
       <w:bookmarkStart w:id="68" w:name="_Toc104994184"/>
-      <w:bookmarkStart w:id="69" w:name="_Toc245264376"/>
-      <w:bookmarkStart w:id="70" w:name="_Toc211501390"/>
+      <w:bookmarkStart w:id="69" w:name="_Toc211501390"/>
+      <w:bookmarkStart w:id="70" w:name="_Toc245264376"/>
       <w:r>
         <w:t xml:space="preserve">6 </w:t>
       </w:r>
@@ -16186,7 +15763,7 @@
         <w:t>Operations, Maintenance</w:t>
       </w:r>
       <w:bookmarkEnd w:id="68"/>
-      <w:bookmarkEnd w:id="70"/>
+      <w:bookmarkEnd w:id="69"/>
     </w:p>
     <w:p>
       <w:pPr>
@@ -16320,7 +15897,7 @@
         </w:rPr>
         <w:t xml:space="preserve">. </w:t>
       </w:r>
-      <w:bookmarkEnd w:id="69"/>
+      <w:bookmarkEnd w:id="70"/>
     </w:p>
     <w:p>
       <w:pPr>
@@ -16523,14 +16100,14 @@
         </w:pBdr>
       </w:pPr>
       <w:bookmarkStart w:id="77" w:name="_Toc104994188"/>
-      <w:bookmarkStart w:id="78" w:name="_Hlk75794236"/>
-      <w:bookmarkStart w:id="79" w:name="_Toc211501394"/>
+      <w:bookmarkStart w:id="78" w:name="_Toc211501394"/>
+      <w:bookmarkStart w:id="79" w:name="_Hlk75794236"/>
       <w:r>
         <w:lastRenderedPageBreak/>
         <w:t>7 Release History</w:t>
       </w:r>
       <w:bookmarkEnd w:id="77"/>
-      <w:bookmarkEnd w:id="79"/>
+      <w:bookmarkEnd w:id="78"/>
     </w:p>
     <w:p>
       <w:pPr>
@@ -16548,7 +16125,7 @@
       </w:pPr>
       <w:bookmarkStart w:id="80" w:name="_Toc279703501"/>
       <w:bookmarkStart w:id="81" w:name="_Toc279703594"/>
-      <w:bookmarkEnd w:id="78"/>
+      <w:bookmarkEnd w:id="79"/>
     </w:p>
     <w:tbl>
       <w:tblPr>
@@ -24980,6 +24557,10 @@
 </file>
 
 <file path=customXml/item3.xml><?xml version="1.0" encoding="utf-8"?>
+<b:Sources xmlns:b="http://schemas.openxmlformats.org/officeDocument/2006/bibliography" xmlns="http://schemas.openxmlformats.org/officeDocument/2006/bibliography" SelectedStyle="\CHICAGO.XSL" StyleName="Chicago"/>
+</file>
+
+<file path=customXml/item4.xml><?xml version="1.0" encoding="utf-8"?>
 <ct:contentTypeSchema xmlns:ct="http://schemas.microsoft.com/office/2006/metadata/contentType" xmlns:ma="http://schemas.microsoft.com/office/2006/metadata/properties/metaAttributes" ct:_="" ma:_="" ma:contentTypeName="Document" ma:contentTypeID="0x010100BAC6AAE9A7AC6F448B8E6AD308F25C33" ma:contentTypeVersion="9" ma:contentTypeDescription="Create a new document." ma:contentTypeScope="" ma:versionID="9947e9a47e1bfbe6ee25356abc8c556f">
   <xsd:schema xmlns:xsd="http://www.w3.org/2001/XMLSchema" xmlns:xs="http://www.w3.org/2001/XMLSchema" xmlns:p="http://schemas.microsoft.com/office/2006/metadata/properties" xmlns:ns2="41dbd0cf-c47a-4cea-8dfa-c6db00955148" xmlns:ns3="2680ebc2-70e2-42cc-af17-343d078fef82" xmlns:ns4="3ab059b2-6124-4199-bb85-3249ccb31308" targetNamespace="http://schemas.microsoft.com/office/2006/metadata/properties" ma:root="true" ma:fieldsID="784c332b4ff724ef588fa3376e0daf40" ns2:_="" ns3:_="" ns4:_="">
     <xsd:import namespace="41dbd0cf-c47a-4cea-8dfa-c6db00955148"/>
@@ -25177,10 +24758,6 @@
 </ct:contentTypeSchema>
 </file>
 
-<file path=customXml/item4.xml><?xml version="1.0" encoding="utf-8"?>
-<b:Sources xmlns:b="http://schemas.openxmlformats.org/officeDocument/2006/bibliography" xmlns="http://schemas.openxmlformats.org/officeDocument/2006/bibliography" SelectedStyle="\CHICAGO.XSL" StyleName="Chicago"/>
-</file>
-
 <file path=customXml/item5.xml><?xml version="1.0" encoding="utf-8"?>
 <b:Sources xmlns:b="http://schemas.openxmlformats.org/officeDocument/2006/bibliography" xmlns="http://schemas.openxmlformats.org/officeDocument/2006/bibliography" SelectedStyle="\CHICAGO.XSL" StyleName="Chicago"/>
 </file>
@@ -25204,7 +24781,7 @@
 </file>
 
 <file path=customXml/itemProps1.xml><?xml version="1.0" encoding="utf-8"?>
-<ds:datastoreItem xmlns:ds="http://schemas.openxmlformats.org/officeDocument/2006/customXml" ds:itemID="{DFFD90AB-A9CA-48E9-A772-13C69588A728}">
+<ds:datastoreItem xmlns:ds="http://schemas.openxmlformats.org/officeDocument/2006/customXml" ds:itemID="{05CD6A24-F136-463B-BF16-F15886741A5F}">
   <ds:schemaRefs>
     <ds:schemaRef ds:uri="http://schemas.openxmlformats.org/officeDocument/2006/bibliography"/>
   </ds:schemaRefs>
@@ -25220,6 +24797,14 @@
 </file>
 
 <file path=customXml/itemProps3.xml><?xml version="1.0" encoding="utf-8"?>
+<ds:datastoreItem xmlns:ds="http://schemas.openxmlformats.org/officeDocument/2006/customXml" ds:itemID="{0ACC11CF-7E2F-4A39-A1CC-435974F0A74C}">
+  <ds:schemaRefs>
+    <ds:schemaRef ds:uri="http://schemas.openxmlformats.org/officeDocument/2006/bibliography"/>
+  </ds:schemaRefs>
+</ds:datastoreItem>
+</file>
+
+<file path=customXml/itemProps4.xml><?xml version="1.0" encoding="utf-8"?>
 <ds:datastoreItem xmlns:ds="http://schemas.openxmlformats.org/officeDocument/2006/customXml" ds:itemID="{AB403CD4-F922-4E1D-B3EA-72C1A6D547E2}">
   <ds:schemaRefs>
     <ds:schemaRef ds:uri="http://schemas.microsoft.com/office/2006/metadata/contentType"/>
@@ -25239,16 +24824,8 @@
 </ds:datastoreItem>
 </file>
 
-<file path=customXml/itemProps4.xml><?xml version="1.0" encoding="utf-8"?>
-<ds:datastoreItem xmlns:ds="http://schemas.openxmlformats.org/officeDocument/2006/customXml" ds:itemID="{74EDC720-C843-4BCC-ACEC-72DB380D8DF2}">
-  <ds:schemaRefs>
-    <ds:schemaRef ds:uri="http://schemas.openxmlformats.org/officeDocument/2006/bibliography"/>
-  </ds:schemaRefs>
-</ds:datastoreItem>
-</file>
-
 <file path=customXml/itemProps5.xml><?xml version="1.0" encoding="utf-8"?>
-<ds:datastoreItem xmlns:ds="http://schemas.openxmlformats.org/officeDocument/2006/customXml" ds:itemID="{0ACC11CF-7E2F-4A39-A1CC-435974F0A74C}">
+<ds:datastoreItem xmlns:ds="http://schemas.openxmlformats.org/officeDocument/2006/customXml" ds:itemID="{DFFD90AB-A9CA-48E9-A772-13C69588A728}">
   <ds:schemaRefs>
     <ds:schemaRef ds:uri="http://schemas.openxmlformats.org/officeDocument/2006/bibliography"/>
   </ds:schemaRefs>
@@ -25267,7 +24844,7 @@
 </file>
 
 <file path=customXml/itemProps7.xml><?xml version="1.0" encoding="utf-8"?>
-<ds:datastoreItem xmlns:ds="http://schemas.openxmlformats.org/officeDocument/2006/customXml" ds:itemID="{05CD6A24-F136-463B-BF16-F15886741A5F}">
+<ds:datastoreItem xmlns:ds="http://schemas.openxmlformats.org/officeDocument/2006/customXml" ds:itemID="{74EDC720-C843-4BCC-ACEC-72DB380D8DF2}">
   <ds:schemaRefs>
     <ds:schemaRef ds:uri="http://schemas.openxmlformats.org/officeDocument/2006/bibliography"/>
   </ds:schemaRefs>

</xml_diff>